<commit_message>
Conficiones de uso + docs legales actualizados
</commit_message>
<xml_diff>
--- a/assets/docs/confidencialidad.docx
+++ b/assets/docs/confidencialidad.docx
@@ -1,6 +1,6 @@
 
 <file path=word/document.xml><?xml version="1.0" encoding="utf-8"?>
-<w:document xmlns:wpc="http://schemas.microsoft.com/office/word/2010/wordprocessingCanvas" xmlns:mc="http://schemas.openxmlformats.org/markup-compatibility/2006" xmlns:o="urn:schemas-microsoft-com:office:office" xmlns:r="http://schemas.openxmlformats.org/officeDocument/2006/relationships" xmlns:m="http://schemas.openxmlformats.org/officeDocument/2006/math" xmlns:v="urn:schemas-microsoft-com:vml" xmlns:wp14="http://schemas.microsoft.com/office/word/2010/wordprocessingDrawing" xmlns:wp="http://schemas.openxmlformats.org/drawingml/2006/wordprocessingDrawing" xmlns:w10="urn:schemas-microsoft-com:office:word" xmlns:w="http://schemas.openxmlformats.org/wordprocessingml/2006/main" xmlns:w14="http://schemas.microsoft.com/office/word/2010/wordml" xmlns:wpg="http://schemas.microsoft.com/office/word/2010/wordprocessingGroup" xmlns:wpi="http://schemas.microsoft.com/office/word/2010/wordprocessingInk" xmlns:wne="http://schemas.microsoft.com/office/word/2006/wordml" xmlns:wps="http://schemas.microsoft.com/office/word/2010/wordprocessingShape" mc:Ignorable="w14 wp14">
+<w:document xmlns:wpc="http://schemas.microsoft.com/office/word/2010/wordprocessingCanvas" xmlns:mc="http://schemas.openxmlformats.org/markup-compatibility/2006" xmlns:o="urn:schemas-microsoft-com:office:office" xmlns:r="http://schemas.openxmlformats.org/officeDocument/2006/relationships" xmlns:m="http://schemas.openxmlformats.org/officeDocument/2006/math" xmlns:v="urn:schemas-microsoft-com:vml" xmlns:wp14="http://schemas.microsoft.com/office/word/2010/wordprocessingDrawing" xmlns:wp="http://schemas.openxmlformats.org/drawingml/2006/wordprocessingDrawing" xmlns:w10="urn:schemas-microsoft-com:office:word" xmlns:w="http://schemas.openxmlformats.org/wordprocessingml/2006/main" xmlns:w14="http://schemas.microsoft.com/office/word/2010/wordml" xmlns:w15="http://schemas.microsoft.com/office/word/2012/wordml" xmlns:wpg="http://schemas.microsoft.com/office/word/2010/wordprocessingGroup" xmlns:wpi="http://schemas.microsoft.com/office/word/2010/wordprocessingInk" xmlns:wne="http://schemas.microsoft.com/office/word/2006/wordml" xmlns:wps="http://schemas.microsoft.com/office/word/2010/wordprocessingShape" mc:Ignorable="w14 w15 wp14">
   <w:body>
     <w:p>
       <w:pPr>
@@ -91,7 +91,19 @@
         <w:t xml:space="preserve">parte de </w:t>
       </w:r>
       <w:r>
-        <w:t xml:space="preserve">la Asociación Red </w:t>
+        <w:t xml:space="preserve">la </w:t>
+      </w:r>
+      <w:r>
+        <w:t>a</w:t>
+      </w:r>
+      <w:r>
+        <w:t xml:space="preserve">sociación </w:t>
+      </w:r>
+      <w:r>
+        <w:t xml:space="preserve">Consorcio </w:t>
+      </w:r>
+      <w:r>
+        <w:t xml:space="preserve">Red </w:t>
       </w:r>
       <w:proofErr w:type="spellStart"/>
       <w:r>
@@ -108,7 +120,13 @@
         <w:t xml:space="preserve">de </w:t>
       </w:r>
       <w:r>
-        <w:t xml:space="preserve">los Socios de la misma, </w:t>
+        <w:t xml:space="preserve">los </w:t>
+      </w:r>
+      <w:r>
+        <w:t>Asociados</w:t>
+      </w:r>
+      <w:r>
+        <w:t xml:space="preserve"> de la misma, </w:t>
       </w:r>
       <w:r>
         <w:t xml:space="preserve">así como los deberes de reserva, secreto y </w:t>
@@ -123,7 +141,13 @@
         <w:t xml:space="preserve"> </w:t>
       </w:r>
       <w:r>
-        <w:t xml:space="preserve">La Asociación y todos sus Socios, al adquirir esa condición, estarán vinculados por </w:t>
+        <w:t xml:space="preserve">La Asociación y todos sus </w:t>
+      </w:r>
+      <w:r>
+        <w:t>Asociados</w:t>
+      </w:r>
+      <w:r>
+        <w:t xml:space="preserve">, al adquirir esa condición, estarán vinculados por </w:t>
       </w:r>
       <w:r>
         <w:t xml:space="preserve">esta Política </w:t>
@@ -174,7 +198,7 @@
     <w:p/>
     <w:p>
       <w:pPr>
-        <w:pStyle w:val="ListParagraph"/>
+        <w:pStyle w:val="Prrafodelista"/>
         <w:numPr>
           <w:ilvl w:val="0"/>
           <w:numId w:val="28"/>
@@ -194,7 +218,7 @@
     </w:p>
     <w:p>
       <w:pPr>
-        <w:pStyle w:val="ListParagraph"/>
+        <w:pStyle w:val="Prrafodelista"/>
         <w:numPr>
           <w:ilvl w:val="0"/>
           <w:numId w:val="0"/>
@@ -208,7 +232,7 @@
     </w:p>
     <w:p>
       <w:pPr>
-        <w:pStyle w:val="ListParagraph"/>
+        <w:pStyle w:val="Prrafodelista"/>
         <w:numPr>
           <w:ilvl w:val="1"/>
           <w:numId w:val="28"/>
@@ -220,7 +244,7 @@
         <w:t xml:space="preserve"> “Asociación”</w:t>
       </w:r>
       <w:r>
-        <w:t xml:space="preserve"> es el Consorcio Red </w:t>
+        <w:t xml:space="preserve"> es Consorcio Red </w:t>
       </w:r>
       <w:proofErr w:type="spellStart"/>
       <w:r>
@@ -233,7 +257,7 @@
     </w:p>
     <w:p>
       <w:pPr>
-        <w:pStyle w:val="ListParagraph"/>
+        <w:pStyle w:val="Prrafodelista"/>
         <w:numPr>
           <w:ilvl w:val="0"/>
           <w:numId w:val="0"/>
@@ -244,7 +268,7 @@
     </w:p>
     <w:p>
       <w:pPr>
-        <w:pStyle w:val="ListParagraph"/>
+        <w:pStyle w:val="Prrafodelista"/>
         <w:numPr>
           <w:ilvl w:val="1"/>
           <w:numId w:val="28"/>
@@ -253,29 +277,47 @@
         <w:ind w:left="709" w:hanging="709"/>
       </w:pPr>
       <w:r>
-        <w:t xml:space="preserve">“Creaciones, Invenciones y Secretos” </w:t>
-      </w:r>
-      <w:r>
-        <w:t>son todas las creaciones y demás objetos y prestaciones susceptibles de protección por las leyes de propiedad intelectual, propiedad industrial y normas aplicables al know-h</w:t>
-      </w:r>
-      <w:r>
-        <w:t>ow y los secretos empresariales.</w:t>
-      </w:r>
-    </w:p>
-    <w:p>
-      <w:pPr>
-        <w:pStyle w:val="ListParagraph"/>
+        <w:t>“</w:t>
+      </w:r>
+      <w:r>
+        <w:t>Asociados</w:t>
+      </w:r>
+      <w:r>
+        <w:t>”</w:t>
+      </w:r>
+      <w:r>
+        <w:t xml:space="preserve"> se refiere a los </w:t>
+      </w:r>
+      <w:r>
+        <w:t>asociados</w:t>
+      </w:r>
+      <w:r>
+        <w:t xml:space="preserve"> de la Asociación, con independencia de su condición de </w:t>
+      </w:r>
+      <w:r>
+        <w:t>asociado</w:t>
+      </w:r>
+      <w:r>
+        <w:t xml:space="preserve"> promotor, de número o de honor, o cualquier otra categoría que pueda ser creada durante la vida de la Asociación</w:t>
+      </w:r>
+      <w:r>
+        <w:t>;</w:t>
+      </w:r>
+    </w:p>
+    <w:p>
+      <w:pPr>
+        <w:pStyle w:val="Prrafodelista"/>
         <w:numPr>
           <w:ilvl w:val="0"/>
           <w:numId w:val="0"/>
         </w:numPr>
         <w:spacing w:before="0" w:beforeAutospacing="0" w:after="0" w:line="312" w:lineRule="auto"/>
-        <w:ind w:left="2564"/>
-      </w:pPr>
-    </w:p>
-    <w:p>
-      <w:pPr>
-        <w:pStyle w:val="ListParagraph"/>
+        <w:ind w:left="709"/>
+      </w:pPr>
+    </w:p>
+    <w:p>
+      <w:pPr>
+        <w:pStyle w:val="Prrafodelista"/>
         <w:numPr>
           <w:ilvl w:val="1"/>
           <w:numId w:val="28"/>
@@ -284,32 +326,29 @@
         <w:ind w:left="709" w:hanging="709"/>
       </w:pPr>
       <w:r>
-        <w:t>“Dato de Carácter Personal”</w:t>
-      </w:r>
-      <w:r>
-        <w:t>: toda información sobre una persona física identificada o identificable; se considerará persona física identificable toda persona cuya identidad pueda determi</w:t>
-      </w:r>
-      <w:r>
-        <w:t>narse, directa o indirectamente, en particular mediante un identificador, como por ejemplo un nombre, un número de identificación, datos de localización, un identificador en línea o uno o varios elementos propios de la identidad física, fisiológica, genéti</w:t>
-      </w:r>
-      <w:r>
-        <w:t>ca, psíquica, económica, cultural o social de dicha persona;</w:t>
-      </w:r>
-    </w:p>
-    <w:p>
-      <w:pPr>
-        <w:pStyle w:val="ListParagraph"/>
+        <w:t xml:space="preserve">“Creaciones, Invenciones y Secretos” </w:t>
+      </w:r>
+      <w:r>
+        <w:t>son todas las creaciones y demás objetos y prestaciones susceptibles de protección por las leyes de propiedad intelectual, propiedad industrial y normas aplicables al know-h</w:t>
+      </w:r>
+      <w:r>
+        <w:t>ow y los secretos empresariales.</w:t>
+      </w:r>
+    </w:p>
+    <w:p>
+      <w:pPr>
+        <w:pStyle w:val="Prrafodelista"/>
         <w:numPr>
           <w:ilvl w:val="0"/>
           <w:numId w:val="0"/>
         </w:numPr>
         <w:spacing w:before="0" w:beforeAutospacing="0" w:after="0" w:line="312" w:lineRule="auto"/>
-        <w:ind w:left="709"/>
-      </w:pPr>
-    </w:p>
-    <w:p>
-      <w:pPr>
-        <w:pStyle w:val="ListParagraph"/>
+        <w:ind w:left="2564"/>
+      </w:pPr>
+    </w:p>
+    <w:p>
+      <w:pPr>
+        <w:pStyle w:val="Prrafodelista"/>
         <w:numPr>
           <w:ilvl w:val="1"/>
           <w:numId w:val="28"/>
@@ -318,15 +357,21 @@
         <w:ind w:left="709" w:hanging="709"/>
       </w:pPr>
       <w:r>
-        <w:t>“Estatutos”</w:t>
-      </w:r>
-      <w:r>
-        <w:t xml:space="preserve"> se refiere a los estatutos de la Asociación. </w:t>
-      </w:r>
-    </w:p>
-    <w:p>
-      <w:pPr>
-        <w:pStyle w:val="ListParagraph"/>
+        <w:t>“Dato de Carácter Personal”</w:t>
+      </w:r>
+      <w:r>
+        <w:t>: toda información sobre una persona física identificada o identificable; se considerará persona física identificable toda persona cuya identidad pueda determi</w:t>
+      </w:r>
+      <w:r>
+        <w:t>narse, directa o indirectamente, en particular mediante un identificador, como por ejemplo un nombre, un número de identificación, datos de localización, un identificador en línea o uno o varios elementos propios de la identidad física, fisiológica, genéti</w:t>
+      </w:r>
+      <w:r>
+        <w:t>ca, psíquica, económica, cultural o social de dicha persona;</w:t>
+      </w:r>
+    </w:p>
+    <w:p>
+      <w:pPr>
+        <w:pStyle w:val="Prrafodelista"/>
         <w:numPr>
           <w:ilvl w:val="0"/>
           <w:numId w:val="0"/>
@@ -337,7 +382,7 @@
     </w:p>
     <w:p>
       <w:pPr>
-        <w:pStyle w:val="ListParagraph"/>
+        <w:pStyle w:val="Prrafodelista"/>
         <w:numPr>
           <w:ilvl w:val="1"/>
           <w:numId w:val="28"/>
@@ -347,90 +392,15 @@
       </w:pPr>
       <w:r>
         <w:lastRenderedPageBreak/>
-        <w:t>“Información Confidencial”</w:t>
-      </w:r>
-      <w:r>
-        <w:t xml:space="preserve"> es</w:t>
-      </w:r>
-      <w:r>
-        <w:t xml:space="preserve"> </w:t>
-      </w:r>
-      <w:r>
-        <w:t xml:space="preserve">(i) </w:t>
-      </w:r>
-      <w:r>
-        <w:t>t</w:t>
-      </w:r>
-      <w:r>
-        <w:t xml:space="preserve">oda </w:t>
-      </w:r>
-      <w:r>
-        <w:t>información o documento interno de la Asociación que los Socios conozcan en su condición de tal</w:t>
-      </w:r>
-      <w:r>
-        <w:t>es</w:t>
-      </w:r>
-      <w:r>
-        <w:t xml:space="preserve"> o en el desempeño de cargos </w:t>
-      </w:r>
-      <w:r>
-        <w:t>en</w:t>
-      </w:r>
-      <w:r>
-        <w:t xml:space="preserve"> la Asociación</w:t>
-      </w:r>
-      <w:r>
-        <w:t>, salvo cuando</w:t>
-      </w:r>
-      <w:r>
-        <w:t xml:space="preserve"> se trate de información</w:t>
-      </w:r>
-      <w:r>
-        <w:t xml:space="preserve"> </w:t>
-      </w:r>
-      <w:r>
-        <w:t>puesta a disposición del público en general</w:t>
-      </w:r>
-      <w:r>
-        <w:t xml:space="preserve"> de forma voluntaria por sus órgano de gobierno</w:t>
-      </w:r>
-      <w:r>
-        <w:t>;</w:t>
-      </w:r>
-      <w:r>
-        <w:t xml:space="preserve"> así como (ii) toda información o documento facilitado por </w:t>
-      </w:r>
-      <w:r>
-        <w:t xml:space="preserve">parte de </w:t>
-      </w:r>
-      <w:r>
-        <w:t>los Socios</w:t>
-      </w:r>
-      <w:r>
-        <w:t xml:space="preserve"> a la Asociación</w:t>
-      </w:r>
-      <w:r>
-        <w:t xml:space="preserve"> y que fuera revelado con dicho carácter confidencial. </w:t>
-      </w:r>
-      <w:r>
-        <w:t xml:space="preserve">En particular, </w:t>
-      </w:r>
-      <w:r>
-        <w:t>a título meramente enunciativo, tendrá la consideración de</w:t>
-      </w:r>
-      <w:r>
-        <w:t xml:space="preserve"> Información Confidencial</w:t>
-      </w:r>
-      <w:r>
-        <w:t xml:space="preserve"> la siguiente</w:t>
-      </w:r>
-      <w:r>
-        <w:t>:</w:t>
-      </w:r>
-    </w:p>
-    <w:p>
-      <w:pPr>
-        <w:pStyle w:val="ListParagraph"/>
+        <w:t>“Estatutos”</w:t>
+      </w:r>
+      <w:r>
+        <w:t xml:space="preserve"> se refiere a los estatutos de la Asociación. </w:t>
+      </w:r>
+    </w:p>
+    <w:p>
+      <w:pPr>
+        <w:pStyle w:val="Prrafodelista"/>
         <w:numPr>
           <w:ilvl w:val="0"/>
           <w:numId w:val="0"/>
@@ -441,95 +411,222 @@
     </w:p>
     <w:p>
       <w:pPr>
-        <w:pStyle w:val="ListParagraph"/>
-        <w:spacing w:before="0" w:beforeAutospacing="0" w:after="0" w:line="312" w:lineRule="auto"/>
-        <w:ind w:left="1134" w:hanging="1134"/>
-      </w:pPr>
-      <w:r>
-        <w:t>Los documentos internos de la Asociación tales como Actas de sus órganos de gobierno</w:t>
-      </w:r>
-      <w:r>
-        <w:t xml:space="preserve"> (</w:t>
-      </w:r>
-      <w:r>
-        <w:t xml:space="preserve">Asamblea General, </w:t>
-      </w:r>
-      <w:r>
-        <w:t>Junta Directiva y Comités</w:t>
+        <w:pStyle w:val="Prrafodelista"/>
+        <w:numPr>
+          <w:ilvl w:val="1"/>
+          <w:numId w:val="28"/>
+        </w:numPr>
+        <w:spacing w:before="0" w:beforeAutospacing="0" w:after="0" w:line="312" w:lineRule="auto"/>
+        <w:ind w:left="709" w:hanging="709"/>
+      </w:pPr>
+      <w:r>
+        <w:t>“Información Confidencial”</w:t>
+      </w:r>
+      <w:r>
+        <w:t xml:space="preserve"> es</w:t>
+      </w:r>
+      <w:r>
+        <w:t xml:space="preserve"> </w:t>
+      </w:r>
+      <w:r>
+        <w:t xml:space="preserve">(i) </w:t>
+      </w:r>
+      <w:r>
+        <w:t>t</w:t>
+      </w:r>
+      <w:r>
+        <w:t xml:space="preserve">oda </w:t>
+      </w:r>
+      <w:r>
+        <w:t xml:space="preserve">información o documento interno de la Asociación que los </w:t>
+      </w:r>
+      <w:r>
+        <w:t>Asociados</w:t>
+      </w:r>
+      <w:r>
+        <w:t xml:space="preserve"> conozcan en su condición de tal</w:t>
+      </w:r>
+      <w:r>
+        <w:t>es</w:t>
+      </w:r>
+      <w:r>
+        <w:t xml:space="preserve"> o en el desempeño de cargos </w:t>
+      </w:r>
+      <w:r>
+        <w:t>en</w:t>
+      </w:r>
+      <w:r>
+        <w:t xml:space="preserve"> la Asociación</w:t>
+      </w:r>
+      <w:r>
+        <w:t>, salvo cuando</w:t>
+      </w:r>
+      <w:r>
+        <w:t xml:space="preserve"> se trate de información</w:t>
+      </w:r>
+      <w:r>
+        <w:t xml:space="preserve"> </w:t>
+      </w:r>
+      <w:r>
+        <w:t>puesta a disposición del público en general</w:t>
+      </w:r>
+      <w:r>
+        <w:t xml:space="preserve"> de forma voluntaria por sus órgano de gobierno</w:t>
+      </w:r>
+      <w:r>
+        <w:t xml:space="preserve"> (en adelante definido</w:t>
+      </w:r>
+      <w:r>
+        <w:t xml:space="preserve"> de forma específica</w:t>
+      </w:r>
+      <w:r>
+        <w:t xml:space="preserve"> como “</w:t>
+      </w:r>
+      <w:r>
+        <w:rPr>
+          <w:b/>
+        </w:rPr>
+        <w:t>Información Confidencial de la Asociación”</w:t>
       </w:r>
       <w:r>
         <w:t>)</w:t>
       </w:r>
       <w:r>
-        <w:t>,</w:t>
-      </w:r>
-      <w:r>
-        <w:t xml:space="preserve"> excepto en los casos en que se trate de</w:t>
-      </w:r>
-      <w:r>
-        <w:t>l contenido de</w:t>
-      </w:r>
-      <w:r>
-        <w:t xml:space="preserve"> acuerdos que deban ser inscritos y/o publicados conforme a las disposiciones legales vigentes</w:t>
-      </w:r>
-      <w:r>
-        <w:t>, así como las deliberaciones mantenidas durante dichas reuniones y l</w:t>
-      </w:r>
-      <w:r>
-        <w:t>as intervenciones de los Socios</w:t>
-      </w:r>
-      <w:r>
-        <w:t>.</w:t>
-      </w:r>
-    </w:p>
-    <w:p>
-      <w:pPr>
-        <w:pStyle w:val="ListParagraph"/>
+        <w:t>;</w:t>
+      </w:r>
+      <w:r>
+        <w:t xml:space="preserve"> así como (ii) toda información o documento facilitado por </w:t>
+      </w:r>
+      <w:r>
+        <w:t xml:space="preserve">parte de </w:t>
+      </w:r>
+      <w:r>
+        <w:t xml:space="preserve">los </w:t>
+      </w:r>
+      <w:r>
+        <w:t>Asociados</w:t>
+      </w:r>
+      <w:r>
+        <w:t xml:space="preserve"> a la Asociación</w:t>
+      </w:r>
+      <w:r>
+        <w:t xml:space="preserve"> y que fuera revelado con dicho carácter confidencial</w:t>
+      </w:r>
+      <w:r>
+        <w:t xml:space="preserve"> (en adelante definido </w:t>
+      </w:r>
+      <w:r>
+        <w:t xml:space="preserve">de forma específica </w:t>
+      </w:r>
+      <w:r>
+        <w:t>como “</w:t>
+      </w:r>
+      <w:r>
+        <w:rPr>
+          <w:b/>
+        </w:rPr>
+        <w:t>Informaci</w:t>
+      </w:r>
+      <w:r>
+        <w:rPr>
+          <w:b/>
+        </w:rPr>
+        <w:t xml:space="preserve">ón Confidencial de los </w:t>
+      </w:r>
+      <w:r>
+        <w:rPr>
+          <w:b/>
+        </w:rPr>
+        <w:t>Asociados</w:t>
+      </w:r>
+      <w:r>
+        <w:rPr>
+          <w:b/>
+        </w:rPr>
+        <w:t>”</w:t>
+      </w:r>
+      <w:r>
+        <w:t>)</w:t>
+      </w:r>
+      <w:r>
+        <w:t xml:space="preserve">. </w:t>
+      </w:r>
+      <w:r>
+        <w:t xml:space="preserve">En particular, </w:t>
+      </w:r>
+      <w:r>
+        <w:t>a título meramente enunciativo, tendrá la consideración de</w:t>
+      </w:r>
+      <w:r>
+        <w:t xml:space="preserve"> Información Confidencial</w:t>
+      </w:r>
+      <w:r>
+        <w:t xml:space="preserve"> la siguiente</w:t>
+      </w:r>
+      <w:r>
+        <w:t>:</w:t>
+      </w:r>
+    </w:p>
+    <w:p>
+      <w:pPr>
+        <w:pStyle w:val="Prrafodelista"/>
         <w:numPr>
           <w:ilvl w:val="0"/>
           <w:numId w:val="0"/>
         </w:numPr>
         <w:spacing w:before="0" w:beforeAutospacing="0" w:after="0" w:line="312" w:lineRule="auto"/>
+        <w:ind w:left="709"/>
+      </w:pPr>
+    </w:p>
+    <w:p>
+      <w:pPr>
+        <w:pStyle w:val="Prrafodelista"/>
+        <w:spacing w:before="0" w:beforeAutospacing="0" w:after="0" w:line="312" w:lineRule="auto"/>
         <w:ind w:left="1134" w:hanging="1134"/>
       </w:pPr>
-    </w:p>
-    <w:p>
-      <w:pPr>
-        <w:pStyle w:val="ListParagraph"/>
-        <w:spacing w:before="0" w:beforeAutospacing="0" w:after="0" w:line="312" w:lineRule="auto"/>
-        <w:ind w:left="1134" w:hanging="1134"/>
-      </w:pPr>
-      <w:r>
-        <w:t xml:space="preserve">Cualquier información relativa a los Socios </w:t>
-      </w:r>
-      <w:r>
-        <w:t xml:space="preserve">o a personas de su organización </w:t>
-      </w:r>
-      <w:r>
-        <w:t>que obre</w:t>
-      </w:r>
-      <w:r>
-        <w:t>n</w:t>
-      </w:r>
-      <w:r>
-        <w:t xml:space="preserve"> en </w:t>
-      </w:r>
-      <w:r>
-        <w:t xml:space="preserve">poder de </w:t>
-      </w:r>
-      <w:r>
-        <w:t xml:space="preserve">la Asociación. No obstante lo anterior, no será confidencial </w:t>
-      </w:r>
-      <w:r>
-        <w:t xml:space="preserve">la </w:t>
-      </w:r>
-      <w:r>
-        <w:t xml:space="preserve">pertenencia del Socio a la Asociación ni a la Junta Directiva o demás órganos de gobierno. </w:t>
-      </w:r>
-    </w:p>
-    <w:p>
-      <w:pPr>
-        <w:pStyle w:val="ListParagraph"/>
+      <w:r>
+        <w:t>Los documentos internos de la Asociación tales como Actas de sus órganos de gobierno</w:t>
+      </w:r>
+      <w:r>
+        <w:t xml:space="preserve"> (</w:t>
+      </w:r>
+      <w:r>
+        <w:t xml:space="preserve">Asamblea General, </w:t>
+      </w:r>
+      <w:r>
+        <w:t>Junta Directiva y Comités</w:t>
+      </w:r>
+      <w:r>
+        <w:t>)</w:t>
+      </w:r>
+      <w:r>
+        <w:t>,</w:t>
+      </w:r>
+      <w:r>
+        <w:t xml:space="preserve"> excepto en los casos en que se trate de</w:t>
+      </w:r>
+      <w:r>
+        <w:t>l contenido de</w:t>
+      </w:r>
+      <w:r>
+        <w:t xml:space="preserve"> acuerdos que deban ser inscritos y/o publicados conforme a las disposiciones legales vigentes</w:t>
+      </w:r>
+      <w:r>
+        <w:t>, así como las deliberaciones mantenidas durante dichas reuniones y l</w:t>
+      </w:r>
+      <w:r>
+        <w:t xml:space="preserve">as intervenciones de los </w:t>
+      </w:r>
+      <w:r>
+        <w:t>Asociados</w:t>
+      </w:r>
+      <w:r>
+        <w:t>.</w:t>
+      </w:r>
+    </w:p>
+    <w:p>
+      <w:pPr>
+        <w:pStyle w:val="Prrafodelista"/>
         <w:numPr>
           <w:ilvl w:val="0"/>
           <w:numId w:val="0"/>
@@ -540,47 +637,47 @@
     </w:p>
     <w:p>
       <w:pPr>
-        <w:pStyle w:val="ListParagraph"/>
+        <w:pStyle w:val="Prrafodelista"/>
         <w:spacing w:before="0" w:beforeAutospacing="0" w:after="0" w:line="312" w:lineRule="auto"/>
         <w:ind w:left="1134" w:hanging="1134"/>
       </w:pPr>
       <w:r>
-        <w:t xml:space="preserve">Cualesquiera materiales de estudio, investigación, análisis, diseño </w:t>
-      </w:r>
-      <w:r>
-        <w:t>elaborados</w:t>
-      </w:r>
-      <w:r>
-        <w:t xml:space="preserve"> por los órganos de gobierno o p</w:t>
-      </w:r>
-      <w:r>
-        <w:t>or los c</w:t>
-      </w:r>
-      <w:r>
-        <w:t>omités de la Asociación e</w:t>
-      </w:r>
-      <w:r>
-        <w:t xml:space="preserve">xcepto de los que hayan </w:t>
-      </w:r>
-      <w:r>
-        <w:t xml:space="preserve">sido publicados </w:t>
-      </w:r>
-      <w:r>
-        <w:t xml:space="preserve">y/o </w:t>
-      </w:r>
-      <w:r>
-        <w:t>puestos a disposición de</w:t>
-      </w:r>
-      <w:r>
-        <w:t xml:space="preserve">l público en general </w:t>
-      </w:r>
-      <w:r>
-        <w:t>por los órganos de gobierno.</w:t>
-      </w:r>
-    </w:p>
-    <w:p>
-      <w:pPr>
-        <w:pStyle w:val="ListParagraph"/>
+        <w:t xml:space="preserve">Cualquier información relativa a los </w:t>
+      </w:r>
+      <w:r>
+        <w:t>Asociados</w:t>
+      </w:r>
+      <w:r>
+        <w:t xml:space="preserve"> </w:t>
+      </w:r>
+      <w:r>
+        <w:t xml:space="preserve">o a personas de su organización </w:t>
+      </w:r>
+      <w:r>
+        <w:t>que obre</w:t>
+      </w:r>
+      <w:r>
+        <w:t>n</w:t>
+      </w:r>
+      <w:r>
+        <w:t xml:space="preserve"> en </w:t>
+      </w:r>
+      <w:r>
+        <w:t xml:space="preserve">poder de </w:t>
+      </w:r>
+      <w:r>
+        <w:t xml:space="preserve">la Asociación. No obstante lo anterior, no será confidencial </w:t>
+      </w:r>
+      <w:r>
+        <w:t xml:space="preserve">la </w:t>
+      </w:r>
+      <w:r>
+        <w:t xml:space="preserve">pertenencia del Socio a la Asociación ni a la Junta Directiva o demás órganos de gobierno. </w:t>
+      </w:r>
+    </w:p>
+    <w:p>
+      <w:pPr>
+        <w:pStyle w:val="Prrafodelista"/>
         <w:numPr>
           <w:ilvl w:val="0"/>
           <w:numId w:val="0"/>
@@ -591,44 +688,47 @@
     </w:p>
     <w:p>
       <w:pPr>
-        <w:pStyle w:val="ListParagraph"/>
+        <w:pStyle w:val="Prrafodelista"/>
         <w:spacing w:before="0" w:beforeAutospacing="0" w:after="0" w:line="312" w:lineRule="auto"/>
         <w:ind w:left="1134" w:hanging="1134"/>
       </w:pPr>
       <w:r>
-        <w:t xml:space="preserve">Las </w:t>
-      </w:r>
-      <w:r>
-        <w:t>Cre</w:t>
-      </w:r>
-      <w:r>
-        <w:t>aciones, Invenciones y Secretos</w:t>
-      </w:r>
-      <w:r>
-        <w:t xml:space="preserve"> excepto </w:t>
-      </w:r>
-      <w:r>
-        <w:t>en</w:t>
-      </w:r>
-      <w:r>
-        <w:t xml:space="preserve"> cuanto pueda ser publicado </w:t>
-      </w:r>
-      <w:r>
-        <w:t xml:space="preserve">en los correspondientes </w:t>
-      </w:r>
-      <w:r>
-        <w:t xml:space="preserve">boletines oficiales de </w:t>
-      </w:r>
-      <w:r>
-        <w:t>las correspondientes oficinas de registro de derechos de</w:t>
-      </w:r>
-      <w:r>
-        <w:t xml:space="preserve"> propiedad intelectual y/o industrial. </w:t>
-      </w:r>
-    </w:p>
-    <w:p>
-      <w:pPr>
-        <w:pStyle w:val="ListParagraph"/>
+        <w:t xml:space="preserve">Cualesquiera materiales de estudio, investigación, análisis, diseño </w:t>
+      </w:r>
+      <w:r>
+        <w:t>elaborados</w:t>
+      </w:r>
+      <w:r>
+        <w:t xml:space="preserve"> por los órganos de gobierno o p</w:t>
+      </w:r>
+      <w:r>
+        <w:t>or los c</w:t>
+      </w:r>
+      <w:r>
+        <w:t>omités de la Asociación e</w:t>
+      </w:r>
+      <w:r>
+        <w:t xml:space="preserve">xcepto de los que hayan </w:t>
+      </w:r>
+      <w:r>
+        <w:t xml:space="preserve">sido publicados </w:t>
+      </w:r>
+      <w:r>
+        <w:t xml:space="preserve">y/o </w:t>
+      </w:r>
+      <w:r>
+        <w:t>puestos a disposición de</w:t>
+      </w:r>
+      <w:r>
+        <w:t xml:space="preserve">l público en general </w:t>
+      </w:r>
+      <w:r>
+        <w:t>por los órganos de gobierno.</w:t>
+      </w:r>
+    </w:p>
+    <w:p>
+      <w:pPr>
+        <w:pStyle w:val="Prrafodelista"/>
         <w:numPr>
           <w:ilvl w:val="0"/>
           <w:numId w:val="0"/>
@@ -639,33 +739,44 @@
     </w:p>
     <w:p>
       <w:pPr>
-        <w:pStyle w:val="ListParagraph"/>
+        <w:pStyle w:val="Prrafodelista"/>
         <w:spacing w:before="0" w:beforeAutospacing="0" w:after="0" w:line="312" w:lineRule="auto"/>
         <w:ind w:left="1134" w:hanging="1134"/>
       </w:pPr>
       <w:r>
-        <w:t xml:space="preserve">La información facilitada por los propios Socios de la Asociación cuando se haya hecho constar de forma previa </w:t>
-      </w:r>
-      <w:r>
-        <w:t xml:space="preserve">y expresa por parte del Socio </w:t>
-      </w:r>
-      <w:r>
-        <w:t xml:space="preserve">su carácter confidencial y secreto. Se presumirá, salvo prueba en contrario, que todas las contribuciones y/o trabajos y/o materiales facilitados por los Socios a la Asociación pueden ser </w:t>
-      </w:r>
-      <w:r>
-        <w:lastRenderedPageBreak/>
-        <w:t xml:space="preserve">publicados ya </w:t>
-      </w:r>
-      <w:r>
-        <w:t xml:space="preserve">sea </w:t>
-      </w:r>
-      <w:r>
-        <w:t>de forma separada o de forma combinada con otra información.</w:t>
-      </w:r>
-    </w:p>
-    <w:p>
-      <w:pPr>
-        <w:pStyle w:val="ListParagraph"/>
+        <w:t xml:space="preserve">Las </w:t>
+      </w:r>
+      <w:r>
+        <w:t>Cre</w:t>
+      </w:r>
+      <w:r>
+        <w:t>aciones, Invenciones y Secretos</w:t>
+      </w:r>
+      <w:r>
+        <w:t xml:space="preserve"> excepto </w:t>
+      </w:r>
+      <w:r>
+        <w:t>en</w:t>
+      </w:r>
+      <w:r>
+        <w:t xml:space="preserve"> cuanto pueda ser publicado </w:t>
+      </w:r>
+      <w:r>
+        <w:t xml:space="preserve">en los correspondientes </w:t>
+      </w:r>
+      <w:r>
+        <w:t xml:space="preserve">boletines oficiales de </w:t>
+      </w:r>
+      <w:r>
+        <w:t>las correspondientes oficinas de registro de derechos de</w:t>
+      </w:r>
+      <w:r>
+        <w:t xml:space="preserve"> propiedad intelectual y/o industrial. </w:t>
+      </w:r>
+    </w:p>
+    <w:p>
+      <w:pPr>
+        <w:pStyle w:val="Prrafodelista"/>
         <w:numPr>
           <w:ilvl w:val="0"/>
           <w:numId w:val="0"/>
@@ -676,22 +787,71 @@
     </w:p>
     <w:p>
       <w:pPr>
-        <w:pStyle w:val="ListParagraph"/>
+        <w:pStyle w:val="Prrafodelista"/>
         <w:spacing w:before="0" w:beforeAutospacing="0" w:after="0" w:line="312" w:lineRule="auto"/>
         <w:ind w:left="1134" w:hanging="1134"/>
       </w:pPr>
       <w:r>
-        <w:t>Los Datos de Carácter Personal que trate la Asociación ya sea como responsable o encargada del tratamiento.</w:t>
-      </w:r>
-    </w:p>
-    <w:p>
-      <w:pPr>
-        <w:pStyle w:val="ListParagraph"/>
+        <w:t xml:space="preserve">La información facilitada por los propios </w:t>
+      </w:r>
+      <w:r>
+        <w:t>Asociados</w:t>
+      </w:r>
+      <w:r>
+        <w:t xml:space="preserve"> de la Asociación cuando se haya hecho constar de forma previa </w:t>
+      </w:r>
+      <w:r>
+        <w:t xml:space="preserve">y expresa por parte del Socio </w:t>
+      </w:r>
+      <w:r>
+        <w:t xml:space="preserve">su carácter confidencial y secreto. Se presumirá, salvo </w:t>
+      </w:r>
+      <w:r>
+        <w:lastRenderedPageBreak/>
+        <w:t xml:space="preserve">prueba en contrario, que todas las contribuciones y/o trabajos y/o materiales facilitados por los </w:t>
+      </w:r>
+      <w:r>
+        <w:t>Asociados</w:t>
+      </w:r>
+      <w:r>
+        <w:t xml:space="preserve"> a la Asociación pueden ser publicados ya </w:t>
+      </w:r>
+      <w:r>
+        <w:t xml:space="preserve">sea </w:t>
+      </w:r>
+      <w:r>
+        <w:t>de forma separada o de forma combinada con otra información.</w:t>
+      </w:r>
+    </w:p>
+    <w:p>
+      <w:pPr>
+        <w:pStyle w:val="Prrafodelista"/>
         <w:numPr>
           <w:ilvl w:val="0"/>
           <w:numId w:val="0"/>
         </w:numPr>
         <w:spacing w:before="0" w:beforeAutospacing="0" w:after="0" w:line="312" w:lineRule="auto"/>
+        <w:ind w:left="1134" w:hanging="1134"/>
+      </w:pPr>
+    </w:p>
+    <w:p>
+      <w:pPr>
+        <w:pStyle w:val="Prrafodelista"/>
+        <w:spacing w:before="0" w:beforeAutospacing="0" w:after="0" w:line="312" w:lineRule="auto"/>
+        <w:ind w:left="1134" w:hanging="1134"/>
+      </w:pPr>
+      <w:r>
+        <w:t>Los Datos de Carácter Personal que trate la Asociación ya sea como responsable o encargada del tratamiento.</w:t>
+      </w:r>
+    </w:p>
+    <w:p>
+      <w:pPr>
+        <w:pStyle w:val="Prrafodelista"/>
+        <w:numPr>
+          <w:ilvl w:val="0"/>
+          <w:numId w:val="0"/>
+        </w:numPr>
+        <w:spacing w:before="0" w:beforeAutospacing="0" w:after="0" w:line="312" w:lineRule="auto"/>
         <w:ind w:left="709"/>
       </w:pPr>
       <w:r>
@@ -700,7 +860,7 @@
     </w:p>
     <w:p>
       <w:pPr>
-        <w:pStyle w:val="ListParagraph"/>
+        <w:pStyle w:val="Prrafodelista"/>
         <w:numPr>
           <w:ilvl w:val="1"/>
           <w:numId w:val="28"/>
@@ -720,7 +880,7 @@
     </w:p>
     <w:p>
       <w:pPr>
-        <w:pStyle w:val="ListParagraph"/>
+        <w:pStyle w:val="Prrafodelista"/>
         <w:numPr>
           <w:ilvl w:val="0"/>
           <w:numId w:val="0"/>
@@ -731,7 +891,7 @@
     </w:p>
     <w:p>
       <w:pPr>
-        <w:pStyle w:val="ListParagraph"/>
+        <w:pStyle w:val="Prrafodelista"/>
         <w:numPr>
           <w:ilvl w:val="1"/>
           <w:numId w:val="28"/>
@@ -751,7 +911,7 @@
     </w:p>
     <w:p>
       <w:pPr>
-        <w:pStyle w:val="ListParagraph"/>
+        <w:pStyle w:val="Prrafodelista"/>
         <w:numPr>
           <w:ilvl w:val="0"/>
           <w:numId w:val="0"/>
@@ -762,27 +922,7 @@
     </w:p>
     <w:p>
       <w:pPr>
-        <w:pStyle w:val="ListParagraph"/>
-        <w:numPr>
-          <w:ilvl w:val="1"/>
-          <w:numId w:val="28"/>
-        </w:numPr>
-        <w:spacing w:before="0" w:beforeAutospacing="0" w:after="0" w:line="312" w:lineRule="auto"/>
-        <w:ind w:left="709" w:hanging="709"/>
-      </w:pPr>
-      <w:r>
-        <w:t>“Socios”</w:t>
-      </w:r>
-      <w:r>
-        <w:t xml:space="preserve"> se refiere a los socios de la Asociación, con independencia de su condición de soc</w:t>
-      </w:r>
-      <w:r>
-        <w:t xml:space="preserve">io promotor, de número o de honor, o cualquier otra categoría que pueda ser creada durante la vida de la Asociación. </w:t>
-      </w:r>
-    </w:p>
-    <w:p>
-      <w:pPr>
-        <w:pStyle w:val="ListParagraph"/>
+        <w:pStyle w:val="Prrafodelista"/>
         <w:numPr>
           <w:ilvl w:val="0"/>
           <w:numId w:val="0"/>
@@ -790,10 +930,24 @@
         <w:spacing w:before="0" w:beforeAutospacing="0" w:after="0" w:line="312" w:lineRule="auto"/>
         <w:ind w:left="709"/>
       </w:pPr>
-    </w:p>
-    <w:p>
-      <w:pPr>
-        <w:pStyle w:val="ListParagraph"/>
+      <w:r>
+        <w:t xml:space="preserve">. </w:t>
+      </w:r>
+    </w:p>
+    <w:p>
+      <w:pPr>
+        <w:pStyle w:val="Prrafodelista"/>
+        <w:numPr>
+          <w:ilvl w:val="0"/>
+          <w:numId w:val="0"/>
+        </w:numPr>
+        <w:spacing w:before="0" w:beforeAutospacing="0" w:after="0" w:line="312" w:lineRule="auto"/>
+        <w:ind w:left="709"/>
+      </w:pPr>
+    </w:p>
+    <w:p>
+      <w:pPr>
+        <w:pStyle w:val="Prrafodelista"/>
         <w:numPr>
           <w:ilvl w:val="0"/>
           <w:numId w:val="28"/>
@@ -823,12 +977,18 @@
         <w:rPr>
           <w:b/>
         </w:rPr>
-        <w:t>de los Socios</w:t>
-      </w:r>
-    </w:p>
-    <w:p>
-      <w:pPr>
-        <w:pStyle w:val="ListParagraph"/>
+        <w:t xml:space="preserve">de los </w:t>
+      </w:r>
+      <w:r>
+        <w:rPr>
+          <w:b/>
+        </w:rPr>
+        <w:t>Asociados</w:t>
+      </w:r>
+    </w:p>
+    <w:p>
+      <w:pPr>
+        <w:pStyle w:val="Prrafodelista"/>
         <w:numPr>
           <w:ilvl w:val="0"/>
           <w:numId w:val="0"/>
@@ -839,7 +999,7 @@
     </w:p>
     <w:p>
       <w:pPr>
-        <w:pStyle w:val="ListParagraph"/>
+        <w:pStyle w:val="Prrafodelista"/>
         <w:numPr>
           <w:ilvl w:val="1"/>
           <w:numId w:val="28"/>
@@ -857,7 +1017,13 @@
         <w:t xml:space="preserve"> la Información Confidencial </w:t>
       </w:r>
       <w:r>
-        <w:t xml:space="preserve">de los Socios </w:t>
+        <w:t xml:space="preserve">de los </w:t>
+      </w:r>
+      <w:r>
+        <w:t>Asociados</w:t>
+      </w:r>
+      <w:r>
+        <w:t xml:space="preserve"> </w:t>
       </w:r>
       <w:r>
         <w:t>que pudiera llegar a conocer</w:t>
@@ -868,7 +1034,7 @@
     </w:p>
     <w:p>
       <w:pPr>
-        <w:pStyle w:val="ListParagraph"/>
+        <w:pStyle w:val="Prrafodelista"/>
         <w:numPr>
           <w:ilvl w:val="0"/>
           <w:numId w:val="0"/>
@@ -879,7 +1045,7 @@
     </w:p>
     <w:p>
       <w:pPr>
-        <w:pStyle w:val="ListParagraph"/>
+        <w:pStyle w:val="Prrafodelista"/>
         <w:numPr>
           <w:ilvl w:val="1"/>
           <w:numId w:val="28"/>
@@ -897,7 +1063,19 @@
         <w:t xml:space="preserve">obligación anterior no impedirá a la </w:t>
       </w:r>
       <w:r>
-        <w:t xml:space="preserve">Asociación utilizar la Información Confidencial que haya </w:t>
+        <w:t xml:space="preserve">Asociación utilizar la Información Confidencial </w:t>
+      </w:r>
+      <w:r>
+        <w:t xml:space="preserve">de los </w:t>
+      </w:r>
+      <w:r>
+        <w:t>Asociados</w:t>
+      </w:r>
+      <w:r>
+        <w:t xml:space="preserve"> </w:t>
+      </w:r>
+      <w:r>
+        <w:t xml:space="preserve">que haya </w:t>
       </w:r>
       <w:r>
         <w:t>conocido</w:t>
@@ -917,7 +1095,7 @@
     </w:p>
     <w:p>
       <w:pPr>
-        <w:pStyle w:val="ListParagraph"/>
+        <w:pStyle w:val="Prrafodelista"/>
         <w:numPr>
           <w:ilvl w:val="0"/>
           <w:numId w:val="0"/>
@@ -928,7 +1106,7 @@
     </w:p>
     <w:p>
       <w:pPr>
-        <w:pStyle w:val="ListParagraph"/>
+        <w:pStyle w:val="Prrafodelista"/>
         <w:numPr>
           <w:ilvl w:val="1"/>
           <w:numId w:val="28"/>
@@ -943,7 +1121,25 @@
         <w:t xml:space="preserve"> o revelación</w:t>
       </w:r>
       <w:r>
-        <w:t xml:space="preserve"> a terceros de Información Confidencial de los Socios, la Asociación podrá comunicarlo </w:t>
+        <w:t xml:space="preserve"> a terceros de Información Confidencial de los </w:t>
+      </w:r>
+      <w:r>
+        <w:t>Asociados</w:t>
+      </w:r>
+      <w:r>
+        <w:t xml:space="preserve">, la Asociación </w:t>
+      </w:r>
+      <w:r>
+        <w:t>–previa obtención en su caso de la autorización prevista en el apartado 3.4</w:t>
+      </w:r>
+      <w:r>
+        <w:t>. de la presente Política</w:t>
+      </w:r>
+      <w:r>
+        <w:t xml:space="preserve">– </w:t>
+      </w:r>
+      <w:r>
+        <w:t xml:space="preserve">podrá comunicarlo </w:t>
       </w:r>
       <w:r>
         <w:t>a dichos terceros siempre y cuando estos asuman contractualmente compromisos similares a los previstos</w:t>
@@ -952,10 +1148,25 @@
         <w:t xml:space="preserve"> en la presente Política</w:t>
       </w:r>
       <w:r>
-        <w:t xml:space="preserve"> o más exigentes aun</w:t>
-      </w:r>
-      <w:r>
-        <w:t>. En particular, se valorará la posibilidad de incluir cláusulas penales u otras medidas disuasorias adecuadas a los efectos de reforzar la protección que se obtiene de la Información Confidencial.</w:t>
+        <w:t xml:space="preserve"> o </w:t>
+      </w:r>
+      <w:r>
+        <w:t xml:space="preserve">aún </w:t>
+      </w:r>
+      <w:r>
+        <w:t>más exigentes</w:t>
+      </w:r>
+      <w:r>
+        <w:t>. En particular, se valorará la posibilidad de incluir cláusulas penales u otras medidas disuasorias adecuadas a los efectos de reforzar la protección que se obtiene de la Información Confidencial</w:t>
+      </w:r>
+      <w:r>
+        <w:t xml:space="preserve"> de los </w:t>
+      </w:r>
+      <w:r>
+        <w:t>Asociados</w:t>
+      </w:r>
+      <w:r>
+        <w:t>.</w:t>
       </w:r>
       <w:r>
         <w:t xml:space="preserve"> </w:t>
@@ -963,7 +1174,7 @@
     </w:p>
     <w:p>
       <w:pPr>
-        <w:pStyle w:val="ListParagraph"/>
+        <w:pStyle w:val="Prrafodelista"/>
         <w:numPr>
           <w:ilvl w:val="0"/>
           <w:numId w:val="0"/>
@@ -974,7 +1185,7 @@
     </w:p>
     <w:p>
       <w:pPr>
-        <w:pStyle w:val="ListParagraph"/>
+        <w:pStyle w:val="Prrafodelista"/>
         <w:numPr>
           <w:ilvl w:val="1"/>
           <w:numId w:val="28"/>
@@ -983,16 +1194,34 @@
         <w:ind w:left="709" w:hanging="709"/>
       </w:pPr>
       <w:r>
-        <w:t xml:space="preserve">La Asociación tomará medidas para que el acceso a la Información Confidencial, tanto propia como a la de los Socios, quede reservada a las </w:t>
+        <w:t xml:space="preserve">La Asociación tomará medidas para que el acceso a la Información Confidencial, tanto </w:t>
+      </w:r>
+      <w:r>
+        <w:t xml:space="preserve">a la </w:t>
+      </w:r>
+      <w:r>
+        <w:t xml:space="preserve">propia como a la de los </w:t>
+      </w:r>
+      <w:r>
+        <w:t>Asociados</w:t>
+      </w:r>
+      <w:r>
+        <w:t xml:space="preserve">, quede </w:t>
       </w:r>
       <w:r>
         <w:lastRenderedPageBreak/>
-        <w:t>personas o Socios que por el desempeño de su cargo o sus funciones dentro de la Asociación necesiten conocerla.</w:t>
-      </w:r>
-    </w:p>
-    <w:p>
-      <w:pPr>
-        <w:pStyle w:val="ListParagraph"/>
+        <w:t xml:space="preserve">reservada a las personas o </w:t>
+      </w:r>
+      <w:r>
+        <w:t>Asociados</w:t>
+      </w:r>
+      <w:r>
+        <w:t xml:space="preserve"> que por el desempeño de su cargo o sus funciones dentro de la Asociación necesiten conocerla.</w:t>
+      </w:r>
+    </w:p>
+    <w:p>
+      <w:pPr>
+        <w:pStyle w:val="Prrafodelista"/>
         <w:numPr>
           <w:ilvl w:val="0"/>
           <w:numId w:val="0"/>
@@ -1003,7 +1232,7 @@
     </w:p>
     <w:p>
       <w:pPr>
-        <w:pStyle w:val="ListParagraph"/>
+        <w:pStyle w:val="Prrafodelista"/>
         <w:numPr>
           <w:ilvl w:val="1"/>
           <w:numId w:val="28"/>
@@ -1015,7 +1244,13 @@
         <w:t xml:space="preserve">La Asociación adoptará respecto de la Información Confidencial </w:t>
       </w:r>
       <w:r>
-        <w:t xml:space="preserve">de los Socios </w:t>
+        <w:t xml:space="preserve">de los </w:t>
+      </w:r>
+      <w:r>
+        <w:t>Asociados</w:t>
+      </w:r>
+      <w:r>
+        <w:t xml:space="preserve"> </w:t>
       </w:r>
       <w:r>
         <w:t>medidas técnicas y organizativas</w:t>
@@ -1033,6 +1268,12 @@
         <w:t>que contengan Información Confidencial</w:t>
       </w:r>
       <w:r>
+        <w:t xml:space="preserve"> de los </w:t>
+      </w:r>
+      <w:r>
+        <w:t>Asociados</w:t>
+      </w:r>
+      <w:r>
         <w:t xml:space="preserve">. </w:t>
       </w:r>
       <w:r>
@@ -1041,7 +1282,7 @@
     </w:p>
     <w:p>
       <w:pPr>
-        <w:pStyle w:val="ListParagraph"/>
+        <w:pStyle w:val="Prrafodelista"/>
         <w:numPr>
           <w:ilvl w:val="0"/>
           <w:numId w:val="0"/>
@@ -1052,7 +1293,7 @@
     </w:p>
     <w:p>
       <w:pPr>
-        <w:pStyle w:val="ListParagraph"/>
+        <w:pStyle w:val="Prrafodelista"/>
         <w:numPr>
           <w:ilvl w:val="1"/>
           <w:numId w:val="28"/>
@@ -1061,15 +1302,42 @@
         <w:ind w:left="709" w:hanging="709"/>
       </w:pPr>
       <w:r>
-        <w:t>Las obligaciones previstas anteriormente continuará vigentes incluso tras la separación o pérdida de la condición de socio del Socio titular de dicha Información Confid</w:t>
-      </w:r>
-      <w:r>
-        <w:t>encial y mientras dicha Información Confidencial no haya caído en dominio público.</w:t>
-      </w:r>
-    </w:p>
-    <w:p>
-      <w:pPr>
-        <w:pStyle w:val="ListParagraph"/>
+        <w:t xml:space="preserve">Las obligaciones previstas anteriormente continuará vigentes incluso tras la separación o pérdida de la condición de </w:t>
+      </w:r>
+      <w:r>
+        <w:t>a</w:t>
+      </w:r>
+      <w:r>
+        <w:t>soci</w:t>
+      </w:r>
+      <w:r>
+        <w:t>ad</w:t>
+      </w:r>
+      <w:r>
+        <w:t xml:space="preserve">o del </w:t>
+      </w:r>
+      <w:r>
+        <w:t>Asociado</w:t>
+      </w:r>
+      <w:r>
+        <w:t xml:space="preserve"> titular de dicha Información Confid</w:t>
+      </w:r>
+      <w:r>
+        <w:t>encial y mientras dicha Información Confidencial</w:t>
+      </w:r>
+      <w:r>
+        <w:t xml:space="preserve"> de los </w:t>
+      </w:r>
+      <w:r>
+        <w:t>Asociados</w:t>
+      </w:r>
+      <w:r>
+        <w:t xml:space="preserve"> no haya caído en dominio público.</w:t>
+      </w:r>
+    </w:p>
+    <w:p>
+      <w:pPr>
+        <w:pStyle w:val="Prrafodelista"/>
         <w:numPr>
           <w:ilvl w:val="0"/>
           <w:numId w:val="0"/>
@@ -1080,7 +1348,7 @@
     </w:p>
     <w:p>
       <w:pPr>
-        <w:pStyle w:val="ListParagraph"/>
+        <w:pStyle w:val="Prrafodelista"/>
         <w:numPr>
           <w:ilvl w:val="0"/>
           <w:numId w:val="28"/>
@@ -1096,12 +1364,18 @@
         <w:rPr>
           <w:b/>
         </w:rPr>
-        <w:t>Deber de secreto de los Socios</w:t>
-      </w:r>
-    </w:p>
-    <w:p>
-      <w:pPr>
-        <w:pStyle w:val="ListParagraph"/>
+        <w:t xml:space="preserve">Deber de secreto de los </w:t>
+      </w:r>
+      <w:r>
+        <w:rPr>
+          <w:b/>
+        </w:rPr>
+        <w:t>Asociados</w:t>
+      </w:r>
+    </w:p>
+    <w:p>
+      <w:pPr>
+        <w:pStyle w:val="Prrafodelista"/>
         <w:numPr>
           <w:ilvl w:val="0"/>
           <w:numId w:val="0"/>
@@ -1115,7 +1389,7 @@
     </w:p>
     <w:p>
       <w:pPr>
-        <w:pStyle w:val="ListParagraph"/>
+        <w:pStyle w:val="Prrafodelista"/>
         <w:numPr>
           <w:ilvl w:val="1"/>
           <w:numId w:val="28"/>
@@ -1127,7 +1401,13 @@
         <w:t xml:space="preserve">Todos </w:t>
       </w:r>
       <w:r>
-        <w:t xml:space="preserve">los Socios </w:t>
+        <w:t xml:space="preserve">los </w:t>
+      </w:r>
+      <w:r>
+        <w:t>Asociados</w:t>
+      </w:r>
+      <w:r>
+        <w:t xml:space="preserve"> </w:t>
       </w:r>
       <w:r>
         <w:t>mantendrán el más estricto secreto y reserva</w:t>
@@ -1148,7 +1428,13 @@
         <w:t xml:space="preserve"> Información Confidencial</w:t>
       </w:r>
       <w:r>
-        <w:t xml:space="preserve"> de la Asociación o de otros Socios </w:t>
+        <w:t xml:space="preserve"> de la Asociación o de otros </w:t>
+      </w:r>
+      <w:r>
+        <w:t>Asociados</w:t>
+      </w:r>
+      <w:r>
+        <w:t xml:space="preserve"> </w:t>
       </w:r>
       <w:r>
         <w:t xml:space="preserve">que puedan conocer </w:t>
@@ -1157,7 +1443,10 @@
         <w:t xml:space="preserve">tanto por su </w:t>
       </w:r>
       <w:r>
-        <w:t>condición de Socios</w:t>
+        <w:t xml:space="preserve">condición de </w:t>
+      </w:r>
+      <w:r>
+        <w:t>Asociados</w:t>
       </w:r>
       <w:r>
         <w:t xml:space="preserve"> </w:t>
@@ -1180,7 +1469,7 @@
     </w:p>
     <w:p>
       <w:pPr>
-        <w:pStyle w:val="ListParagraph"/>
+        <w:pStyle w:val="Prrafodelista"/>
         <w:numPr>
           <w:ilvl w:val="0"/>
           <w:numId w:val="0"/>
@@ -1191,7 +1480,7 @@
     </w:p>
     <w:p>
       <w:pPr>
-        <w:pStyle w:val="ListParagraph"/>
+        <w:pStyle w:val="Prrafodelista"/>
         <w:numPr>
           <w:ilvl w:val="1"/>
           <w:numId w:val="28"/>
@@ -1203,16 +1492,37 @@
         <w:t>Adicionalmente, l</w:t>
       </w:r>
       <w:r>
-        <w:t xml:space="preserve">os Socios solo podrán utilizar la Información Confidencial </w:t>
-      </w:r>
-      <w:r>
-        <w:t xml:space="preserve">conocida a </w:t>
+        <w:t xml:space="preserve">os </w:t>
+      </w:r>
+      <w:r>
+        <w:t>Asociados</w:t>
+      </w:r>
+      <w:r>
+        <w:t xml:space="preserve"> solo podrán utilizar la Información Confidencial</w:t>
+      </w:r>
+      <w:r>
+        <w:t xml:space="preserve"> de la Asociación o de otros </w:t>
+      </w:r>
+      <w:r>
+        <w:t>Asociados</w:t>
+      </w:r>
+      <w:r>
+        <w:t xml:space="preserve"> </w:t>
+      </w:r>
+      <w:r>
+        <w:t xml:space="preserve">a </w:t>
       </w:r>
       <w:r>
         <w:t>los exclusivos efectos de obtener el aprovechamiento que en cada caso sea explicitado o, en su defecto, del que razonablemente pueda esperarse del contexto o información complementaria que acompañe dicha revelación.</w:t>
       </w:r>
       <w:r>
-        <w:t xml:space="preserve"> En el caso de que la Información Confidencial fuera accedida o facilitada por razón del cargo que un Socio o persona de su organización desempeñe dentro de la Asociación, el uso que podrá realizarse de dicha Información Confidencial quedará limitado al estrictamente necesa</w:t>
+        <w:t xml:space="preserve"> En el caso de que la Información Confidencial fuera accedida o facilitada por razón del cargo que un </w:t>
+      </w:r>
+      <w:r>
+        <w:t>Asociado</w:t>
+      </w:r>
+      <w:r>
+        <w:t xml:space="preserve"> o persona de su organización desempeñe dentro de la Asociación, el uso que podrá realizarse de dicha Información Confidencial quedará limitado al estrictamente necesa</w:t>
       </w:r>
       <w:r>
         <w:t>rio para el desempeño del cargo.</w:t>
@@ -1220,7 +1530,7 @@
     </w:p>
     <w:p>
       <w:pPr>
-        <w:pStyle w:val="ListParagraph"/>
+        <w:pStyle w:val="Prrafodelista"/>
         <w:numPr>
           <w:ilvl w:val="0"/>
           <w:numId w:val="0"/>
@@ -1231,7 +1541,7 @@
     </w:p>
     <w:p>
       <w:pPr>
-        <w:pStyle w:val="ListParagraph"/>
+        <w:pStyle w:val="Prrafodelista"/>
         <w:numPr>
           <w:ilvl w:val="1"/>
           <w:numId w:val="28"/>
@@ -1240,12 +1550,18 @@
         <w:ind w:left="709" w:hanging="709"/>
       </w:pPr>
       <w:r>
-        <w:t>Los Socios tomarán medidas para que el acceso a la Información Confidencial, tanto de la Asociación como de otros Socios, quede reservada a las personas de su organización que por el desempeño de su cargo o sus funciones dentro de la Asociación necesiten conocerla.</w:t>
-      </w:r>
-    </w:p>
-    <w:p>
-      <w:pPr>
-        <w:pStyle w:val="ListParagraph"/>
+        <w:t xml:space="preserve">Los </w:t>
+      </w:r>
+      <w:r>
+        <w:t>Asociados</w:t>
+      </w:r>
+      <w:r>
+        <w:t xml:space="preserve"> tomarán medidas para que el acceso a la Información Confidencial, tanto de la Asociación como de otros Socios, quede reservada a las personas de su organización que por el desempeño de su cargo o sus funciones dentro de la Asociación necesiten conocerla.</w:t>
+      </w:r>
+    </w:p>
+    <w:p>
+      <w:pPr>
+        <w:pStyle w:val="Prrafodelista"/>
         <w:numPr>
           <w:ilvl w:val="0"/>
           <w:numId w:val="0"/>
@@ -1256,7 +1572,7 @@
     </w:p>
     <w:p>
       <w:pPr>
-        <w:pStyle w:val="ListParagraph"/>
+        <w:pStyle w:val="Prrafodelista"/>
         <w:numPr>
           <w:ilvl w:val="1"/>
           <w:numId w:val="28"/>
@@ -1265,10 +1581,14 @@
         <w:ind w:left="709" w:hanging="709"/>
       </w:pPr>
       <w:r>
+        <w:lastRenderedPageBreak/>
         <w:t>En ningún caso estará autorizada la revelación o comunicación a terceros de la Información Confidencial</w:t>
       </w:r>
       <w:r>
-        <w:t xml:space="preserve"> de la Asociación o de los Socios</w:t>
+        <w:t xml:space="preserve"> de la Asociación o de los </w:t>
+      </w:r>
+      <w:r>
+        <w:t>Asociados</w:t>
       </w:r>
       <w:r>
         <w:t xml:space="preserve"> sin autorización expresa y escrita de los órganos responsables de la Asociación o</w:t>
@@ -1277,7 +1597,13 @@
         <w:t>, en su caso,</w:t>
       </w:r>
       <w:r>
-        <w:t xml:space="preserve"> del propio Socio titular de la misma.</w:t>
+        <w:t xml:space="preserve"> del propio </w:t>
+      </w:r>
+      <w:r>
+        <w:t>Asociado</w:t>
+      </w:r>
+      <w:r>
+        <w:t xml:space="preserve"> titular de la misma.</w:t>
       </w:r>
       <w:r>
         <w:t xml:space="preserve"> En estos casos, deberán adoptarse las medidas exigidas en su caso para garantizar que los terceros que acceden a dicha Información Confidencial mantienen un nivel adecuado de protección. En caso de que no se hubieran </w:t>
@@ -1286,7 +1612,13 @@
         <w:t>requerido</w:t>
       </w:r>
       <w:r>
-        <w:t xml:space="preserve"> medidas específicas, el Socio deberá exigir obligaciones contractuales de secreto y confidencialidad a dichos terceros con un</w:t>
+        <w:t xml:space="preserve"> medidas específicas, el </w:t>
+      </w:r>
+      <w:r>
+        <w:t>Asociado</w:t>
+      </w:r>
+      <w:r>
+        <w:t xml:space="preserve"> deberá exigir obligaciones contractuales de secreto y confidencialidad a dichos terceros con un</w:t>
       </w:r>
       <w:r>
         <w:t xml:space="preserve"> nivel de protección equivalente </w:t>
@@ -1309,7 +1641,7 @@
     </w:p>
     <w:p>
       <w:pPr>
-        <w:pStyle w:val="ListParagraph"/>
+        <w:pStyle w:val="Prrafodelista"/>
         <w:numPr>
           <w:ilvl w:val="0"/>
           <w:numId w:val="0"/>
@@ -1320,7 +1652,7 @@
     </w:p>
     <w:p>
       <w:pPr>
-        <w:pStyle w:val="ListParagraph"/>
+        <w:pStyle w:val="Prrafodelista"/>
         <w:numPr>
           <w:ilvl w:val="1"/>
           <w:numId w:val="28"/>
@@ -1332,7 +1664,13 @@
         <w:t>L</w:t>
       </w:r>
       <w:r>
-        <w:t xml:space="preserve">os Socios </w:t>
+        <w:t xml:space="preserve">os </w:t>
+      </w:r>
+      <w:r>
+        <w:t>Asociados</w:t>
+      </w:r>
+      <w:r>
+        <w:t xml:space="preserve"> </w:t>
       </w:r>
       <w:r>
         <w:t>adoptará</w:t>
@@ -1383,12 +1721,18 @@
         <w:t>adopción de dichas medidas</w:t>
       </w:r>
       <w:r>
-        <w:t xml:space="preserve"> deberá ser como mínimo la que el propio Socio tuviera adoptada respecto de su propia información confidencial.</w:t>
-      </w:r>
-    </w:p>
-    <w:p>
-      <w:pPr>
-        <w:pStyle w:val="ListParagraph"/>
+        <w:t xml:space="preserve"> deberá ser como mínimo la que el propio </w:t>
+      </w:r>
+      <w:r>
+        <w:t>Asociado</w:t>
+      </w:r>
+      <w:r>
+        <w:t xml:space="preserve"> tuviera adoptada respecto de su propia información confidencial.</w:t>
+      </w:r>
+    </w:p>
+    <w:p>
+      <w:pPr>
+        <w:pStyle w:val="Prrafodelista"/>
         <w:numPr>
           <w:ilvl w:val="0"/>
           <w:numId w:val="0"/>
@@ -1399,7 +1743,7 @@
     </w:p>
     <w:p>
       <w:pPr>
-        <w:pStyle w:val="ListParagraph"/>
+        <w:pStyle w:val="Prrafodelista"/>
         <w:numPr>
           <w:ilvl w:val="1"/>
           <w:numId w:val="28"/>
@@ -1411,7 +1755,10 @@
         <w:t>Las obligaciones previstas anteriormente continuará vigentes incluso tras la separació</w:t>
       </w:r>
       <w:r>
-        <w:t>n o pérdida de la condición de Socio</w:t>
+        <w:t xml:space="preserve">n o pérdida de la condición de </w:t>
+      </w:r>
+      <w:r>
+        <w:t>Asociado</w:t>
       </w:r>
       <w:r>
         <w:t xml:space="preserve"> y mientras dicha Información Confidencial no haya caído en dominio público.</w:t>
@@ -1422,7 +1769,7 @@
     </w:p>
     <w:p>
       <w:pPr>
-        <w:pStyle w:val="ListParagraph"/>
+        <w:pStyle w:val="Prrafodelista"/>
         <w:numPr>
           <w:ilvl w:val="0"/>
           <w:numId w:val="0"/>
@@ -1453,12 +1800,12 @@
       </w:r>
     </w:p>
     <w:sectPr>
-      <w:headerReference w:type="even" r:id="rId9"/>
-      <w:headerReference w:type="default" r:id="rId10"/>
-      <w:footerReference w:type="even" r:id="rId11"/>
-      <w:footerReference w:type="default" r:id="rId12"/>
-      <w:headerReference w:type="first" r:id="rId13"/>
-      <w:footerReference w:type="first" r:id="rId14"/>
+      <w:headerReference w:type="even" r:id="rId8"/>
+      <w:headerReference w:type="default" r:id="rId9"/>
+      <w:footerReference w:type="even" r:id="rId10"/>
+      <w:footerReference w:type="default" r:id="rId11"/>
+      <w:headerReference w:type="first" r:id="rId12"/>
+      <w:footerReference w:type="first" r:id="rId13"/>
       <w:pgSz w:w="11906" w:h="16838" w:code="9"/>
       <w:pgMar w:top="2552" w:right="1701" w:bottom="1701" w:left="1701" w:header="1276" w:footer="476" w:gutter="0"/>
       <w:cols w:space="708"/>
@@ -1466,16 +1813,6 @@
     </w:sectPr>
   </w:body>
 </w:document>
-</file>
-
-<file path=word/commentsExtended.xml><?xml version="1.0" encoding="utf-8"?>
-<w15:commentsEx xmlns:wpc="http://schemas.microsoft.com/office/word/2010/wordprocessingCanvas" xmlns:cx="http://schemas.microsoft.com/office/drawing/2014/chartex" xmlns:cx1="http://schemas.microsoft.com/office/drawing/2015/9/8/chartex" xmlns:cx2="http://schemas.microsoft.com/office/drawing/2015/10/21/chartex" xmlns:cx3="http://schemas.microsoft.com/office/drawing/2016/5/9/chartex" xmlns:cx4="http://schemas.microsoft.com/office/drawing/2016/5/10/chartex" xmlns:cx5="http://schemas.microsoft.com/office/drawing/2016/5/11/chartex" xmlns:cx6="http://schemas.microsoft.com/office/drawing/2016/5/12/chartex" xmlns:cx7="http://schemas.microsoft.com/office/drawing/2016/5/13/chartex" xmlns:cx8="http://schemas.microsoft.com/office/drawing/2016/5/14/chartex" xmlns:mc="http://schemas.openxmlformats.org/markup-compatibility/2006" xmlns:aink="http://schemas.microsoft.com/office/drawing/2016/ink" xmlns:am3d="http://schemas.microsoft.com/office/drawing/2017/model3d" xmlns:o="urn:schemas-microsoft-com:office:office" xmlns:r="http://schemas.openxmlformats.org/officeDocument/2006/relationships" xmlns:m="http://schemas.openxmlformats.org/officeDocument/2006/math" xmlns:v="urn:schemas-microsoft-com:vml" xmlns:wp14="http://schemas.microsoft.com/office/word/2010/wordprocessingDrawing" xmlns:wp="http://schemas.openxmlformats.org/drawingml/2006/wordprocessingDrawing" xmlns:w10="urn:schemas-microsoft-com:office:word" xmlns:w="http://schemas.openxmlformats.org/wordprocessingml/2006/main" xmlns:w14="http://schemas.microsoft.com/office/word/2010/wordml" xmlns:w15="http://schemas.microsoft.com/office/word/2012/wordml" xmlns:w16cid="http://schemas.microsoft.com/office/word/2016/wordml/cid" xmlns:w16se="http://schemas.microsoft.com/office/word/2015/wordml/symex" xmlns:wpg="http://schemas.microsoft.com/office/word/2010/wordprocessingGroup" xmlns:wpi="http://schemas.microsoft.com/office/word/2010/wordprocessingInk" xmlns:wne="http://schemas.microsoft.com/office/word/2006/wordml" xmlns:wps="http://schemas.microsoft.com/office/word/2010/wordprocessingShape" mc:Ignorable="w14 w15 w16se w16cid wp14">
-  <w15:commentEx w15:paraId="3ECDD355" w15:done="0"/>
-  <w15:commentEx w15:paraId="79312E48" w15:done="0"/>
-  <w15:commentEx w15:paraId="6EC96827" w15:done="0"/>
-  <w15:commentEx w15:paraId="3FADA4DE" w15:done="0"/>
-  <w15:commentEx w15:paraId="039AA681" w15:done="0"/>
-</w15:commentsEx>
 </file>
 
 <file path=word/commentsIds.xml><?xml version="1.0" encoding="utf-8"?>
@@ -1489,7 +1826,7 @@
 </file>
 
 <file path=word/endnotes.xml><?xml version="1.0" encoding="utf-8"?>
-<w:endnotes xmlns:wpc="http://schemas.microsoft.com/office/word/2010/wordprocessingCanvas" xmlns:mc="http://schemas.openxmlformats.org/markup-compatibility/2006" xmlns:o="urn:schemas-microsoft-com:office:office" xmlns:r="http://schemas.openxmlformats.org/officeDocument/2006/relationships" xmlns:m="http://schemas.openxmlformats.org/officeDocument/2006/math" xmlns:v="urn:schemas-microsoft-com:vml" xmlns:wp14="http://schemas.microsoft.com/office/word/2010/wordprocessingDrawing" xmlns:wp="http://schemas.openxmlformats.org/drawingml/2006/wordprocessingDrawing" xmlns:w10="urn:schemas-microsoft-com:office:word" xmlns:w="http://schemas.openxmlformats.org/wordprocessingml/2006/main" xmlns:w14="http://schemas.microsoft.com/office/word/2010/wordml" xmlns:wpg="http://schemas.microsoft.com/office/word/2010/wordprocessingGroup" xmlns:wpi="http://schemas.microsoft.com/office/word/2010/wordprocessingInk" xmlns:wne="http://schemas.microsoft.com/office/word/2006/wordml" xmlns:wps="http://schemas.microsoft.com/office/word/2010/wordprocessingShape" mc:Ignorable="w14 wp14">
+<w:endnotes xmlns:wpc="http://schemas.microsoft.com/office/word/2010/wordprocessingCanvas" xmlns:mc="http://schemas.openxmlformats.org/markup-compatibility/2006" xmlns:o="urn:schemas-microsoft-com:office:office" xmlns:r="http://schemas.openxmlformats.org/officeDocument/2006/relationships" xmlns:m="http://schemas.openxmlformats.org/officeDocument/2006/math" xmlns:v="urn:schemas-microsoft-com:vml" xmlns:wp14="http://schemas.microsoft.com/office/word/2010/wordprocessingDrawing" xmlns:wp="http://schemas.openxmlformats.org/drawingml/2006/wordprocessingDrawing" xmlns:w10="urn:schemas-microsoft-com:office:word" xmlns:w="http://schemas.openxmlformats.org/wordprocessingml/2006/main" xmlns:w14="http://schemas.microsoft.com/office/word/2010/wordml" xmlns:w15="http://schemas.microsoft.com/office/word/2012/wordml" xmlns:wpg="http://schemas.microsoft.com/office/word/2010/wordprocessingGroup" xmlns:wpi="http://schemas.microsoft.com/office/word/2010/wordprocessingInk" xmlns:wne="http://schemas.microsoft.com/office/word/2006/wordml" xmlns:wps="http://schemas.microsoft.com/office/word/2010/wordprocessingShape" mc:Ignorable="w14 w15 wp14">
   <w:endnote w:type="separator" w:id="-1">
     <w:p>
       <w:pPr>
@@ -1514,17 +1851,17 @@
 </file>
 
 <file path=word/footer1.xml><?xml version="1.0" encoding="utf-8"?>
-<w:ftr xmlns:wpc="http://schemas.microsoft.com/office/word/2010/wordprocessingCanvas" xmlns:mc="http://schemas.openxmlformats.org/markup-compatibility/2006" xmlns:o="urn:schemas-microsoft-com:office:office" xmlns:r="http://schemas.openxmlformats.org/officeDocument/2006/relationships" xmlns:m="http://schemas.openxmlformats.org/officeDocument/2006/math" xmlns:v="urn:schemas-microsoft-com:vml" xmlns:wp14="http://schemas.microsoft.com/office/word/2010/wordprocessingDrawing" xmlns:wp="http://schemas.openxmlformats.org/drawingml/2006/wordprocessingDrawing" xmlns:w10="urn:schemas-microsoft-com:office:word" xmlns:w="http://schemas.openxmlformats.org/wordprocessingml/2006/main" xmlns:w14="http://schemas.microsoft.com/office/word/2010/wordml" xmlns:wpg="http://schemas.microsoft.com/office/word/2010/wordprocessingGroup" xmlns:wpi="http://schemas.microsoft.com/office/word/2010/wordprocessingInk" xmlns:wne="http://schemas.microsoft.com/office/word/2006/wordml" xmlns:wps="http://schemas.microsoft.com/office/word/2010/wordprocessingShape" mc:Ignorable="w14 wp14">
+<w:ftr xmlns:wpc="http://schemas.microsoft.com/office/word/2010/wordprocessingCanvas" xmlns:mc="http://schemas.openxmlformats.org/markup-compatibility/2006" xmlns:o="urn:schemas-microsoft-com:office:office" xmlns:r="http://schemas.openxmlformats.org/officeDocument/2006/relationships" xmlns:m="http://schemas.openxmlformats.org/officeDocument/2006/math" xmlns:v="urn:schemas-microsoft-com:vml" xmlns:wp14="http://schemas.microsoft.com/office/word/2010/wordprocessingDrawing" xmlns:wp="http://schemas.openxmlformats.org/drawingml/2006/wordprocessingDrawing" xmlns:w10="urn:schemas-microsoft-com:office:word" xmlns:w="http://schemas.openxmlformats.org/wordprocessingml/2006/main" xmlns:w14="http://schemas.microsoft.com/office/word/2010/wordml" xmlns:w15="http://schemas.microsoft.com/office/word/2012/wordml" xmlns:wpg="http://schemas.microsoft.com/office/word/2010/wordprocessingGroup" xmlns:wpi="http://schemas.microsoft.com/office/word/2010/wordprocessingInk" xmlns:wne="http://schemas.microsoft.com/office/word/2006/wordml" xmlns:wps="http://schemas.microsoft.com/office/word/2010/wordprocessingShape" mc:Ignorable="w14 w15 wp14">
   <w:p>
     <w:pPr>
-      <w:pStyle w:val="Footer"/>
+      <w:pStyle w:val="Piedepgina"/>
     </w:pPr>
   </w:p>
 </w:ftr>
 </file>
 
 <file path=word/footer2.xml><?xml version="1.0" encoding="utf-8"?>
-<w:ftr xmlns:wpc="http://schemas.microsoft.com/office/word/2010/wordprocessingCanvas" xmlns:mc="http://schemas.openxmlformats.org/markup-compatibility/2006" xmlns:o="urn:schemas-microsoft-com:office:office" xmlns:r="http://schemas.openxmlformats.org/officeDocument/2006/relationships" xmlns:m="http://schemas.openxmlformats.org/officeDocument/2006/math" xmlns:v="urn:schemas-microsoft-com:vml" xmlns:wp14="http://schemas.microsoft.com/office/word/2010/wordprocessingDrawing" xmlns:wp="http://schemas.openxmlformats.org/drawingml/2006/wordprocessingDrawing" xmlns:w10="urn:schemas-microsoft-com:office:word" xmlns:w="http://schemas.openxmlformats.org/wordprocessingml/2006/main" xmlns:w14="http://schemas.microsoft.com/office/word/2010/wordml" xmlns:wpg="http://schemas.microsoft.com/office/word/2010/wordprocessingGroup" xmlns:wpi="http://schemas.microsoft.com/office/word/2010/wordprocessingInk" xmlns:wne="http://schemas.microsoft.com/office/word/2006/wordml" xmlns:wps="http://schemas.microsoft.com/office/word/2010/wordprocessingShape" mc:Ignorable="w14 wp14">
+<w:ftr xmlns:wpc="http://schemas.microsoft.com/office/word/2010/wordprocessingCanvas" xmlns:mc="http://schemas.openxmlformats.org/markup-compatibility/2006" xmlns:o="urn:schemas-microsoft-com:office:office" xmlns:r="http://schemas.openxmlformats.org/officeDocument/2006/relationships" xmlns:m="http://schemas.openxmlformats.org/officeDocument/2006/math" xmlns:v="urn:schemas-microsoft-com:vml" xmlns:wp14="http://schemas.microsoft.com/office/word/2010/wordprocessingDrawing" xmlns:wp="http://schemas.openxmlformats.org/drawingml/2006/wordprocessingDrawing" xmlns:w10="urn:schemas-microsoft-com:office:word" xmlns:w="http://schemas.openxmlformats.org/wordprocessingml/2006/main" xmlns:w14="http://schemas.microsoft.com/office/word/2010/wordml" xmlns:w15="http://schemas.microsoft.com/office/word/2012/wordml" xmlns:wpg="http://schemas.microsoft.com/office/word/2010/wordprocessingGroup" xmlns:wpi="http://schemas.microsoft.com/office/word/2010/wordprocessingInk" xmlns:wne="http://schemas.microsoft.com/office/word/2006/wordml" xmlns:wps="http://schemas.microsoft.com/office/word/2010/wordprocessingShape" mc:Ignorable="w14 w15 wp14">
   <w:sdt>
     <w:sdtPr>
       <w:id w:val="171691311"/>
@@ -1541,7 +1878,7 @@
     <w:sdtContent>
       <w:p>
         <w:pPr>
-          <w:pStyle w:val="Footer"/>
+          <w:pStyle w:val="Piedepgina"/>
         </w:pPr>
         <w:r>
           <w:fldChar w:fldCharType="begin"/>
@@ -1556,7 +1893,7 @@
           <w:rPr>
             <w:noProof/>
           </w:rPr>
-          <w:t>1</w:t>
+          <w:t>5</w:t>
         </w:r>
         <w:r>
           <w:rPr>
@@ -1569,24 +1906,24 @@
   </w:sdt>
   <w:p>
     <w:pPr>
-      <w:pStyle w:val="Footer"/>
+      <w:pStyle w:val="Piedepgina"/>
     </w:pPr>
   </w:p>
 </w:ftr>
 </file>
 
 <file path=word/footer3.xml><?xml version="1.0" encoding="utf-8"?>
-<w:ftr xmlns:wpc="http://schemas.microsoft.com/office/word/2010/wordprocessingCanvas" xmlns:mc="http://schemas.openxmlformats.org/markup-compatibility/2006" xmlns:o="urn:schemas-microsoft-com:office:office" xmlns:r="http://schemas.openxmlformats.org/officeDocument/2006/relationships" xmlns:m="http://schemas.openxmlformats.org/officeDocument/2006/math" xmlns:v="urn:schemas-microsoft-com:vml" xmlns:wp14="http://schemas.microsoft.com/office/word/2010/wordprocessingDrawing" xmlns:wp="http://schemas.openxmlformats.org/drawingml/2006/wordprocessingDrawing" xmlns:w10="urn:schemas-microsoft-com:office:word" xmlns:w="http://schemas.openxmlformats.org/wordprocessingml/2006/main" xmlns:w14="http://schemas.microsoft.com/office/word/2010/wordml" xmlns:wpg="http://schemas.microsoft.com/office/word/2010/wordprocessingGroup" xmlns:wpi="http://schemas.microsoft.com/office/word/2010/wordprocessingInk" xmlns:wne="http://schemas.microsoft.com/office/word/2006/wordml" xmlns:wps="http://schemas.microsoft.com/office/word/2010/wordprocessingShape" mc:Ignorable="w14 wp14">
+<w:ftr xmlns:wpc="http://schemas.microsoft.com/office/word/2010/wordprocessingCanvas" xmlns:mc="http://schemas.openxmlformats.org/markup-compatibility/2006" xmlns:o="urn:schemas-microsoft-com:office:office" xmlns:r="http://schemas.openxmlformats.org/officeDocument/2006/relationships" xmlns:m="http://schemas.openxmlformats.org/officeDocument/2006/math" xmlns:v="urn:schemas-microsoft-com:vml" xmlns:wp14="http://schemas.microsoft.com/office/word/2010/wordprocessingDrawing" xmlns:wp="http://schemas.openxmlformats.org/drawingml/2006/wordprocessingDrawing" xmlns:w10="urn:schemas-microsoft-com:office:word" xmlns:w="http://schemas.openxmlformats.org/wordprocessingml/2006/main" xmlns:w14="http://schemas.microsoft.com/office/word/2010/wordml" xmlns:w15="http://schemas.microsoft.com/office/word/2012/wordml" xmlns:wpg="http://schemas.microsoft.com/office/word/2010/wordprocessingGroup" xmlns:wpi="http://schemas.microsoft.com/office/word/2010/wordprocessingInk" xmlns:wne="http://schemas.microsoft.com/office/word/2006/wordml" xmlns:wps="http://schemas.microsoft.com/office/word/2010/wordprocessingShape" mc:Ignorable="w14 w15 wp14">
   <w:p>
     <w:pPr>
-      <w:pStyle w:val="Footer"/>
+      <w:pStyle w:val="Piedepgina"/>
     </w:pPr>
   </w:p>
 </w:ftr>
 </file>
 
 <file path=word/footnotes.xml><?xml version="1.0" encoding="utf-8"?>
-<w:footnotes xmlns:wpc="http://schemas.microsoft.com/office/word/2010/wordprocessingCanvas" xmlns:mc="http://schemas.openxmlformats.org/markup-compatibility/2006" xmlns:o="urn:schemas-microsoft-com:office:office" xmlns:r="http://schemas.openxmlformats.org/officeDocument/2006/relationships" xmlns:m="http://schemas.openxmlformats.org/officeDocument/2006/math" xmlns:v="urn:schemas-microsoft-com:vml" xmlns:wp14="http://schemas.microsoft.com/office/word/2010/wordprocessingDrawing" xmlns:wp="http://schemas.openxmlformats.org/drawingml/2006/wordprocessingDrawing" xmlns:w10="urn:schemas-microsoft-com:office:word" xmlns:w="http://schemas.openxmlformats.org/wordprocessingml/2006/main" xmlns:w14="http://schemas.microsoft.com/office/word/2010/wordml" xmlns:wpg="http://schemas.microsoft.com/office/word/2010/wordprocessingGroup" xmlns:wpi="http://schemas.microsoft.com/office/word/2010/wordprocessingInk" xmlns:wne="http://schemas.microsoft.com/office/word/2006/wordml" xmlns:wps="http://schemas.microsoft.com/office/word/2010/wordprocessingShape" mc:Ignorable="w14 wp14">
+<w:footnotes xmlns:wpc="http://schemas.microsoft.com/office/word/2010/wordprocessingCanvas" xmlns:mc="http://schemas.openxmlformats.org/markup-compatibility/2006" xmlns:o="urn:schemas-microsoft-com:office:office" xmlns:r="http://schemas.openxmlformats.org/officeDocument/2006/relationships" xmlns:m="http://schemas.openxmlformats.org/officeDocument/2006/math" xmlns:v="urn:schemas-microsoft-com:vml" xmlns:wp14="http://schemas.microsoft.com/office/word/2010/wordprocessingDrawing" xmlns:wp="http://schemas.openxmlformats.org/drawingml/2006/wordprocessingDrawing" xmlns:w10="urn:schemas-microsoft-com:office:word" xmlns:w="http://schemas.openxmlformats.org/wordprocessingml/2006/main" xmlns:w14="http://schemas.microsoft.com/office/word/2010/wordml" xmlns:w15="http://schemas.microsoft.com/office/word/2012/wordml" xmlns:wpg="http://schemas.microsoft.com/office/word/2010/wordprocessingGroup" xmlns:wpi="http://schemas.microsoft.com/office/word/2010/wordprocessingInk" xmlns:wne="http://schemas.microsoft.com/office/word/2006/wordml" xmlns:wps="http://schemas.microsoft.com/office/word/2010/wordprocessingShape" mc:Ignorable="w14 w15 wp14">
   <w:footnote w:type="separator" w:id="-1">
     <w:p>
       <w:pPr>
@@ -1611,16 +1948,16 @@
 </file>
 
 <file path=word/header1.xml><?xml version="1.0" encoding="utf-8"?>
-<w:hdr xmlns:wpc="http://schemas.microsoft.com/office/word/2010/wordprocessingCanvas" xmlns:mc="http://schemas.openxmlformats.org/markup-compatibility/2006" xmlns:o="urn:schemas-microsoft-com:office:office" xmlns:r="http://schemas.openxmlformats.org/officeDocument/2006/relationships" xmlns:m="http://schemas.openxmlformats.org/officeDocument/2006/math" xmlns:v="urn:schemas-microsoft-com:vml" xmlns:wp14="http://schemas.microsoft.com/office/word/2010/wordprocessingDrawing" xmlns:wp="http://schemas.openxmlformats.org/drawingml/2006/wordprocessingDrawing" xmlns:w10="urn:schemas-microsoft-com:office:word" xmlns:w="http://schemas.openxmlformats.org/wordprocessingml/2006/main" xmlns:w14="http://schemas.microsoft.com/office/word/2010/wordml" xmlns:wpg="http://schemas.microsoft.com/office/word/2010/wordprocessingGroup" xmlns:wpi="http://schemas.microsoft.com/office/word/2010/wordprocessingInk" xmlns:wne="http://schemas.microsoft.com/office/word/2006/wordml" xmlns:wps="http://schemas.microsoft.com/office/word/2010/wordprocessingShape" mc:Ignorable="w14 wp14">
+<w:hdr xmlns:wpc="http://schemas.microsoft.com/office/word/2010/wordprocessingCanvas" xmlns:mc="http://schemas.openxmlformats.org/markup-compatibility/2006" xmlns:o="urn:schemas-microsoft-com:office:office" xmlns:r="http://schemas.openxmlformats.org/officeDocument/2006/relationships" xmlns:m="http://schemas.openxmlformats.org/officeDocument/2006/math" xmlns:v="urn:schemas-microsoft-com:vml" xmlns:wp14="http://schemas.microsoft.com/office/word/2010/wordprocessingDrawing" xmlns:wp="http://schemas.openxmlformats.org/drawingml/2006/wordprocessingDrawing" xmlns:w10="urn:schemas-microsoft-com:office:word" xmlns:w="http://schemas.openxmlformats.org/wordprocessingml/2006/main" xmlns:w14="http://schemas.microsoft.com/office/word/2010/wordml" xmlns:w15="http://schemas.microsoft.com/office/word/2012/wordml" xmlns:wpg="http://schemas.microsoft.com/office/word/2010/wordprocessingGroup" xmlns:wpi="http://schemas.microsoft.com/office/word/2010/wordprocessingInk" xmlns:wne="http://schemas.microsoft.com/office/word/2006/wordml" xmlns:wps="http://schemas.microsoft.com/office/word/2010/wordprocessingShape" mc:Ignorable="w14 w15 wp14">
   <w:p>
     <w:pPr>
-      <w:pStyle w:val="Header"/>
+      <w:pStyle w:val="Encabezado"/>
     </w:pPr>
     <w:r>
       <w:rPr>
         <w:noProof/>
       </w:rPr>
-      <w:pict>
+      <w:pict w14:anchorId="67E03EA0">
         <v:shapetype id="_x0000_t136" coordsize="21600,21600" o:spt="136" adj="10800" path="m@7,l@8,m@5,21600l@6,21600e">
           <v:formulas>
             <v:f eqn="sum #0 0 10800"/>
@@ -1657,37 +1994,10 @@
 </file>
 
 <file path=word/header2.xml><?xml version="1.0" encoding="utf-8"?>
-<w:hdr xmlns:wpc="http://schemas.microsoft.com/office/word/2010/wordprocessingCanvas" xmlns:mc="http://schemas.openxmlformats.org/markup-compatibility/2006" xmlns:o="urn:schemas-microsoft-com:office:office" xmlns:r="http://schemas.openxmlformats.org/officeDocument/2006/relationships" xmlns:m="http://schemas.openxmlformats.org/officeDocument/2006/math" xmlns:v="urn:schemas-microsoft-com:vml" xmlns:wp14="http://schemas.microsoft.com/office/word/2010/wordprocessingDrawing" xmlns:wp="http://schemas.openxmlformats.org/drawingml/2006/wordprocessingDrawing" xmlns:w10="urn:schemas-microsoft-com:office:word" xmlns:w="http://schemas.openxmlformats.org/wordprocessingml/2006/main" xmlns:w14="http://schemas.microsoft.com/office/word/2010/wordml" xmlns:wpg="http://schemas.microsoft.com/office/word/2010/wordprocessingGroup" xmlns:wpi="http://schemas.microsoft.com/office/word/2010/wordprocessingInk" xmlns:wne="http://schemas.microsoft.com/office/word/2006/wordml" xmlns:wps="http://schemas.microsoft.com/office/word/2010/wordprocessingShape" mc:Ignorable="w14 wp14">
+<w:hdr xmlns:wpc="http://schemas.microsoft.com/office/word/2010/wordprocessingCanvas" xmlns:mc="http://schemas.openxmlformats.org/markup-compatibility/2006" xmlns:o="urn:schemas-microsoft-com:office:office" xmlns:r="http://schemas.openxmlformats.org/officeDocument/2006/relationships" xmlns:m="http://schemas.openxmlformats.org/officeDocument/2006/math" xmlns:v="urn:schemas-microsoft-com:vml" xmlns:wp14="http://schemas.microsoft.com/office/word/2010/wordprocessingDrawing" xmlns:wp="http://schemas.openxmlformats.org/drawingml/2006/wordprocessingDrawing" xmlns:w10="urn:schemas-microsoft-com:office:word" xmlns:w="http://schemas.openxmlformats.org/wordprocessingml/2006/main" xmlns:w14="http://schemas.microsoft.com/office/word/2010/wordml" xmlns:w15="http://schemas.microsoft.com/office/word/2012/wordml" xmlns:wpg="http://schemas.microsoft.com/office/word/2010/wordprocessingGroup" xmlns:wpi="http://schemas.microsoft.com/office/word/2010/wordprocessingInk" xmlns:wne="http://schemas.microsoft.com/office/word/2006/wordml" xmlns:wps="http://schemas.microsoft.com/office/word/2010/wordprocessingShape" mc:Ignorable="w14 w15 wp14">
   <w:p>
     <w:pPr>
-      <w:pStyle w:val="Header"/>
-      <w:jc w:val="right"/>
-    </w:pPr>
-    <w:r>
-      <w:t>Borrador sujeto a cambios</w:t>
-    </w:r>
-  </w:p>
-  <w:p>
-    <w:pPr>
-      <w:pStyle w:val="Header"/>
-      <w:jc w:val="right"/>
-    </w:pPr>
-    <w:r>
-      <w:t>0</w:t>
-    </w:r>
-    <w:r>
-      <w:t>5</w:t>
-    </w:r>
-    <w:r>
-      <w:t>.09</w:t>
-    </w:r>
-    <w:r>
-      <w:t>.2017</w:t>
-    </w:r>
-  </w:p>
-  <w:p>
-    <w:pPr>
-      <w:pStyle w:val="Header"/>
+      <w:pStyle w:val="Encabezado"/>
       <w:jc w:val="right"/>
     </w:pPr>
     <w:r>
@@ -1701,13 +2011,13 @@
   </w:p>
   <w:p>
     <w:pPr>
-      <w:pStyle w:val="Header"/>
+      <w:pStyle w:val="Encabezado"/>
       <w:jc w:val="right"/>
     </w:pPr>
   </w:p>
   <w:p>
     <w:pPr>
-      <w:pStyle w:val="Header"/>
+      <w:pStyle w:val="Encabezado"/>
       <w:jc w:val="right"/>
     </w:pPr>
     <w:r>
@@ -1761,7 +2071,7 @@
   </w:p>
   <w:p>
     <w:pPr>
-      <w:pStyle w:val="Header"/>
+      <w:pStyle w:val="Encabezado"/>
       <w:jc w:val="right"/>
     </w:pPr>
   </w:p>
@@ -1769,16 +2079,16 @@
 </file>
 
 <file path=word/header3.xml><?xml version="1.0" encoding="utf-8"?>
-<w:hdr xmlns:wpc="http://schemas.microsoft.com/office/word/2010/wordprocessingCanvas" xmlns:mc="http://schemas.openxmlformats.org/markup-compatibility/2006" xmlns:o="urn:schemas-microsoft-com:office:office" xmlns:r="http://schemas.openxmlformats.org/officeDocument/2006/relationships" xmlns:m="http://schemas.openxmlformats.org/officeDocument/2006/math" xmlns:v="urn:schemas-microsoft-com:vml" xmlns:wp14="http://schemas.microsoft.com/office/word/2010/wordprocessingDrawing" xmlns:wp="http://schemas.openxmlformats.org/drawingml/2006/wordprocessingDrawing" xmlns:w10="urn:schemas-microsoft-com:office:word" xmlns:w="http://schemas.openxmlformats.org/wordprocessingml/2006/main" xmlns:w14="http://schemas.microsoft.com/office/word/2010/wordml" xmlns:wpg="http://schemas.microsoft.com/office/word/2010/wordprocessingGroup" xmlns:wpi="http://schemas.microsoft.com/office/word/2010/wordprocessingInk" xmlns:wne="http://schemas.microsoft.com/office/word/2006/wordml" xmlns:wps="http://schemas.microsoft.com/office/word/2010/wordprocessingShape" mc:Ignorable="w14 wp14">
+<w:hdr xmlns:wpc="http://schemas.microsoft.com/office/word/2010/wordprocessingCanvas" xmlns:mc="http://schemas.openxmlformats.org/markup-compatibility/2006" xmlns:o="urn:schemas-microsoft-com:office:office" xmlns:r="http://schemas.openxmlformats.org/officeDocument/2006/relationships" xmlns:m="http://schemas.openxmlformats.org/officeDocument/2006/math" xmlns:v="urn:schemas-microsoft-com:vml" xmlns:wp14="http://schemas.microsoft.com/office/word/2010/wordprocessingDrawing" xmlns:wp="http://schemas.openxmlformats.org/drawingml/2006/wordprocessingDrawing" xmlns:w10="urn:schemas-microsoft-com:office:word" xmlns:w="http://schemas.openxmlformats.org/wordprocessingml/2006/main" xmlns:w14="http://schemas.microsoft.com/office/word/2010/wordml" xmlns:w15="http://schemas.microsoft.com/office/word/2012/wordml" xmlns:wpg="http://schemas.microsoft.com/office/word/2010/wordprocessingGroup" xmlns:wpi="http://schemas.microsoft.com/office/word/2010/wordprocessingInk" xmlns:wne="http://schemas.microsoft.com/office/word/2006/wordml" xmlns:wps="http://schemas.microsoft.com/office/word/2010/wordprocessingShape" mc:Ignorable="w14 w15 wp14">
   <w:p>
     <w:pPr>
-      <w:pStyle w:val="Header"/>
+      <w:pStyle w:val="Encabezado"/>
     </w:pPr>
     <w:r>
       <w:rPr>
         <w:noProof/>
       </w:rPr>
-      <w:pict>
+      <w:pict w14:anchorId="3DC3127C">
         <v:shapetype id="_x0000_t136" coordsize="21600,21600" o:spt="136" adj="10800" path="m@7,l@8,m@5,21600l@6,21600e">
           <v:formulas>
             <v:f eqn="sum #0 0 10800"/>
@@ -1815,15 +2125,15 @@
 </file>
 
 <file path=word/numbering.xml><?xml version="1.0" encoding="utf-8"?>
-<w:numbering xmlns:wpc="http://schemas.microsoft.com/office/word/2010/wordprocessingCanvas" xmlns:mc="http://schemas.openxmlformats.org/markup-compatibility/2006" xmlns:o="urn:schemas-microsoft-com:office:office" xmlns:r="http://schemas.openxmlformats.org/officeDocument/2006/relationships" xmlns:m="http://schemas.openxmlformats.org/officeDocument/2006/math" xmlns:v="urn:schemas-microsoft-com:vml" xmlns:wp14="http://schemas.microsoft.com/office/word/2010/wordprocessingDrawing" xmlns:wp="http://schemas.openxmlformats.org/drawingml/2006/wordprocessingDrawing" xmlns:w10="urn:schemas-microsoft-com:office:word" xmlns:w="http://schemas.openxmlformats.org/wordprocessingml/2006/main" xmlns:w14="http://schemas.microsoft.com/office/word/2010/wordml" xmlns:wpg="http://schemas.microsoft.com/office/word/2010/wordprocessingGroup" xmlns:wpi="http://schemas.microsoft.com/office/word/2010/wordprocessingInk" xmlns:wne="http://schemas.microsoft.com/office/word/2006/wordml" xmlns:wps="http://schemas.microsoft.com/office/word/2010/wordprocessingShape" mc:Ignorable="w14 wp14">
-  <w:abstractNum w:abstractNumId="0">
+<w:numbering xmlns:wpc="http://schemas.microsoft.com/office/word/2010/wordprocessingCanvas" xmlns:mc="http://schemas.openxmlformats.org/markup-compatibility/2006" xmlns:o="urn:schemas-microsoft-com:office:office" xmlns:r="http://schemas.openxmlformats.org/officeDocument/2006/relationships" xmlns:m="http://schemas.openxmlformats.org/officeDocument/2006/math" xmlns:v="urn:schemas-microsoft-com:vml" xmlns:wp14="http://schemas.microsoft.com/office/word/2010/wordprocessingDrawing" xmlns:wp="http://schemas.openxmlformats.org/drawingml/2006/wordprocessingDrawing" xmlns:w10="urn:schemas-microsoft-com:office:word" xmlns:w="http://schemas.openxmlformats.org/wordprocessingml/2006/main" xmlns:w14="http://schemas.microsoft.com/office/word/2010/wordml" xmlns:w15="http://schemas.microsoft.com/office/word/2012/wordml" xmlns:wpg="http://schemas.microsoft.com/office/word/2010/wordprocessingGroup" xmlns:wpi="http://schemas.microsoft.com/office/word/2010/wordprocessingInk" xmlns:wne="http://schemas.microsoft.com/office/word/2006/wordml" xmlns:wps="http://schemas.microsoft.com/office/word/2010/wordprocessingShape" mc:Ignorable="w14 w15 wp14">
+  <w:abstractNum w:abstractNumId="0" w15:restartNumberingAfterBreak="0">
     <w:nsid w:val="FFFFFF7E"/>
     <w:multiLevelType w:val="singleLevel"/>
     <w:tmpl w:val="D5A491D8"/>
     <w:lvl w:ilvl="0">
       <w:start w:val="1"/>
       <w:numFmt w:val="decimal"/>
-      <w:pStyle w:val="ListNumber3"/>
+      <w:pStyle w:val="Listaconnmeros3"/>
       <w:lvlText w:val="%1."/>
       <w:lvlJc w:val="left"/>
       <w:pPr>
@@ -1834,7 +2144,7 @@
       </w:pPr>
     </w:lvl>
   </w:abstractNum>
-  <w:abstractNum w:abstractNumId="1">
+  <w:abstractNum w:abstractNumId="1" w15:restartNumberingAfterBreak="0">
     <w:nsid w:val="2B12195A"/>
     <w:multiLevelType w:val="multilevel"/>
     <w:tmpl w:val="EFC86C86"/>
@@ -1957,7 +2267,7 @@
       </w:rPr>
     </w:lvl>
   </w:abstractNum>
-  <w:abstractNum w:abstractNumId="2">
+  <w:abstractNum w:abstractNumId="2" w15:restartNumberingAfterBreak="0">
     <w:nsid w:val="543D6460"/>
     <w:multiLevelType w:val="hybridMultilevel"/>
     <w:tmpl w:val="0D584874"/>
@@ -2070,7 +2380,7 @@
       </w:rPr>
     </w:lvl>
   </w:abstractNum>
-  <w:abstractNum w:abstractNumId="3">
+  <w:abstractNum w:abstractNumId="3" w15:restartNumberingAfterBreak="0">
     <w:nsid w:val="68DF1086"/>
     <w:multiLevelType w:val="multilevel"/>
     <w:tmpl w:val="0424577A"/>
@@ -2190,7 +2500,7 @@
       </w:pPr>
     </w:lvl>
   </w:abstractNum>
-  <w:abstractNum w:abstractNumId="4">
+  <w:abstractNum w:abstractNumId="4" w15:restartNumberingAfterBreak="0">
     <w:nsid w:val="6E5A37DF"/>
     <w:multiLevelType w:val="multilevel"/>
     <w:tmpl w:val="F93C2F06"/>
@@ -2225,7 +2535,7 @@
     <w:lvl w:ilvl="2">
       <w:start w:val="1"/>
       <w:numFmt w:val="decimal"/>
-      <w:pStyle w:val="ListParagraph"/>
+      <w:pStyle w:val="Prrafodelista"/>
       <w:isLgl/>
       <w:lvlText w:val="%1.%2.%3."/>
       <w:lvlJc w:val="left"/>
@@ -2534,20 +2844,15 @@
   <w:num w:numId="73">
     <w:abstractNumId w:val="4"/>
   </w:num>
+  <w:num w:numId="74">
+    <w:abstractNumId w:val="4"/>
+  </w:num>
   <w:numIdMacAtCleanup w:val="73"/>
 </w:numbering>
 </file>
 
-<file path=word/people.xml><?xml version="1.0" encoding="utf-8"?>
-<w15:people xmlns:wpc="http://schemas.microsoft.com/office/word/2010/wordprocessingCanvas" xmlns:cx="http://schemas.microsoft.com/office/drawing/2014/chartex" xmlns:cx1="http://schemas.microsoft.com/office/drawing/2015/9/8/chartex" xmlns:cx2="http://schemas.microsoft.com/office/drawing/2015/10/21/chartex" xmlns:cx3="http://schemas.microsoft.com/office/drawing/2016/5/9/chartex" xmlns:cx4="http://schemas.microsoft.com/office/drawing/2016/5/10/chartex" xmlns:cx5="http://schemas.microsoft.com/office/drawing/2016/5/11/chartex" xmlns:cx6="http://schemas.microsoft.com/office/drawing/2016/5/12/chartex" xmlns:cx7="http://schemas.microsoft.com/office/drawing/2016/5/13/chartex" xmlns:cx8="http://schemas.microsoft.com/office/drawing/2016/5/14/chartex" xmlns:mc="http://schemas.openxmlformats.org/markup-compatibility/2006" xmlns:aink="http://schemas.microsoft.com/office/drawing/2016/ink" xmlns:am3d="http://schemas.microsoft.com/office/drawing/2017/model3d" xmlns:o="urn:schemas-microsoft-com:office:office" xmlns:r="http://schemas.openxmlformats.org/officeDocument/2006/relationships" xmlns:m="http://schemas.openxmlformats.org/officeDocument/2006/math" xmlns:v="urn:schemas-microsoft-com:vml" xmlns:wp14="http://schemas.microsoft.com/office/word/2010/wordprocessingDrawing" xmlns:wp="http://schemas.openxmlformats.org/drawingml/2006/wordprocessingDrawing" xmlns:w10="urn:schemas-microsoft-com:office:word" xmlns:w="http://schemas.openxmlformats.org/wordprocessingml/2006/main" xmlns:w14="http://schemas.microsoft.com/office/word/2010/wordml" xmlns:w15="http://schemas.microsoft.com/office/word/2012/wordml" xmlns:w16cid="http://schemas.microsoft.com/office/word/2016/wordml/cid" xmlns:w16se="http://schemas.microsoft.com/office/word/2015/wordml/symex" xmlns:wpg="http://schemas.microsoft.com/office/word/2010/wordprocessingGroup" xmlns:wpi="http://schemas.microsoft.com/office/word/2010/wordprocessingInk" xmlns:wne="http://schemas.microsoft.com/office/word/2006/wordml" xmlns:wps="http://schemas.microsoft.com/office/word/2010/wordprocessingShape" mc:Ignorable="w14 w15 w16se w16cid wp14">
-  <w15:person w15:author="Miguel Valdés Borruey">
-    <w15:presenceInfo w15:providerId="None" w15:userId="Miguel Valdés Borruey"/>
-  </w15:person>
-</w15:people>
-</file>
-
 <file path=word/styles.xml><?xml version="1.0" encoding="utf-8"?>
-<w:styles xmlns:mc="http://schemas.openxmlformats.org/markup-compatibility/2006" xmlns:r="http://schemas.openxmlformats.org/officeDocument/2006/relationships" xmlns:w="http://schemas.openxmlformats.org/wordprocessingml/2006/main" xmlns:w14="http://schemas.microsoft.com/office/word/2010/wordml" mc:Ignorable="w14">
+<w:styles xmlns:mc="http://schemas.openxmlformats.org/markup-compatibility/2006" xmlns:r="http://schemas.openxmlformats.org/officeDocument/2006/relationships" xmlns:w="http://schemas.openxmlformats.org/wordprocessingml/2006/main" xmlns:w14="http://schemas.microsoft.com/office/word/2010/wordml" xmlns:w15="http://schemas.microsoft.com/office/word/2012/wordml" mc:Ignorable="w14 w15">
   <w:docDefaults>
     <w:rPrDefault>
       <w:rPr>
@@ -2562,144 +2867,378 @@
       </w:pPr>
     </w:pPrDefault>
   </w:docDefaults>
-  <w:latentStyles w:defLockedState="0" w:defUIPriority="99" w:defSemiHidden="1" w:defUnhideWhenUsed="1" w:defQFormat="0" w:count="267">
-    <w:lsdException w:name="Normal" w:semiHidden="0" w:uiPriority="0" w:unhideWhenUsed="0" w:qFormat="1"/>
-    <w:lsdException w:name="heading 1" w:semiHidden="0" w:uiPriority="9" w:unhideWhenUsed="0" w:qFormat="1"/>
-    <w:lsdException w:name="heading 2" w:uiPriority="9" w:qFormat="1"/>
-    <w:lsdException w:name="heading 3" w:uiPriority="9" w:qFormat="1"/>
-    <w:lsdException w:name="heading 4" w:uiPriority="9" w:qFormat="1"/>
-    <w:lsdException w:name="heading 5" w:uiPriority="9" w:qFormat="1"/>
-    <w:lsdException w:name="heading 6" w:uiPriority="9" w:qFormat="1"/>
-    <w:lsdException w:name="heading 7" w:uiPriority="9" w:qFormat="1"/>
-    <w:lsdException w:name="heading 8" w:uiPriority="9" w:qFormat="1"/>
-    <w:lsdException w:name="heading 9" w:uiPriority="9" w:qFormat="1"/>
-    <w:lsdException w:name="toc 1" w:uiPriority="39"/>
-    <w:lsdException w:name="toc 2" w:uiPriority="39"/>
-    <w:lsdException w:name="toc 3" w:uiPriority="39"/>
-    <w:lsdException w:name="toc 4" w:uiPriority="39"/>
-    <w:lsdException w:name="toc 5" w:uiPriority="39"/>
-    <w:lsdException w:name="toc 6" w:uiPriority="39"/>
-    <w:lsdException w:name="toc 7" w:uiPriority="39"/>
-    <w:lsdException w:name="toc 8" w:uiPriority="39"/>
-    <w:lsdException w:name="toc 9" w:uiPriority="39"/>
-    <w:lsdException w:name="caption" w:uiPriority="35" w:qFormat="1"/>
-    <w:lsdException w:name="Title" w:semiHidden="0" w:uiPriority="10" w:unhideWhenUsed="0" w:qFormat="1"/>
-    <w:lsdException w:name="Default Paragraph Font" w:uiPriority="1"/>
-    <w:lsdException w:name="Subtitle" w:semiHidden="0" w:uiPriority="11" w:unhideWhenUsed="0" w:qFormat="1"/>
-    <w:lsdException w:name="Strong" w:semiHidden="0" w:uiPriority="22" w:unhideWhenUsed="0" w:qFormat="1"/>
-    <w:lsdException w:name="Emphasis" w:semiHidden="0" w:uiPriority="20" w:unhideWhenUsed="0" w:qFormat="1"/>
-    <w:lsdException w:name="Table Grid" w:semiHidden="0" w:uiPriority="59" w:unhideWhenUsed="0"/>
-    <w:lsdException w:name="Placeholder Text" w:unhideWhenUsed="0"/>
-    <w:lsdException w:name="No Spacing" w:semiHidden="0" w:uiPriority="1" w:unhideWhenUsed="0" w:qFormat="1"/>
-    <w:lsdException w:name="Light Shading" w:semiHidden="0" w:uiPriority="60" w:unhideWhenUsed="0"/>
-    <w:lsdException w:name="Light List" w:semiHidden="0" w:uiPriority="61" w:unhideWhenUsed="0"/>
-    <w:lsdException w:name="Light Grid" w:semiHidden="0" w:uiPriority="62" w:unhideWhenUsed="0"/>
-    <w:lsdException w:name="Medium Shading 1" w:semiHidden="0" w:uiPriority="63" w:unhideWhenUsed="0"/>
-    <w:lsdException w:name="Medium Shading 2" w:semiHidden="0" w:uiPriority="64" w:unhideWhenUsed="0"/>
-    <w:lsdException w:name="Medium List 1" w:semiHidden="0" w:uiPriority="65" w:unhideWhenUsed="0"/>
-    <w:lsdException w:name="Medium List 2" w:semiHidden="0" w:uiPriority="66" w:unhideWhenUsed="0"/>
-    <w:lsdException w:name="Medium Grid 1" w:semiHidden="0" w:uiPriority="67" w:unhideWhenUsed="0"/>
-    <w:lsdException w:name="Medium Grid 2" w:semiHidden="0" w:uiPriority="68" w:unhideWhenUsed="0"/>
-    <w:lsdException w:name="Medium Grid 3" w:semiHidden="0" w:uiPriority="69" w:unhideWhenUsed="0"/>
-    <w:lsdException w:name="Dark List" w:semiHidden="0" w:uiPriority="70" w:unhideWhenUsed="0"/>
-    <w:lsdException w:name="Colorful Shading" w:semiHidden="0" w:uiPriority="71" w:unhideWhenUsed="0"/>
-    <w:lsdException w:name="Colorful List" w:semiHidden="0" w:uiPriority="72" w:unhideWhenUsed="0"/>
-    <w:lsdException w:name="Colorful Grid" w:semiHidden="0" w:uiPriority="73" w:unhideWhenUsed="0"/>
-    <w:lsdException w:name="Light Shading Accent 1" w:semiHidden="0" w:uiPriority="60" w:unhideWhenUsed="0"/>
-    <w:lsdException w:name="Light List Accent 1" w:semiHidden="0" w:uiPriority="61" w:unhideWhenUsed="0"/>
-    <w:lsdException w:name="Light Grid Accent 1" w:semiHidden="0" w:uiPriority="62" w:unhideWhenUsed="0"/>
-    <w:lsdException w:name="Medium Shading 1 Accent 1" w:semiHidden="0" w:uiPriority="63" w:unhideWhenUsed="0"/>
-    <w:lsdException w:name="Medium Shading 2 Accent 1" w:semiHidden="0" w:uiPriority="64" w:unhideWhenUsed="0"/>
-    <w:lsdException w:name="Medium List 1 Accent 1" w:semiHidden="0" w:uiPriority="65" w:unhideWhenUsed="0"/>
-    <w:lsdException w:name="Revision" w:unhideWhenUsed="0"/>
-    <w:lsdException w:name="List Paragraph" w:semiHidden="0" w:uiPriority="34" w:unhideWhenUsed="0" w:qFormat="1"/>
-    <w:lsdException w:name="Quote" w:semiHidden="0" w:uiPriority="29" w:unhideWhenUsed="0" w:qFormat="1"/>
-    <w:lsdException w:name="Intense Quote" w:semiHidden="0" w:uiPriority="30" w:unhideWhenUsed="0" w:qFormat="1"/>
-    <w:lsdException w:name="Medium List 2 Accent 1" w:semiHidden="0" w:uiPriority="66" w:unhideWhenUsed="0"/>
-    <w:lsdException w:name="Medium Grid 1 Accent 1" w:semiHidden="0" w:uiPriority="67" w:unhideWhenUsed="0"/>
-    <w:lsdException w:name="Medium Grid 2 Accent 1" w:semiHidden="0" w:uiPriority="68" w:unhideWhenUsed="0"/>
-    <w:lsdException w:name="Medium Grid 3 Accent 1" w:semiHidden="0" w:uiPriority="69" w:unhideWhenUsed="0"/>
-    <w:lsdException w:name="Dark List Accent 1" w:semiHidden="0" w:uiPriority="70" w:unhideWhenUsed="0"/>
-    <w:lsdException w:name="Colorful Shading Accent 1" w:semiHidden="0" w:uiPriority="71" w:unhideWhenUsed="0"/>
-    <w:lsdException w:name="Colorful List Accent 1" w:semiHidden="0" w:uiPriority="72" w:unhideWhenUsed="0"/>
-    <w:lsdException w:name="Colorful Grid Accent 1" w:semiHidden="0" w:uiPriority="73" w:unhideWhenUsed="0"/>
-    <w:lsdException w:name="Light Shading Accent 2" w:semiHidden="0" w:uiPriority="60" w:unhideWhenUsed="0"/>
-    <w:lsdException w:name="Light List Accent 2" w:semiHidden="0" w:uiPriority="61" w:unhideWhenUsed="0"/>
-    <w:lsdException w:name="Light Grid Accent 2" w:semiHidden="0" w:uiPriority="62" w:unhideWhenUsed="0"/>
-    <w:lsdException w:name="Medium Shading 1 Accent 2" w:semiHidden="0" w:uiPriority="63" w:unhideWhenUsed="0"/>
-    <w:lsdException w:name="Medium Shading 2 Accent 2" w:semiHidden="0" w:uiPriority="64" w:unhideWhenUsed="0"/>
-    <w:lsdException w:name="Medium List 1 Accent 2" w:semiHidden="0" w:uiPriority="65" w:unhideWhenUsed="0"/>
-    <w:lsdException w:name="Medium List 2 Accent 2" w:semiHidden="0" w:uiPriority="66" w:unhideWhenUsed="0"/>
-    <w:lsdException w:name="Medium Grid 1 Accent 2" w:semiHidden="0" w:uiPriority="67" w:unhideWhenUsed="0"/>
-    <w:lsdException w:name="Medium Grid 2 Accent 2" w:semiHidden="0" w:uiPriority="68" w:unhideWhenUsed="0"/>
-    <w:lsdException w:name="Medium Grid 3 Accent 2" w:semiHidden="0" w:uiPriority="69" w:unhideWhenUsed="0"/>
-    <w:lsdException w:name="Dark List Accent 2" w:semiHidden="0" w:uiPriority="70" w:unhideWhenUsed="0"/>
-    <w:lsdException w:name="Colorful Shading Accent 2" w:semiHidden="0" w:uiPriority="71" w:unhideWhenUsed="0"/>
-    <w:lsdException w:name="Colorful List Accent 2" w:semiHidden="0" w:uiPriority="72" w:unhideWhenUsed="0"/>
-    <w:lsdException w:name="Colorful Grid Accent 2" w:semiHidden="0" w:uiPriority="73" w:unhideWhenUsed="0"/>
-    <w:lsdException w:name="Light Shading Accent 3" w:semiHidden="0" w:uiPriority="60" w:unhideWhenUsed="0"/>
-    <w:lsdException w:name="Light List Accent 3" w:semiHidden="0" w:uiPriority="61" w:unhideWhenUsed="0"/>
-    <w:lsdException w:name="Light Grid Accent 3" w:semiHidden="0" w:uiPriority="62" w:unhideWhenUsed="0"/>
-    <w:lsdException w:name="Medium Shading 1 Accent 3" w:semiHidden="0" w:uiPriority="63" w:unhideWhenUsed="0"/>
-    <w:lsdException w:name="Medium Shading 2 Accent 3" w:semiHidden="0" w:uiPriority="64" w:unhideWhenUsed="0"/>
-    <w:lsdException w:name="Medium List 1 Accent 3" w:semiHidden="0" w:uiPriority="65" w:unhideWhenUsed="0"/>
-    <w:lsdException w:name="Medium List 2 Accent 3" w:semiHidden="0" w:uiPriority="66" w:unhideWhenUsed="0"/>
-    <w:lsdException w:name="Medium Grid 1 Accent 3" w:semiHidden="0" w:uiPriority="67" w:unhideWhenUsed="0"/>
-    <w:lsdException w:name="Medium Grid 2 Accent 3" w:semiHidden="0" w:uiPriority="68" w:unhideWhenUsed="0"/>
-    <w:lsdException w:name="Medium Grid 3 Accent 3" w:semiHidden="0" w:uiPriority="69" w:unhideWhenUsed="0"/>
-    <w:lsdException w:name="Dark List Accent 3" w:semiHidden="0" w:uiPriority="70" w:unhideWhenUsed="0"/>
-    <w:lsdException w:name="Colorful Shading Accent 3" w:semiHidden="0" w:uiPriority="71" w:unhideWhenUsed="0"/>
-    <w:lsdException w:name="Colorful List Accent 3" w:semiHidden="0" w:uiPriority="72" w:unhideWhenUsed="0"/>
-    <w:lsdException w:name="Colorful Grid Accent 3" w:semiHidden="0" w:uiPriority="73" w:unhideWhenUsed="0"/>
-    <w:lsdException w:name="Light Shading Accent 4" w:semiHidden="0" w:uiPriority="60" w:unhideWhenUsed="0"/>
-    <w:lsdException w:name="Light List Accent 4" w:semiHidden="0" w:uiPriority="61" w:unhideWhenUsed="0"/>
-    <w:lsdException w:name="Light Grid Accent 4" w:semiHidden="0" w:uiPriority="62" w:unhideWhenUsed="0"/>
-    <w:lsdException w:name="Medium Shading 1 Accent 4" w:semiHidden="0" w:uiPriority="63" w:unhideWhenUsed="0"/>
-    <w:lsdException w:name="Medium Shading 2 Accent 4" w:semiHidden="0" w:uiPriority="64" w:unhideWhenUsed="0"/>
-    <w:lsdException w:name="Medium List 1 Accent 4" w:semiHidden="0" w:uiPriority="65" w:unhideWhenUsed="0"/>
-    <w:lsdException w:name="Medium List 2 Accent 4" w:semiHidden="0" w:uiPriority="66" w:unhideWhenUsed="0"/>
-    <w:lsdException w:name="Medium Grid 1 Accent 4" w:semiHidden="0" w:uiPriority="67" w:unhideWhenUsed="0"/>
-    <w:lsdException w:name="Medium Grid 2 Accent 4" w:semiHidden="0" w:uiPriority="68" w:unhideWhenUsed="0"/>
-    <w:lsdException w:name="Medium Grid 3 Accent 4" w:semiHidden="0" w:uiPriority="69" w:unhideWhenUsed="0"/>
-    <w:lsdException w:name="Dark List Accent 4" w:semiHidden="0" w:uiPriority="70" w:unhideWhenUsed="0"/>
-    <w:lsdException w:name="Colorful Shading Accent 4" w:semiHidden="0" w:uiPriority="71" w:unhideWhenUsed="0"/>
-    <w:lsdException w:name="Colorful List Accent 4" w:semiHidden="0" w:uiPriority="72" w:unhideWhenUsed="0"/>
-    <w:lsdException w:name="Colorful Grid Accent 4" w:semiHidden="0" w:uiPriority="73" w:unhideWhenUsed="0"/>
-    <w:lsdException w:name="Light Shading Accent 5" w:semiHidden="0" w:uiPriority="60" w:unhideWhenUsed="0"/>
-    <w:lsdException w:name="Light List Accent 5" w:semiHidden="0" w:uiPriority="61" w:unhideWhenUsed="0"/>
-    <w:lsdException w:name="Light Grid Accent 5" w:semiHidden="0" w:uiPriority="62" w:unhideWhenUsed="0"/>
-    <w:lsdException w:name="Medium Shading 1 Accent 5" w:semiHidden="0" w:uiPriority="63" w:unhideWhenUsed="0"/>
-    <w:lsdException w:name="Medium Shading 2 Accent 5" w:semiHidden="0" w:uiPriority="64" w:unhideWhenUsed="0"/>
-    <w:lsdException w:name="Medium List 1 Accent 5" w:semiHidden="0" w:uiPriority="65" w:unhideWhenUsed="0"/>
-    <w:lsdException w:name="Medium List 2 Accent 5" w:semiHidden="0" w:uiPriority="66" w:unhideWhenUsed="0"/>
-    <w:lsdException w:name="Medium Grid 1 Accent 5" w:semiHidden="0" w:uiPriority="67" w:unhideWhenUsed="0"/>
-    <w:lsdException w:name="Medium Grid 2 Accent 5" w:semiHidden="0" w:uiPriority="68" w:unhideWhenUsed="0"/>
-    <w:lsdException w:name="Medium Grid 3 Accent 5" w:semiHidden="0" w:uiPriority="69" w:unhideWhenUsed="0"/>
-    <w:lsdException w:name="Dark List Accent 5" w:semiHidden="0" w:uiPriority="70" w:unhideWhenUsed="0"/>
-    <w:lsdException w:name="Colorful Shading Accent 5" w:semiHidden="0" w:uiPriority="71" w:unhideWhenUsed="0"/>
-    <w:lsdException w:name="Colorful List Accent 5" w:semiHidden="0" w:uiPriority="72" w:unhideWhenUsed="0"/>
-    <w:lsdException w:name="Colorful Grid Accent 5" w:semiHidden="0" w:uiPriority="73" w:unhideWhenUsed="0"/>
-    <w:lsdException w:name="Light Shading Accent 6" w:semiHidden="0" w:uiPriority="60" w:unhideWhenUsed="0"/>
-    <w:lsdException w:name="Light List Accent 6" w:semiHidden="0" w:uiPriority="61" w:unhideWhenUsed="0"/>
-    <w:lsdException w:name="Light Grid Accent 6" w:semiHidden="0" w:uiPriority="62" w:unhideWhenUsed="0"/>
-    <w:lsdException w:name="Medium Shading 1 Accent 6" w:semiHidden="0" w:uiPriority="63" w:unhideWhenUsed="0"/>
-    <w:lsdException w:name="Medium Shading 2 Accent 6" w:semiHidden="0" w:uiPriority="64" w:unhideWhenUsed="0"/>
-    <w:lsdException w:name="Medium List 1 Accent 6" w:semiHidden="0" w:uiPriority="65" w:unhideWhenUsed="0"/>
-    <w:lsdException w:name="Medium List 2 Accent 6" w:semiHidden="0" w:uiPriority="66" w:unhideWhenUsed="0"/>
-    <w:lsdException w:name="Medium Grid 1 Accent 6" w:semiHidden="0" w:uiPriority="67" w:unhideWhenUsed="0"/>
-    <w:lsdException w:name="Medium Grid 2 Accent 6" w:semiHidden="0" w:uiPriority="68" w:unhideWhenUsed="0"/>
-    <w:lsdException w:name="Medium Grid 3 Accent 6" w:semiHidden="0" w:uiPriority="69" w:unhideWhenUsed="0"/>
-    <w:lsdException w:name="Dark List Accent 6" w:semiHidden="0" w:uiPriority="70" w:unhideWhenUsed="0"/>
-    <w:lsdException w:name="Colorful Shading Accent 6" w:semiHidden="0" w:uiPriority="71" w:unhideWhenUsed="0"/>
-    <w:lsdException w:name="Colorful List Accent 6" w:semiHidden="0" w:uiPriority="72" w:unhideWhenUsed="0"/>
-    <w:lsdException w:name="Colorful Grid Accent 6" w:semiHidden="0" w:uiPriority="73" w:unhideWhenUsed="0"/>
-    <w:lsdException w:name="Subtle Emphasis" w:semiHidden="0" w:uiPriority="19" w:unhideWhenUsed="0" w:qFormat="1"/>
-    <w:lsdException w:name="Intense Emphasis" w:semiHidden="0" w:uiPriority="21" w:unhideWhenUsed="0" w:qFormat="1"/>
-    <w:lsdException w:name="Subtle Reference" w:semiHidden="0" w:uiPriority="31" w:unhideWhenUsed="0" w:qFormat="1"/>
-    <w:lsdException w:name="Intense Reference" w:semiHidden="0" w:uiPriority="32" w:unhideWhenUsed="0" w:qFormat="1"/>
-    <w:lsdException w:name="Book Title" w:semiHidden="0" w:uiPriority="33" w:unhideWhenUsed="0" w:qFormat="1"/>
-    <w:lsdException w:name="Bibliography" w:uiPriority="37"/>
-    <w:lsdException w:name="TOC Heading" w:uiPriority="39" w:qFormat="1"/>
+  <w:latentStyles w:defLockedState="0" w:defUIPriority="99" w:defSemiHidden="0" w:defUnhideWhenUsed="0" w:defQFormat="0" w:count="371">
+    <w:lsdException w:name="Normal" w:uiPriority="0" w:qFormat="1"/>
+    <w:lsdException w:name="heading 1" w:uiPriority="9" w:qFormat="1"/>
+    <w:lsdException w:name="heading 2" w:semiHidden="1" w:uiPriority="9" w:unhideWhenUsed="1" w:qFormat="1"/>
+    <w:lsdException w:name="heading 3" w:semiHidden="1" w:uiPriority="9" w:unhideWhenUsed="1" w:qFormat="1"/>
+    <w:lsdException w:name="heading 4" w:semiHidden="1" w:uiPriority="9" w:unhideWhenUsed="1" w:qFormat="1"/>
+    <w:lsdException w:name="heading 5" w:semiHidden="1" w:uiPriority="9" w:unhideWhenUsed="1" w:qFormat="1"/>
+    <w:lsdException w:name="heading 6" w:semiHidden="1" w:uiPriority="9" w:unhideWhenUsed="1" w:qFormat="1"/>
+    <w:lsdException w:name="heading 7" w:semiHidden="1" w:uiPriority="9" w:unhideWhenUsed="1" w:qFormat="1"/>
+    <w:lsdException w:name="heading 8" w:semiHidden="1" w:uiPriority="9" w:unhideWhenUsed="1" w:qFormat="1"/>
+    <w:lsdException w:name="heading 9" w:semiHidden="1" w:uiPriority="9" w:unhideWhenUsed="1" w:qFormat="1"/>
+    <w:lsdException w:name="index 1" w:semiHidden="1" w:unhideWhenUsed="1"/>
+    <w:lsdException w:name="index 2" w:semiHidden="1" w:unhideWhenUsed="1"/>
+    <w:lsdException w:name="index 3" w:semiHidden="1" w:unhideWhenUsed="1"/>
+    <w:lsdException w:name="index 4" w:semiHidden="1" w:unhideWhenUsed="1"/>
+    <w:lsdException w:name="index 5" w:semiHidden="1" w:unhideWhenUsed="1"/>
+    <w:lsdException w:name="index 6" w:semiHidden="1" w:unhideWhenUsed="1"/>
+    <w:lsdException w:name="index 7" w:semiHidden="1" w:unhideWhenUsed="1"/>
+    <w:lsdException w:name="index 8" w:semiHidden="1" w:unhideWhenUsed="1"/>
+    <w:lsdException w:name="index 9" w:semiHidden="1" w:unhideWhenUsed="1"/>
+    <w:lsdException w:name="toc 1" w:semiHidden="1" w:uiPriority="39" w:unhideWhenUsed="1"/>
+    <w:lsdException w:name="toc 2" w:semiHidden="1" w:uiPriority="39" w:unhideWhenUsed="1"/>
+    <w:lsdException w:name="toc 3" w:semiHidden="1" w:uiPriority="39" w:unhideWhenUsed="1"/>
+    <w:lsdException w:name="toc 4" w:semiHidden="1" w:uiPriority="39" w:unhideWhenUsed="1"/>
+    <w:lsdException w:name="toc 5" w:semiHidden="1" w:uiPriority="39" w:unhideWhenUsed="1"/>
+    <w:lsdException w:name="toc 6" w:semiHidden="1" w:uiPriority="39" w:unhideWhenUsed="1"/>
+    <w:lsdException w:name="toc 7" w:semiHidden="1" w:uiPriority="39" w:unhideWhenUsed="1"/>
+    <w:lsdException w:name="toc 8" w:semiHidden="1" w:uiPriority="39" w:unhideWhenUsed="1"/>
+    <w:lsdException w:name="toc 9" w:semiHidden="1" w:uiPriority="39" w:unhideWhenUsed="1"/>
+    <w:lsdException w:name="Normal Indent" w:semiHidden="1" w:unhideWhenUsed="1"/>
+    <w:lsdException w:name="footnote text" w:semiHidden="1" w:unhideWhenUsed="1"/>
+    <w:lsdException w:name="annotation text" w:semiHidden="1" w:unhideWhenUsed="1"/>
+    <w:lsdException w:name="header" w:semiHidden="1" w:unhideWhenUsed="1"/>
+    <w:lsdException w:name="footer" w:semiHidden="1" w:unhideWhenUsed="1"/>
+    <w:lsdException w:name="index heading" w:semiHidden="1" w:unhideWhenUsed="1"/>
+    <w:lsdException w:name="caption" w:semiHidden="1" w:uiPriority="35" w:unhideWhenUsed="1" w:qFormat="1"/>
+    <w:lsdException w:name="table of figures" w:semiHidden="1" w:unhideWhenUsed="1"/>
+    <w:lsdException w:name="envelope address" w:semiHidden="1" w:unhideWhenUsed="1"/>
+    <w:lsdException w:name="envelope return" w:semiHidden="1" w:unhideWhenUsed="1"/>
+    <w:lsdException w:name="footnote reference" w:semiHidden="1" w:unhideWhenUsed="1"/>
+    <w:lsdException w:name="annotation reference" w:semiHidden="1" w:unhideWhenUsed="1"/>
+    <w:lsdException w:name="line number" w:semiHidden="1" w:unhideWhenUsed="1"/>
+    <w:lsdException w:name="page number" w:semiHidden="1" w:unhideWhenUsed="1"/>
+    <w:lsdException w:name="endnote reference" w:semiHidden="1" w:unhideWhenUsed="1"/>
+    <w:lsdException w:name="endnote text" w:semiHidden="1" w:unhideWhenUsed="1"/>
+    <w:lsdException w:name="table of authorities" w:semiHidden="1" w:unhideWhenUsed="1"/>
+    <w:lsdException w:name="macro" w:semiHidden="1" w:unhideWhenUsed="1"/>
+    <w:lsdException w:name="toa heading" w:semiHidden="1" w:unhideWhenUsed="1"/>
+    <w:lsdException w:name="List" w:semiHidden="1" w:unhideWhenUsed="1"/>
+    <w:lsdException w:name="List Bullet" w:semiHidden="1" w:unhideWhenUsed="1"/>
+    <w:lsdException w:name="List Number" w:semiHidden="1" w:unhideWhenUsed="1"/>
+    <w:lsdException w:name="List 2" w:semiHidden="1" w:unhideWhenUsed="1"/>
+    <w:lsdException w:name="List 3" w:semiHidden="1" w:unhideWhenUsed="1"/>
+    <w:lsdException w:name="List 4" w:semiHidden="1" w:unhideWhenUsed="1"/>
+    <w:lsdException w:name="List 5" w:semiHidden="1" w:unhideWhenUsed="1"/>
+    <w:lsdException w:name="List Bullet 2" w:semiHidden="1" w:unhideWhenUsed="1"/>
+    <w:lsdException w:name="List Bullet 3" w:semiHidden="1" w:unhideWhenUsed="1"/>
+    <w:lsdException w:name="List Bullet 4" w:semiHidden="1" w:unhideWhenUsed="1"/>
+    <w:lsdException w:name="List Bullet 5" w:semiHidden="1" w:unhideWhenUsed="1"/>
+    <w:lsdException w:name="List Number 2" w:semiHidden="1" w:unhideWhenUsed="1"/>
+    <w:lsdException w:name="List Number 3" w:semiHidden="1" w:unhideWhenUsed="1"/>
+    <w:lsdException w:name="List Number 4" w:semiHidden="1" w:unhideWhenUsed="1"/>
+    <w:lsdException w:name="List Number 5" w:semiHidden="1" w:unhideWhenUsed="1"/>
+    <w:lsdException w:name="Title" w:uiPriority="10" w:qFormat="1"/>
+    <w:lsdException w:name="Closing" w:semiHidden="1" w:unhideWhenUsed="1"/>
+    <w:lsdException w:name="Signature" w:semiHidden="1" w:unhideWhenUsed="1"/>
+    <w:lsdException w:name="Default Paragraph Font" w:semiHidden="1" w:uiPriority="1" w:unhideWhenUsed="1"/>
+    <w:lsdException w:name="Body Text" w:semiHidden="1" w:unhideWhenUsed="1"/>
+    <w:lsdException w:name="Body Text Indent" w:semiHidden="1" w:unhideWhenUsed="1"/>
+    <w:lsdException w:name="List Continue" w:semiHidden="1" w:unhideWhenUsed="1"/>
+    <w:lsdException w:name="List Continue 2" w:semiHidden="1" w:unhideWhenUsed="1"/>
+    <w:lsdException w:name="List Continue 3" w:semiHidden="1" w:unhideWhenUsed="1"/>
+    <w:lsdException w:name="List Continue 4" w:semiHidden="1" w:unhideWhenUsed="1"/>
+    <w:lsdException w:name="List Continue 5" w:semiHidden="1" w:unhideWhenUsed="1"/>
+    <w:lsdException w:name="Message Header" w:semiHidden="1" w:unhideWhenUsed="1"/>
+    <w:lsdException w:name="Subtitle" w:uiPriority="11" w:qFormat="1"/>
+    <w:lsdException w:name="Salutation" w:semiHidden="1" w:unhideWhenUsed="1"/>
+    <w:lsdException w:name="Date" w:semiHidden="1" w:unhideWhenUsed="1"/>
+    <w:lsdException w:name="Body Text First Indent" w:semiHidden="1" w:unhideWhenUsed="1"/>
+    <w:lsdException w:name="Body Text First Indent 2" w:semiHidden="1" w:unhideWhenUsed="1"/>
+    <w:lsdException w:name="Note Heading" w:semiHidden="1" w:unhideWhenUsed="1"/>
+    <w:lsdException w:name="Body Text 2" w:semiHidden="1" w:unhideWhenUsed="1"/>
+    <w:lsdException w:name="Body Text 3" w:semiHidden="1" w:unhideWhenUsed="1"/>
+    <w:lsdException w:name="Body Text Indent 2" w:semiHidden="1" w:unhideWhenUsed="1"/>
+    <w:lsdException w:name="Body Text Indent 3" w:semiHidden="1" w:unhideWhenUsed="1"/>
+    <w:lsdException w:name="Block Text" w:semiHidden="1" w:unhideWhenUsed="1"/>
+    <w:lsdException w:name="Hyperlink" w:semiHidden="1" w:unhideWhenUsed="1"/>
+    <w:lsdException w:name="FollowedHyperlink" w:semiHidden="1" w:unhideWhenUsed="1"/>
+    <w:lsdException w:name="Strong" w:uiPriority="22" w:qFormat="1"/>
+    <w:lsdException w:name="Emphasis" w:uiPriority="20" w:qFormat="1"/>
+    <w:lsdException w:name="Document Map" w:semiHidden="1" w:unhideWhenUsed="1"/>
+    <w:lsdException w:name="Plain Text" w:semiHidden="1" w:unhideWhenUsed="1"/>
+    <w:lsdException w:name="E-mail Signature" w:semiHidden="1" w:unhideWhenUsed="1"/>
+    <w:lsdException w:name="HTML Top of Form" w:semiHidden="1" w:unhideWhenUsed="1"/>
+    <w:lsdException w:name="HTML Bottom of Form" w:semiHidden="1" w:unhideWhenUsed="1"/>
+    <w:lsdException w:name="Normal (Web)" w:semiHidden="1" w:unhideWhenUsed="1"/>
+    <w:lsdException w:name="HTML Acronym" w:semiHidden="1" w:unhideWhenUsed="1"/>
+    <w:lsdException w:name="HTML Address" w:semiHidden="1" w:unhideWhenUsed="1"/>
+    <w:lsdException w:name="HTML Cite" w:semiHidden="1" w:unhideWhenUsed="1"/>
+    <w:lsdException w:name="HTML Code" w:semiHidden="1" w:unhideWhenUsed="1"/>
+    <w:lsdException w:name="HTML Definition" w:semiHidden="1" w:unhideWhenUsed="1"/>
+    <w:lsdException w:name="HTML Keyboard" w:semiHidden="1" w:unhideWhenUsed="1"/>
+    <w:lsdException w:name="HTML Preformatted" w:semiHidden="1" w:unhideWhenUsed="1"/>
+    <w:lsdException w:name="HTML Sample" w:semiHidden="1" w:unhideWhenUsed="1"/>
+    <w:lsdException w:name="HTML Typewriter" w:semiHidden="1" w:unhideWhenUsed="1"/>
+    <w:lsdException w:name="HTML Variable" w:semiHidden="1" w:unhideWhenUsed="1"/>
+    <w:lsdException w:name="Normal Table" w:semiHidden="1" w:unhideWhenUsed="1"/>
+    <w:lsdException w:name="annotation subject" w:semiHidden="1" w:unhideWhenUsed="1"/>
+    <w:lsdException w:name="No List" w:semiHidden="1" w:unhideWhenUsed="1"/>
+    <w:lsdException w:name="Outline List 1" w:semiHidden="1" w:unhideWhenUsed="1"/>
+    <w:lsdException w:name="Outline List 2" w:semiHidden="1" w:unhideWhenUsed="1"/>
+    <w:lsdException w:name="Outline List 3" w:semiHidden="1" w:unhideWhenUsed="1"/>
+    <w:lsdException w:name="Table Simple 1" w:semiHidden="1" w:unhideWhenUsed="1"/>
+    <w:lsdException w:name="Table Simple 2" w:semiHidden="1" w:unhideWhenUsed="1"/>
+    <w:lsdException w:name="Table Simple 3" w:semiHidden="1" w:unhideWhenUsed="1"/>
+    <w:lsdException w:name="Table Classic 1" w:semiHidden="1" w:unhideWhenUsed="1"/>
+    <w:lsdException w:name="Table Classic 2" w:semiHidden="1" w:unhideWhenUsed="1"/>
+    <w:lsdException w:name="Table Classic 3" w:semiHidden="1" w:unhideWhenUsed="1"/>
+    <w:lsdException w:name="Table Classic 4" w:semiHidden="1" w:unhideWhenUsed="1"/>
+    <w:lsdException w:name="Table Colorful 1" w:semiHidden="1" w:unhideWhenUsed="1"/>
+    <w:lsdException w:name="Table Colorful 2" w:semiHidden="1" w:unhideWhenUsed="1"/>
+    <w:lsdException w:name="Table Colorful 3" w:semiHidden="1" w:unhideWhenUsed="1"/>
+    <w:lsdException w:name="Table Columns 1" w:semiHidden="1" w:unhideWhenUsed="1"/>
+    <w:lsdException w:name="Table Columns 2" w:semiHidden="1" w:unhideWhenUsed="1"/>
+    <w:lsdException w:name="Table Columns 3" w:semiHidden="1" w:unhideWhenUsed="1"/>
+    <w:lsdException w:name="Table Columns 4" w:semiHidden="1" w:unhideWhenUsed="1"/>
+    <w:lsdException w:name="Table Columns 5" w:semiHidden="1" w:unhideWhenUsed="1"/>
+    <w:lsdException w:name="Table Grid 1" w:semiHidden="1" w:unhideWhenUsed="1"/>
+    <w:lsdException w:name="Table Grid 2" w:semiHidden="1" w:unhideWhenUsed="1"/>
+    <w:lsdException w:name="Table Grid 3" w:semiHidden="1" w:unhideWhenUsed="1"/>
+    <w:lsdException w:name="Table Grid 4" w:semiHidden="1" w:unhideWhenUsed="1"/>
+    <w:lsdException w:name="Table Grid 5" w:semiHidden="1" w:unhideWhenUsed="1"/>
+    <w:lsdException w:name="Table Grid 6" w:semiHidden="1" w:unhideWhenUsed="1"/>
+    <w:lsdException w:name="Table Grid 7" w:semiHidden="1" w:unhideWhenUsed="1"/>
+    <w:lsdException w:name="Table Grid 8" w:semiHidden="1" w:unhideWhenUsed="1"/>
+    <w:lsdException w:name="Table List 1" w:semiHidden="1" w:unhideWhenUsed="1"/>
+    <w:lsdException w:name="Table List 2" w:semiHidden="1" w:unhideWhenUsed="1"/>
+    <w:lsdException w:name="Table List 3" w:semiHidden="1" w:unhideWhenUsed="1"/>
+    <w:lsdException w:name="Table List 4" w:semiHidden="1" w:unhideWhenUsed="1"/>
+    <w:lsdException w:name="Table List 5" w:semiHidden="1" w:unhideWhenUsed="1"/>
+    <w:lsdException w:name="Table List 6" w:semiHidden="1" w:unhideWhenUsed="1"/>
+    <w:lsdException w:name="Table List 7" w:semiHidden="1" w:unhideWhenUsed="1"/>
+    <w:lsdException w:name="Table List 8" w:semiHidden="1" w:unhideWhenUsed="1"/>
+    <w:lsdException w:name="Table 3D effects 1" w:semiHidden="1" w:unhideWhenUsed="1"/>
+    <w:lsdException w:name="Table 3D effects 2" w:semiHidden="1" w:unhideWhenUsed="1"/>
+    <w:lsdException w:name="Table 3D effects 3" w:semiHidden="1" w:unhideWhenUsed="1"/>
+    <w:lsdException w:name="Table Contemporary" w:semiHidden="1" w:unhideWhenUsed="1"/>
+    <w:lsdException w:name="Table Elegant" w:semiHidden="1" w:unhideWhenUsed="1"/>
+    <w:lsdException w:name="Table Professional" w:semiHidden="1" w:unhideWhenUsed="1"/>
+    <w:lsdException w:name="Table Subtle 1" w:semiHidden="1" w:unhideWhenUsed="1"/>
+    <w:lsdException w:name="Table Subtle 2" w:semiHidden="1" w:unhideWhenUsed="1"/>
+    <w:lsdException w:name="Table Web 1" w:semiHidden="1" w:unhideWhenUsed="1"/>
+    <w:lsdException w:name="Table Web 2" w:semiHidden="1" w:unhideWhenUsed="1"/>
+    <w:lsdException w:name="Table Web 3" w:semiHidden="1" w:unhideWhenUsed="1"/>
+    <w:lsdException w:name="Balloon Text" w:semiHidden="1" w:unhideWhenUsed="1"/>
+    <w:lsdException w:name="Table Grid" w:uiPriority="59"/>
+    <w:lsdException w:name="Table Theme" w:semiHidden="1" w:unhideWhenUsed="1"/>
+    <w:lsdException w:name="Placeholder Text" w:semiHidden="1"/>
+    <w:lsdException w:name="No Spacing" w:uiPriority="1" w:qFormat="1"/>
+    <w:lsdException w:name="Light Shading" w:uiPriority="60"/>
+    <w:lsdException w:name="Light List" w:uiPriority="61"/>
+    <w:lsdException w:name="Light Grid" w:uiPriority="62"/>
+    <w:lsdException w:name="Medium Shading 1" w:uiPriority="63"/>
+    <w:lsdException w:name="Medium Shading 2" w:uiPriority="64"/>
+    <w:lsdException w:name="Medium List 1" w:uiPriority="65"/>
+    <w:lsdException w:name="Medium List 2" w:uiPriority="66"/>
+    <w:lsdException w:name="Medium Grid 1" w:uiPriority="67"/>
+    <w:lsdException w:name="Medium Grid 2" w:uiPriority="68"/>
+    <w:lsdException w:name="Medium Grid 3" w:uiPriority="69"/>
+    <w:lsdException w:name="Dark List" w:uiPriority="70"/>
+    <w:lsdException w:name="Colorful Shading" w:uiPriority="71"/>
+    <w:lsdException w:name="Colorful List" w:uiPriority="72"/>
+    <w:lsdException w:name="Colorful Grid" w:uiPriority="73"/>
+    <w:lsdException w:name="Light Shading Accent 1" w:uiPriority="60"/>
+    <w:lsdException w:name="Light List Accent 1" w:uiPriority="61"/>
+    <w:lsdException w:name="Light Grid Accent 1" w:uiPriority="62"/>
+    <w:lsdException w:name="Medium Shading 1 Accent 1" w:uiPriority="63"/>
+    <w:lsdException w:name="Medium Shading 2 Accent 1" w:uiPriority="64"/>
+    <w:lsdException w:name="Medium List 1 Accent 1" w:uiPriority="65"/>
+    <w:lsdException w:name="Revision" w:semiHidden="1"/>
+    <w:lsdException w:name="List Paragraph" w:uiPriority="34" w:qFormat="1"/>
+    <w:lsdException w:name="Quote" w:uiPriority="29" w:qFormat="1"/>
+    <w:lsdException w:name="Intense Quote" w:uiPriority="30" w:qFormat="1"/>
+    <w:lsdException w:name="Medium List 2 Accent 1" w:uiPriority="66"/>
+    <w:lsdException w:name="Medium Grid 1 Accent 1" w:uiPriority="67"/>
+    <w:lsdException w:name="Medium Grid 2 Accent 1" w:uiPriority="68"/>
+    <w:lsdException w:name="Medium Grid 3 Accent 1" w:uiPriority="69"/>
+    <w:lsdException w:name="Dark List Accent 1" w:uiPriority="70"/>
+    <w:lsdException w:name="Colorful Shading Accent 1" w:uiPriority="71"/>
+    <w:lsdException w:name="Colorful List Accent 1" w:uiPriority="72"/>
+    <w:lsdException w:name="Colorful Grid Accent 1" w:uiPriority="73"/>
+    <w:lsdException w:name="Light Shading Accent 2" w:uiPriority="60"/>
+    <w:lsdException w:name="Light List Accent 2" w:uiPriority="61"/>
+    <w:lsdException w:name="Light Grid Accent 2" w:uiPriority="62"/>
+    <w:lsdException w:name="Medium Shading 1 Accent 2" w:uiPriority="63"/>
+    <w:lsdException w:name="Medium Shading 2 Accent 2" w:uiPriority="64"/>
+    <w:lsdException w:name="Medium List 1 Accent 2" w:uiPriority="65"/>
+    <w:lsdException w:name="Medium List 2 Accent 2" w:uiPriority="66"/>
+    <w:lsdException w:name="Medium Grid 1 Accent 2" w:uiPriority="67"/>
+    <w:lsdException w:name="Medium Grid 2 Accent 2" w:uiPriority="68"/>
+    <w:lsdException w:name="Medium Grid 3 Accent 2" w:uiPriority="69"/>
+    <w:lsdException w:name="Dark List Accent 2" w:uiPriority="70"/>
+    <w:lsdException w:name="Colorful Shading Accent 2" w:uiPriority="71"/>
+    <w:lsdException w:name="Colorful List Accent 2" w:uiPriority="72"/>
+    <w:lsdException w:name="Colorful Grid Accent 2" w:uiPriority="73"/>
+    <w:lsdException w:name="Light Shading Accent 3" w:uiPriority="60"/>
+    <w:lsdException w:name="Light List Accent 3" w:uiPriority="61"/>
+    <w:lsdException w:name="Light Grid Accent 3" w:uiPriority="62"/>
+    <w:lsdException w:name="Medium Shading 1 Accent 3" w:uiPriority="63"/>
+    <w:lsdException w:name="Medium Shading 2 Accent 3" w:uiPriority="64"/>
+    <w:lsdException w:name="Medium List 1 Accent 3" w:uiPriority="65"/>
+    <w:lsdException w:name="Medium List 2 Accent 3" w:uiPriority="66"/>
+    <w:lsdException w:name="Medium Grid 1 Accent 3" w:uiPriority="67"/>
+    <w:lsdException w:name="Medium Grid 2 Accent 3" w:uiPriority="68"/>
+    <w:lsdException w:name="Medium Grid 3 Accent 3" w:uiPriority="69"/>
+    <w:lsdException w:name="Dark List Accent 3" w:uiPriority="70"/>
+    <w:lsdException w:name="Colorful Shading Accent 3" w:uiPriority="71"/>
+    <w:lsdException w:name="Colorful List Accent 3" w:uiPriority="72"/>
+    <w:lsdException w:name="Colorful Grid Accent 3" w:uiPriority="73"/>
+    <w:lsdException w:name="Light Shading Accent 4" w:uiPriority="60"/>
+    <w:lsdException w:name="Light List Accent 4" w:uiPriority="61"/>
+    <w:lsdException w:name="Light Grid Accent 4" w:uiPriority="62"/>
+    <w:lsdException w:name="Medium Shading 1 Accent 4" w:uiPriority="63"/>
+    <w:lsdException w:name="Medium Shading 2 Accent 4" w:uiPriority="64"/>
+    <w:lsdException w:name="Medium List 1 Accent 4" w:uiPriority="65"/>
+    <w:lsdException w:name="Medium List 2 Accent 4" w:uiPriority="66"/>
+    <w:lsdException w:name="Medium Grid 1 Accent 4" w:uiPriority="67"/>
+    <w:lsdException w:name="Medium Grid 2 Accent 4" w:uiPriority="68"/>
+    <w:lsdException w:name="Medium Grid 3 Accent 4" w:uiPriority="69"/>
+    <w:lsdException w:name="Dark List Accent 4" w:uiPriority="70"/>
+    <w:lsdException w:name="Colorful Shading Accent 4" w:uiPriority="71"/>
+    <w:lsdException w:name="Colorful List Accent 4" w:uiPriority="72"/>
+    <w:lsdException w:name="Colorful Grid Accent 4" w:uiPriority="73"/>
+    <w:lsdException w:name="Light Shading Accent 5" w:uiPriority="60"/>
+    <w:lsdException w:name="Light List Accent 5" w:uiPriority="61"/>
+    <w:lsdException w:name="Light Grid Accent 5" w:uiPriority="62"/>
+    <w:lsdException w:name="Medium Shading 1 Accent 5" w:uiPriority="63"/>
+    <w:lsdException w:name="Medium Shading 2 Accent 5" w:uiPriority="64"/>
+    <w:lsdException w:name="Medium List 1 Accent 5" w:uiPriority="65"/>
+    <w:lsdException w:name="Medium List 2 Accent 5" w:uiPriority="66"/>
+    <w:lsdException w:name="Medium Grid 1 Accent 5" w:uiPriority="67"/>
+    <w:lsdException w:name="Medium Grid 2 Accent 5" w:uiPriority="68"/>
+    <w:lsdException w:name="Medium Grid 3 Accent 5" w:uiPriority="69"/>
+    <w:lsdException w:name="Dark List Accent 5" w:uiPriority="70"/>
+    <w:lsdException w:name="Colorful Shading Accent 5" w:uiPriority="71"/>
+    <w:lsdException w:name="Colorful List Accent 5" w:uiPriority="72"/>
+    <w:lsdException w:name="Colorful Grid Accent 5" w:uiPriority="73"/>
+    <w:lsdException w:name="Light Shading Accent 6" w:uiPriority="60"/>
+    <w:lsdException w:name="Light List Accent 6" w:uiPriority="61"/>
+    <w:lsdException w:name="Light Grid Accent 6" w:uiPriority="62"/>
+    <w:lsdException w:name="Medium Shading 1 Accent 6" w:uiPriority="63"/>
+    <w:lsdException w:name="Medium Shading 2 Accent 6" w:uiPriority="64"/>
+    <w:lsdException w:name="Medium List 1 Accent 6" w:uiPriority="65"/>
+    <w:lsdException w:name="Medium List 2 Accent 6" w:uiPriority="66"/>
+    <w:lsdException w:name="Medium Grid 1 Accent 6" w:uiPriority="67"/>
+    <w:lsdException w:name="Medium Grid 2 Accent 6" w:uiPriority="68"/>
+    <w:lsdException w:name="Medium Grid 3 Accent 6" w:uiPriority="69"/>
+    <w:lsdException w:name="Dark List Accent 6" w:uiPriority="70"/>
+    <w:lsdException w:name="Colorful Shading Accent 6" w:uiPriority="71"/>
+    <w:lsdException w:name="Colorful List Accent 6" w:uiPriority="72"/>
+    <w:lsdException w:name="Colorful Grid Accent 6" w:uiPriority="73"/>
+    <w:lsdException w:name="Subtle Emphasis" w:uiPriority="19" w:qFormat="1"/>
+    <w:lsdException w:name="Intense Emphasis" w:uiPriority="21" w:qFormat="1"/>
+    <w:lsdException w:name="Subtle Reference" w:uiPriority="31" w:qFormat="1"/>
+    <w:lsdException w:name="Intense Reference" w:uiPriority="32" w:qFormat="1"/>
+    <w:lsdException w:name="Book Title" w:uiPriority="33" w:qFormat="1"/>
+    <w:lsdException w:name="Bibliography" w:semiHidden="1" w:uiPriority="37" w:unhideWhenUsed="1"/>
+    <w:lsdException w:name="TOC Heading" w:semiHidden="1" w:uiPriority="39" w:unhideWhenUsed="1" w:qFormat="1"/>
+    <w:lsdException w:name="Plain Table 1" w:uiPriority="41"/>
+    <w:lsdException w:name="Plain Table 2" w:uiPriority="42"/>
+    <w:lsdException w:name="Plain Table 3" w:uiPriority="43"/>
+    <w:lsdException w:name="Plain Table 4" w:uiPriority="44"/>
+    <w:lsdException w:name="Plain Table 5" w:uiPriority="45"/>
+    <w:lsdException w:name="Grid Table Light" w:uiPriority="40"/>
+    <w:lsdException w:name="Grid Table 1 Light" w:uiPriority="46"/>
+    <w:lsdException w:name="Grid Table 2" w:uiPriority="47"/>
+    <w:lsdException w:name="Grid Table 3" w:uiPriority="48"/>
+    <w:lsdException w:name="Grid Table 4" w:uiPriority="49"/>
+    <w:lsdException w:name="Grid Table 5 Dark" w:uiPriority="50"/>
+    <w:lsdException w:name="Grid Table 6 Colorful" w:uiPriority="51"/>
+    <w:lsdException w:name="Grid Table 7 Colorful" w:uiPriority="52"/>
+    <w:lsdException w:name="Grid Table 1 Light Accent 1" w:uiPriority="46"/>
+    <w:lsdException w:name="Grid Table 2 Accent 1" w:uiPriority="47"/>
+    <w:lsdException w:name="Grid Table 3 Accent 1" w:uiPriority="48"/>
+    <w:lsdException w:name="Grid Table 4 Accent 1" w:uiPriority="49"/>
+    <w:lsdException w:name="Grid Table 5 Dark Accent 1" w:uiPriority="50"/>
+    <w:lsdException w:name="Grid Table 6 Colorful Accent 1" w:uiPriority="51"/>
+    <w:lsdException w:name="Grid Table 7 Colorful Accent 1" w:uiPriority="52"/>
+    <w:lsdException w:name="Grid Table 1 Light Accent 2" w:uiPriority="46"/>
+    <w:lsdException w:name="Grid Table 2 Accent 2" w:uiPriority="47"/>
+    <w:lsdException w:name="Grid Table 3 Accent 2" w:uiPriority="48"/>
+    <w:lsdException w:name="Grid Table 4 Accent 2" w:uiPriority="49"/>
+    <w:lsdException w:name="Grid Table 5 Dark Accent 2" w:uiPriority="50"/>
+    <w:lsdException w:name="Grid Table 6 Colorful Accent 2" w:uiPriority="51"/>
+    <w:lsdException w:name="Grid Table 7 Colorful Accent 2" w:uiPriority="52"/>
+    <w:lsdException w:name="Grid Table 1 Light Accent 3" w:uiPriority="46"/>
+    <w:lsdException w:name="Grid Table 2 Accent 3" w:uiPriority="47"/>
+    <w:lsdException w:name="Grid Table 3 Accent 3" w:uiPriority="48"/>
+    <w:lsdException w:name="Grid Table 4 Accent 3" w:uiPriority="49"/>
+    <w:lsdException w:name="Grid Table 5 Dark Accent 3" w:uiPriority="50"/>
+    <w:lsdException w:name="Grid Table 6 Colorful Accent 3" w:uiPriority="51"/>
+    <w:lsdException w:name="Grid Table 7 Colorful Accent 3" w:uiPriority="52"/>
+    <w:lsdException w:name="Grid Table 1 Light Accent 4" w:uiPriority="46"/>
+    <w:lsdException w:name="Grid Table 2 Accent 4" w:uiPriority="47"/>
+    <w:lsdException w:name="Grid Table 3 Accent 4" w:uiPriority="48"/>
+    <w:lsdException w:name="Grid Table 4 Accent 4" w:uiPriority="49"/>
+    <w:lsdException w:name="Grid Table 5 Dark Accent 4" w:uiPriority="50"/>
+    <w:lsdException w:name="Grid Table 6 Colorful Accent 4" w:uiPriority="51"/>
+    <w:lsdException w:name="Grid Table 7 Colorful Accent 4" w:uiPriority="52"/>
+    <w:lsdException w:name="Grid Table 1 Light Accent 5" w:uiPriority="46"/>
+    <w:lsdException w:name="Grid Table 2 Accent 5" w:uiPriority="47"/>
+    <w:lsdException w:name="Grid Table 3 Accent 5" w:uiPriority="48"/>
+    <w:lsdException w:name="Grid Table 4 Accent 5" w:uiPriority="49"/>
+    <w:lsdException w:name="Grid Table 5 Dark Accent 5" w:uiPriority="50"/>
+    <w:lsdException w:name="Grid Table 6 Colorful Accent 5" w:uiPriority="51"/>
+    <w:lsdException w:name="Grid Table 7 Colorful Accent 5" w:uiPriority="52"/>
+    <w:lsdException w:name="Grid Table 1 Light Accent 6" w:uiPriority="46"/>
+    <w:lsdException w:name="Grid Table 2 Accent 6" w:uiPriority="47"/>
+    <w:lsdException w:name="Grid Table 3 Accent 6" w:uiPriority="48"/>
+    <w:lsdException w:name="Grid Table 4 Accent 6" w:uiPriority="49"/>
+    <w:lsdException w:name="Grid Table 5 Dark Accent 6" w:uiPriority="50"/>
+    <w:lsdException w:name="Grid Table 6 Colorful Accent 6" w:uiPriority="51"/>
+    <w:lsdException w:name="Grid Table 7 Colorful Accent 6" w:uiPriority="52"/>
+    <w:lsdException w:name="List Table 1 Light" w:uiPriority="46"/>
+    <w:lsdException w:name="List Table 2" w:uiPriority="47"/>
+    <w:lsdException w:name="List Table 3" w:uiPriority="48"/>
+    <w:lsdException w:name="List Table 4" w:uiPriority="49"/>
+    <w:lsdException w:name="List Table 5 Dark" w:uiPriority="50"/>
+    <w:lsdException w:name="List Table 6 Colorful" w:uiPriority="51"/>
+    <w:lsdException w:name="List Table 7 Colorful" w:uiPriority="52"/>
+    <w:lsdException w:name="List Table 1 Light Accent 1" w:uiPriority="46"/>
+    <w:lsdException w:name="List Table 2 Accent 1" w:uiPriority="47"/>
+    <w:lsdException w:name="List Table 3 Accent 1" w:uiPriority="48"/>
+    <w:lsdException w:name="List Table 4 Accent 1" w:uiPriority="49"/>
+    <w:lsdException w:name="List Table 5 Dark Accent 1" w:uiPriority="50"/>
+    <w:lsdException w:name="List Table 6 Colorful Accent 1" w:uiPriority="51"/>
+    <w:lsdException w:name="List Table 7 Colorful Accent 1" w:uiPriority="52"/>
+    <w:lsdException w:name="List Table 1 Light Accent 2" w:uiPriority="46"/>
+    <w:lsdException w:name="List Table 2 Accent 2" w:uiPriority="47"/>
+    <w:lsdException w:name="List Table 3 Accent 2" w:uiPriority="48"/>
+    <w:lsdException w:name="List Table 4 Accent 2" w:uiPriority="49"/>
+    <w:lsdException w:name="List Table 5 Dark Accent 2" w:uiPriority="50"/>
+    <w:lsdException w:name="List Table 6 Colorful Accent 2" w:uiPriority="51"/>
+    <w:lsdException w:name="List Table 7 Colorful Accent 2" w:uiPriority="52"/>
+    <w:lsdException w:name="List Table 1 Light Accent 3" w:uiPriority="46"/>
+    <w:lsdException w:name="List Table 2 Accent 3" w:uiPriority="47"/>
+    <w:lsdException w:name="List Table 3 Accent 3" w:uiPriority="48"/>
+    <w:lsdException w:name="List Table 4 Accent 3" w:uiPriority="49"/>
+    <w:lsdException w:name="List Table 5 Dark Accent 3" w:uiPriority="50"/>
+    <w:lsdException w:name="List Table 6 Colorful Accent 3" w:uiPriority="51"/>
+    <w:lsdException w:name="List Table 7 Colorful Accent 3" w:uiPriority="52"/>
+    <w:lsdException w:name="List Table 1 Light Accent 4" w:uiPriority="46"/>
+    <w:lsdException w:name="List Table 2 Accent 4" w:uiPriority="47"/>
+    <w:lsdException w:name="List Table 3 Accent 4" w:uiPriority="48"/>
+    <w:lsdException w:name="List Table 4 Accent 4" w:uiPriority="49"/>
+    <w:lsdException w:name="List Table 5 Dark Accent 4" w:uiPriority="50"/>
+    <w:lsdException w:name="List Table 6 Colorful Accent 4" w:uiPriority="51"/>
+    <w:lsdException w:name="List Table 7 Colorful Accent 4" w:uiPriority="52"/>
+    <w:lsdException w:name="List Table 1 Light Accent 5" w:uiPriority="46"/>
+    <w:lsdException w:name="List Table 2 Accent 5" w:uiPriority="47"/>
+    <w:lsdException w:name="List Table 3 Accent 5" w:uiPriority="48"/>
+    <w:lsdException w:name="List Table 4 Accent 5" w:uiPriority="49"/>
+    <w:lsdException w:name="List Table 5 Dark Accent 5" w:uiPriority="50"/>
+    <w:lsdException w:name="List Table 6 Colorful Accent 5" w:uiPriority="51"/>
+    <w:lsdException w:name="List Table 7 Colorful Accent 5" w:uiPriority="52"/>
+    <w:lsdException w:name="List Table 1 Light Accent 6" w:uiPriority="46"/>
+    <w:lsdException w:name="List Table 2 Accent 6" w:uiPriority="47"/>
+    <w:lsdException w:name="List Table 3 Accent 6" w:uiPriority="48"/>
+    <w:lsdException w:name="List Table 4 Accent 6" w:uiPriority="49"/>
+    <w:lsdException w:name="List Table 5 Dark Accent 6" w:uiPriority="50"/>
+    <w:lsdException w:name="List Table 6 Colorful Accent 6" w:uiPriority="51"/>
+    <w:lsdException w:name="List Table 7 Colorful Accent 6" w:uiPriority="52"/>
   </w:latentStyles>
   <w:style w:type="paragraph" w:default="1" w:styleId="Normal">
     <w:name w:val="Normal"/>
@@ -2709,11 +3248,11 @@
       <w:spacing w:val="4"/>
     </w:rPr>
   </w:style>
-  <w:style w:type="paragraph" w:styleId="Heading1">
+  <w:style w:type="paragraph" w:styleId="Ttulo1">
     <w:name w:val="heading 1"/>
     <w:basedOn w:val="Normal"/>
     <w:next w:val="Normal"/>
-    <w:link w:val="Heading1Char"/>
+    <w:link w:val="Ttulo1Car"/>
     <w:uiPriority w:val="9"/>
     <w:qFormat/>
     <w:rsid w:val="002A0B3A"/>
@@ -2734,11 +3273,11 @@
       <w:szCs w:val="28"/>
     </w:rPr>
   </w:style>
-  <w:style w:type="paragraph" w:styleId="Heading2">
+  <w:style w:type="paragraph" w:styleId="Ttulo2">
     <w:name w:val="heading 2"/>
     <w:basedOn w:val="Normal"/>
     <w:next w:val="Normal"/>
-    <w:link w:val="Heading2Char"/>
+    <w:link w:val="Ttulo2Car"/>
     <w:uiPriority w:val="9"/>
     <w:unhideWhenUsed/>
     <w:qFormat/>
@@ -2759,11 +3298,11 @@
       <w:szCs w:val="26"/>
     </w:rPr>
   </w:style>
-  <w:style w:type="paragraph" w:styleId="Heading3">
+  <w:style w:type="paragraph" w:styleId="Ttulo3">
     <w:name w:val="heading 3"/>
     <w:basedOn w:val="Normal"/>
     <w:next w:val="Normal"/>
-    <w:link w:val="Heading3Char"/>
+    <w:link w:val="Ttulo3Car"/>
     <w:uiPriority w:val="9"/>
     <w:semiHidden/>
     <w:unhideWhenUsed/>
@@ -2783,11 +3322,11 @@
       <w:color w:val="000000" w:themeColor="text1"/>
     </w:rPr>
   </w:style>
-  <w:style w:type="paragraph" w:styleId="Heading4">
+  <w:style w:type="paragraph" w:styleId="Ttulo4">
     <w:name w:val="heading 4"/>
     <w:basedOn w:val="Normal"/>
     <w:next w:val="Normal"/>
-    <w:link w:val="Heading4Char"/>
+    <w:link w:val="Ttulo4Car"/>
     <w:uiPriority w:val="9"/>
     <w:semiHidden/>
     <w:unhideWhenUsed/>
@@ -2805,11 +3344,11 @@
       <w:color w:val="000000" w:themeColor="text1"/>
     </w:rPr>
   </w:style>
-  <w:style w:type="paragraph" w:styleId="Heading5">
+  <w:style w:type="paragraph" w:styleId="Ttulo5">
     <w:name w:val="heading 5"/>
     <w:basedOn w:val="Normal"/>
     <w:next w:val="Normal"/>
-    <w:link w:val="Heading5Char"/>
+    <w:link w:val="Ttulo5Car"/>
     <w:uiPriority w:val="9"/>
     <w:semiHidden/>
     <w:unhideWhenUsed/>
@@ -2827,11 +3366,11 @@
       <w:color w:val="000000" w:themeColor="text1"/>
     </w:rPr>
   </w:style>
-  <w:style w:type="paragraph" w:styleId="Heading6">
+  <w:style w:type="paragraph" w:styleId="Ttulo6">
     <w:name w:val="heading 6"/>
     <w:basedOn w:val="Normal"/>
     <w:next w:val="Normal"/>
-    <w:link w:val="Heading6Char"/>
+    <w:link w:val="Ttulo6Car"/>
     <w:uiPriority w:val="9"/>
     <w:semiHidden/>
     <w:unhideWhenUsed/>
@@ -2849,11 +3388,11 @@
       <w:color w:val="000000" w:themeColor="text1"/>
     </w:rPr>
   </w:style>
-  <w:style w:type="paragraph" w:styleId="Heading7">
+  <w:style w:type="paragraph" w:styleId="Ttulo7">
     <w:name w:val="heading 7"/>
     <w:basedOn w:val="Normal"/>
     <w:next w:val="Normal"/>
-    <w:link w:val="Heading7Char"/>
+    <w:link w:val="Ttulo7Car"/>
     <w:uiPriority w:val="9"/>
     <w:semiHidden/>
     <w:unhideWhenUsed/>
@@ -2872,11 +3411,11 @@
       <w:color w:val="000000" w:themeColor="text1"/>
     </w:rPr>
   </w:style>
-  <w:style w:type="paragraph" w:styleId="Heading8">
+  <w:style w:type="paragraph" w:styleId="Ttulo8">
     <w:name w:val="heading 8"/>
     <w:basedOn w:val="Normal"/>
     <w:next w:val="Normal"/>
-    <w:link w:val="Heading8Char"/>
+    <w:link w:val="Ttulo8Car"/>
     <w:uiPriority w:val="9"/>
     <w:semiHidden/>
     <w:unhideWhenUsed/>
@@ -2893,11 +3432,11 @@
       <w:color w:val="7F7F7F" w:themeColor="text1" w:themeTint="80"/>
     </w:rPr>
   </w:style>
-  <w:style w:type="paragraph" w:styleId="Heading9">
+  <w:style w:type="paragraph" w:styleId="Ttulo9">
     <w:name w:val="heading 9"/>
     <w:basedOn w:val="Normal"/>
     <w:next w:val="Normal"/>
-    <w:link w:val="Heading9Char"/>
+    <w:link w:val="Ttulo9Car"/>
     <w:uiPriority w:val="9"/>
     <w:semiHidden/>
     <w:unhideWhenUsed/>
@@ -2917,13 +3456,13 @@
       <w:sz w:val="18"/>
     </w:rPr>
   </w:style>
-  <w:style w:type="character" w:default="1" w:styleId="DefaultParagraphFont">
+  <w:style w:type="character" w:default="1" w:styleId="Fuentedeprrafopredeter">
     <w:name w:val="Default Paragraph Font"/>
     <w:uiPriority w:val="1"/>
     <w:semiHidden/>
     <w:unhideWhenUsed/>
   </w:style>
-  <w:style w:type="table" w:default="1" w:styleId="TableNormal">
+  <w:style w:type="table" w:default="1" w:styleId="Tablanormal">
     <w:name w:val="Normal Table"/>
     <w:uiPriority w:val="99"/>
     <w:semiHidden/>
@@ -2938,16 +3477,16 @@
       </w:tblCellMar>
     </w:tblPr>
   </w:style>
-  <w:style w:type="numbering" w:default="1" w:styleId="NoList">
+  <w:style w:type="numbering" w:default="1" w:styleId="Sinlista">
     <w:name w:val="No List"/>
     <w:uiPriority w:val="99"/>
     <w:semiHidden/>
     <w:unhideWhenUsed/>
   </w:style>
-  <w:style w:type="paragraph" w:styleId="Header">
+  <w:style w:type="paragraph" w:styleId="Encabezado">
     <w:name w:val="header"/>
     <w:basedOn w:val="Normal"/>
-    <w:link w:val="HeaderChar"/>
+    <w:link w:val="EncabezadoCar"/>
     <w:uiPriority w:val="99"/>
     <w:unhideWhenUsed/>
     <w:rsid w:val="002A0B3A"/>
@@ -2959,10 +3498,10 @@
       <w:spacing w:line="240" w:lineRule="auto"/>
     </w:pPr>
   </w:style>
-  <w:style w:type="character" w:customStyle="1" w:styleId="HeaderChar">
-    <w:name w:val="Header Char"/>
-    <w:basedOn w:val="DefaultParagraphFont"/>
-    <w:link w:val="Header"/>
+  <w:style w:type="character" w:customStyle="1" w:styleId="EncabezadoCar">
+    <w:name w:val="Encabezado Car"/>
+    <w:basedOn w:val="Fuentedeprrafopredeter"/>
+    <w:link w:val="Encabezado"/>
     <w:uiPriority w:val="99"/>
     <w:rsid w:val="003D2D2D"/>
     <w:rPr>
@@ -2971,10 +3510,10 @@
       <w:sz w:val="20"/>
     </w:rPr>
   </w:style>
-  <w:style w:type="paragraph" w:styleId="Footer">
+  <w:style w:type="paragraph" w:styleId="Piedepgina">
     <w:name w:val="footer"/>
     <w:basedOn w:val="Normal"/>
-    <w:link w:val="FooterChar"/>
+    <w:link w:val="PiedepginaCar"/>
     <w:uiPriority w:val="99"/>
     <w:rsid w:val="002A0B3A"/>
     <w:pPr>
@@ -2992,10 +3531,10 @@
       <w:sz w:val="14"/>
     </w:rPr>
   </w:style>
-  <w:style w:type="character" w:customStyle="1" w:styleId="FooterChar">
-    <w:name w:val="Footer Char"/>
-    <w:basedOn w:val="DefaultParagraphFont"/>
-    <w:link w:val="Footer"/>
+  <w:style w:type="character" w:customStyle="1" w:styleId="PiedepginaCar">
+    <w:name w:val="Pie de página Car"/>
+    <w:basedOn w:val="Fuentedeprrafopredeter"/>
+    <w:link w:val="Piedepgina"/>
     <w:uiPriority w:val="99"/>
     <w:rsid w:val="0001183C"/>
     <w:rPr>
@@ -3072,10 +3611,10 @@
       <w:lang w:val="es-ES_tradnl" w:eastAsia="es-ES"/>
     </w:rPr>
   </w:style>
-  <w:style w:type="paragraph" w:styleId="BalloonText">
+  <w:style w:type="paragraph" w:styleId="Textodeglobo">
     <w:name w:val="Balloon Text"/>
     <w:basedOn w:val="Normal"/>
-    <w:link w:val="BalloonTextChar"/>
+    <w:link w:val="TextodegloboCar"/>
     <w:uiPriority w:val="99"/>
     <w:semiHidden/>
     <w:unhideWhenUsed/>
@@ -3089,10 +3628,10 @@
       <w:szCs w:val="16"/>
     </w:rPr>
   </w:style>
-  <w:style w:type="character" w:customStyle="1" w:styleId="BalloonTextChar">
-    <w:name w:val="Balloon Text Char"/>
-    <w:basedOn w:val="DefaultParagraphFont"/>
-    <w:link w:val="BalloonText"/>
+  <w:style w:type="character" w:customStyle="1" w:styleId="TextodegloboCar">
+    <w:name w:val="Texto de globo Car"/>
+    <w:basedOn w:val="Fuentedeprrafopredeter"/>
+    <w:link w:val="Textodeglobo"/>
     <w:uiPriority w:val="99"/>
     <w:semiHidden/>
     <w:rsid w:val="00F22AC2"/>
@@ -3103,9 +3642,9 @@
       <w:szCs w:val="16"/>
     </w:rPr>
   </w:style>
-  <w:style w:type="character" w:styleId="BookTitle">
+  <w:style w:type="character" w:styleId="Ttulodellibro">
     <w:name w:val="Book Title"/>
-    <w:basedOn w:val="DefaultParagraphFont"/>
+    <w:basedOn w:val="Fuentedeprrafopredeter"/>
     <w:uiPriority w:val="33"/>
     <w:qFormat/>
     <w:rsid w:val="002A0B3A"/>
@@ -3118,9 +3657,9 @@
       <w:sz w:val="25"/>
     </w:rPr>
   </w:style>
-  <w:style w:type="character" w:styleId="Emphasis">
+  <w:style w:type="character" w:styleId="nfasis">
     <w:name w:val="Emphasis"/>
-    <w:basedOn w:val="DefaultParagraphFont"/>
+    <w:basedOn w:val="Fuentedeprrafopredeter"/>
     <w:uiPriority w:val="20"/>
     <w:qFormat/>
     <w:rsid w:val="002A0B3A"/>
@@ -3131,9 +3670,9 @@
       <w:sz w:val="20"/>
     </w:rPr>
   </w:style>
-  <w:style w:type="character" w:styleId="IntenseEmphasis">
+  <w:style w:type="character" w:styleId="nfasisintenso">
     <w:name w:val="Intense Emphasis"/>
-    <w:basedOn w:val="DefaultParagraphFont"/>
+    <w:basedOn w:val="Fuentedeprrafopredeter"/>
     <w:uiPriority w:val="21"/>
     <w:qFormat/>
     <w:rsid w:val="002A0B3A"/>
@@ -3147,11 +3686,11 @@
       <w:sz w:val="20"/>
     </w:rPr>
   </w:style>
-  <w:style w:type="paragraph" w:styleId="IntenseQuote">
+  <w:style w:type="paragraph" w:styleId="Citadestacada">
     <w:name w:val="Intense Quote"/>
     <w:basedOn w:val="Normal"/>
     <w:next w:val="Normal"/>
-    <w:link w:val="IntenseQuoteChar"/>
+    <w:link w:val="CitadestacadaCar"/>
     <w:uiPriority w:val="30"/>
     <w:qFormat/>
     <w:rsid w:val="002A0B3A"/>
@@ -3169,10 +3708,10 @@
       <w:szCs w:val="16"/>
     </w:rPr>
   </w:style>
-  <w:style w:type="character" w:customStyle="1" w:styleId="IntenseQuoteChar">
-    <w:name w:val="Intense Quote Char"/>
-    <w:basedOn w:val="DefaultParagraphFont"/>
-    <w:link w:val="IntenseQuote"/>
+  <w:style w:type="character" w:customStyle="1" w:styleId="CitadestacadaCar">
+    <w:name w:val="Cita destacada Car"/>
+    <w:basedOn w:val="Fuentedeprrafopredeter"/>
+    <w:link w:val="Citadestacada"/>
     <w:uiPriority w:val="30"/>
     <w:rsid w:val="00F22AC2"/>
     <w:rPr>
@@ -3187,7 +3726,7 @@
       <w:szCs w:val="16"/>
     </w:rPr>
   </w:style>
-  <w:style w:type="character" w:styleId="SubtleReference">
+  <w:style w:type="character" w:styleId="Referenciasutil">
     <w:name w:val="Subtle Reference"/>
     <w:uiPriority w:val="31"/>
     <w:qFormat/>
@@ -3197,9 +3736,9 @@
       <w:sz w:val="14"/>
     </w:rPr>
   </w:style>
-  <w:style w:type="character" w:styleId="IntenseReference">
+  <w:style w:type="character" w:styleId="Referenciaintensa">
     <w:name w:val="Intense Reference"/>
-    <w:basedOn w:val="SubtleReference"/>
+    <w:basedOn w:val="Referenciasutil"/>
     <w:uiPriority w:val="32"/>
     <w:qFormat/>
     <w:rsid w:val="002A0B3A"/>
@@ -3213,7 +3752,7 @@
       <w:u w:val="none"/>
     </w:rPr>
   </w:style>
-  <w:style w:type="paragraph" w:styleId="ListNumber3">
+  <w:style w:type="paragraph" w:styleId="Listaconnmeros3">
     <w:name w:val="List Number 3"/>
     <w:basedOn w:val="Normal"/>
     <w:uiPriority w:val="99"/>
@@ -3233,7 +3772,7 @@
       <w:lang w:val="en-US" w:eastAsia="es-ES"/>
     </w:rPr>
   </w:style>
-  <w:style w:type="paragraph" w:styleId="ListParagraph">
+  <w:style w:type="paragraph" w:styleId="Prrafodelista">
     <w:name w:val="List Paragraph"/>
     <w:basedOn w:val="Normal"/>
     <w:uiPriority w:val="34"/>
@@ -3250,11 +3789,11 @@
       <w:bCs/>
     </w:rPr>
   </w:style>
-  <w:style w:type="paragraph" w:styleId="Quote">
+  <w:style w:type="paragraph" w:styleId="Cita">
     <w:name w:val="Quote"/>
     <w:basedOn w:val="Normal"/>
     <w:next w:val="Normal"/>
-    <w:link w:val="QuoteChar"/>
+    <w:link w:val="CitaCar"/>
     <w:uiPriority w:val="29"/>
     <w:qFormat/>
     <w:rsid w:val="002A0B3A"/>
@@ -3268,10 +3807,10 @@
       <w:sz w:val="16"/>
     </w:rPr>
   </w:style>
-  <w:style w:type="character" w:customStyle="1" w:styleId="QuoteChar">
-    <w:name w:val="Quote Char"/>
-    <w:basedOn w:val="DefaultParagraphFont"/>
-    <w:link w:val="Quote"/>
+  <w:style w:type="character" w:customStyle="1" w:styleId="CitaCar">
+    <w:name w:val="Cita Car"/>
+    <w:basedOn w:val="Fuentedeprrafopredeter"/>
+    <w:link w:val="Cita"/>
     <w:uiPriority w:val="29"/>
     <w:rsid w:val="00F22AC2"/>
     <w:rPr>
@@ -3283,9 +3822,9 @@
       <w:sz w:val="16"/>
     </w:rPr>
   </w:style>
-  <w:style w:type="character" w:styleId="Strong">
+  <w:style w:type="character" w:styleId="Textoennegrita">
     <w:name w:val="Strong"/>
-    <w:basedOn w:val="DefaultParagraphFont"/>
+    <w:basedOn w:val="Fuentedeprrafopredeter"/>
     <w:uiPriority w:val="22"/>
     <w:qFormat/>
     <w:rsid w:val="002A0B3A"/>
@@ -3298,11 +3837,11 @@
       <w:sz w:val="20"/>
     </w:rPr>
   </w:style>
-  <w:style w:type="paragraph" w:styleId="Subtitle">
+  <w:style w:type="paragraph" w:styleId="Subttulo">
     <w:name w:val="Subtitle"/>
     <w:basedOn w:val="Normal"/>
     <w:next w:val="Normal"/>
-    <w:link w:val="SubtitleChar"/>
+    <w:link w:val="SubttuloCar"/>
     <w:uiPriority w:val="11"/>
     <w:qFormat/>
     <w:rsid w:val="002A0B3A"/>
@@ -3320,10 +3859,10 @@
       <w:szCs w:val="24"/>
     </w:rPr>
   </w:style>
-  <w:style w:type="character" w:customStyle="1" w:styleId="SubtitleChar">
-    <w:name w:val="Subtitle Char"/>
-    <w:basedOn w:val="DefaultParagraphFont"/>
-    <w:link w:val="Subtitle"/>
+  <w:style w:type="character" w:customStyle="1" w:styleId="SubttuloCar">
+    <w:name w:val="Subtítulo Car"/>
+    <w:basedOn w:val="Fuentedeprrafopredeter"/>
+    <w:link w:val="Subttulo"/>
     <w:uiPriority w:val="11"/>
     <w:rsid w:val="00F22AC2"/>
     <w:rPr>
@@ -3336,9 +3875,9 @@
       <w:szCs w:val="24"/>
     </w:rPr>
   </w:style>
-  <w:style w:type="character" w:styleId="SubtleEmphasis">
+  <w:style w:type="character" w:styleId="nfasissutil">
     <w:name w:val="Subtle Emphasis"/>
-    <w:basedOn w:val="DefaultParagraphFont"/>
+    <w:basedOn w:val="Fuentedeprrafopredeter"/>
     <w:uiPriority w:val="19"/>
     <w:qFormat/>
     <w:rsid w:val="002A0B3A"/>
@@ -3348,9 +3887,9 @@
       <w:color w:val="808080" w:themeColor="text1" w:themeTint="7F"/>
     </w:rPr>
   </w:style>
-  <w:style w:type="table" w:styleId="TableGrid">
+  <w:style w:type="table" w:styleId="Tablaconcuadrcula">
     <w:name w:val="Table Grid"/>
-    <w:basedOn w:val="TableNormal"/>
+    <w:basedOn w:val="Tablanormal"/>
     <w:uiPriority w:val="59"/>
     <w:rsid w:val="005E0BC2"/>
     <w:pPr>
@@ -3371,11 +3910,11 @@
       </w:tblBorders>
     </w:tblPr>
   </w:style>
-  <w:style w:type="paragraph" w:styleId="Title">
+  <w:style w:type="paragraph" w:styleId="Puesto">
     <w:name w:val="Title"/>
     <w:basedOn w:val="Normal"/>
     <w:next w:val="Normal"/>
-    <w:link w:val="TitleChar"/>
+    <w:link w:val="PuestoCar"/>
     <w:uiPriority w:val="10"/>
     <w:qFormat/>
     <w:rsid w:val="002A0B3A"/>
@@ -3393,10 +3932,10 @@
       <w:szCs w:val="52"/>
     </w:rPr>
   </w:style>
-  <w:style w:type="character" w:customStyle="1" w:styleId="TitleChar">
-    <w:name w:val="Title Char"/>
-    <w:basedOn w:val="DefaultParagraphFont"/>
-    <w:link w:val="Title"/>
+  <w:style w:type="character" w:customStyle="1" w:styleId="PuestoCar">
+    <w:name w:val="Puesto Car"/>
+    <w:basedOn w:val="Fuentedeprrafopredeter"/>
+    <w:link w:val="Puesto"/>
     <w:uiPriority w:val="10"/>
     <w:rsid w:val="00F22AC2"/>
     <w:rPr>
@@ -3409,10 +3948,10 @@
       <w:szCs w:val="52"/>
     </w:rPr>
   </w:style>
-  <w:style w:type="character" w:customStyle="1" w:styleId="Heading1Char">
-    <w:name w:val="Heading 1 Char"/>
-    <w:basedOn w:val="DefaultParagraphFont"/>
-    <w:link w:val="Heading1"/>
+  <w:style w:type="character" w:customStyle="1" w:styleId="Ttulo1Car">
+    <w:name w:val="Título 1 Car"/>
+    <w:basedOn w:val="Fuentedeprrafopredeter"/>
+    <w:link w:val="Ttulo1"/>
     <w:uiPriority w:val="9"/>
     <w:rsid w:val="00CC120B"/>
     <w:rPr>
@@ -3425,10 +3964,10 @@
       <w:szCs w:val="28"/>
     </w:rPr>
   </w:style>
-  <w:style w:type="character" w:customStyle="1" w:styleId="Heading2Char">
-    <w:name w:val="Heading 2 Char"/>
-    <w:basedOn w:val="DefaultParagraphFont"/>
-    <w:link w:val="Heading2"/>
+  <w:style w:type="character" w:customStyle="1" w:styleId="Ttulo2Car">
+    <w:name w:val="Título 2 Car"/>
+    <w:basedOn w:val="Fuentedeprrafopredeter"/>
+    <w:link w:val="Ttulo2"/>
     <w:uiPriority w:val="9"/>
     <w:rsid w:val="00CC120B"/>
     <w:rPr>
@@ -3440,10 +3979,10 @@
       <w:szCs w:val="26"/>
     </w:rPr>
   </w:style>
-  <w:style w:type="character" w:customStyle="1" w:styleId="Heading3Char">
-    <w:name w:val="Heading 3 Char"/>
-    <w:basedOn w:val="DefaultParagraphFont"/>
-    <w:link w:val="Heading3"/>
+  <w:style w:type="character" w:customStyle="1" w:styleId="Ttulo3Car">
+    <w:name w:val="Título 3 Car"/>
+    <w:basedOn w:val="Fuentedeprrafopredeter"/>
+    <w:link w:val="Ttulo3"/>
     <w:uiPriority w:val="9"/>
     <w:semiHidden/>
     <w:rsid w:val="00BA09EE"/>
@@ -3457,10 +3996,10 @@
       <w:sz w:val="20"/>
     </w:rPr>
   </w:style>
-  <w:style w:type="character" w:customStyle="1" w:styleId="Heading4Char">
-    <w:name w:val="Heading 4 Char"/>
-    <w:basedOn w:val="DefaultParagraphFont"/>
-    <w:link w:val="Heading4"/>
+  <w:style w:type="character" w:customStyle="1" w:styleId="Ttulo4Car">
+    <w:name w:val="Título 4 Car"/>
+    <w:basedOn w:val="Fuentedeprrafopredeter"/>
+    <w:link w:val="Ttulo4"/>
     <w:uiPriority w:val="9"/>
     <w:semiHidden/>
     <w:rsid w:val="00BA09EE"/>
@@ -3472,10 +4011,10 @@
       <w:sz w:val="20"/>
     </w:rPr>
   </w:style>
-  <w:style w:type="character" w:customStyle="1" w:styleId="Heading5Char">
-    <w:name w:val="Heading 5 Char"/>
-    <w:basedOn w:val="DefaultParagraphFont"/>
-    <w:link w:val="Heading5"/>
+  <w:style w:type="character" w:customStyle="1" w:styleId="Ttulo5Car">
+    <w:name w:val="Título 5 Car"/>
+    <w:basedOn w:val="Fuentedeprrafopredeter"/>
+    <w:link w:val="Ttulo5"/>
     <w:uiPriority w:val="9"/>
     <w:semiHidden/>
     <w:rsid w:val="00BA09EE"/>
@@ -3487,10 +4026,10 @@
       <w:sz w:val="20"/>
     </w:rPr>
   </w:style>
-  <w:style w:type="character" w:customStyle="1" w:styleId="Heading6Char">
-    <w:name w:val="Heading 6 Char"/>
-    <w:basedOn w:val="DefaultParagraphFont"/>
-    <w:link w:val="Heading6"/>
+  <w:style w:type="character" w:customStyle="1" w:styleId="Ttulo6Car">
+    <w:name w:val="Título 6 Car"/>
+    <w:basedOn w:val="Fuentedeprrafopredeter"/>
+    <w:link w:val="Ttulo6"/>
     <w:uiPriority w:val="9"/>
     <w:semiHidden/>
     <w:rsid w:val="00BA09EE"/>
@@ -3502,10 +4041,10 @@
       <w:sz w:val="20"/>
     </w:rPr>
   </w:style>
-  <w:style w:type="character" w:customStyle="1" w:styleId="Heading7Char">
-    <w:name w:val="Heading 7 Char"/>
-    <w:basedOn w:val="DefaultParagraphFont"/>
-    <w:link w:val="Heading7"/>
+  <w:style w:type="character" w:customStyle="1" w:styleId="Ttulo7Car">
+    <w:name w:val="Título 7 Car"/>
+    <w:basedOn w:val="Fuentedeprrafopredeter"/>
+    <w:link w:val="Ttulo7"/>
     <w:uiPriority w:val="9"/>
     <w:semiHidden/>
     <w:rsid w:val="00BA09EE"/>
@@ -3518,10 +4057,10 @@
       <w:sz w:val="20"/>
     </w:rPr>
   </w:style>
-  <w:style w:type="character" w:customStyle="1" w:styleId="Heading8Char">
-    <w:name w:val="Heading 8 Char"/>
-    <w:basedOn w:val="DefaultParagraphFont"/>
-    <w:link w:val="Heading8"/>
+  <w:style w:type="character" w:customStyle="1" w:styleId="Ttulo8Car">
+    <w:name w:val="Título 8 Car"/>
+    <w:basedOn w:val="Fuentedeprrafopredeter"/>
+    <w:link w:val="Ttulo8"/>
     <w:uiPriority w:val="9"/>
     <w:semiHidden/>
     <w:rsid w:val="00BA09EE"/>
@@ -3533,10 +4072,10 @@
       <w:szCs w:val="20"/>
     </w:rPr>
   </w:style>
-  <w:style w:type="character" w:customStyle="1" w:styleId="Heading9Char">
-    <w:name w:val="Heading 9 Char"/>
-    <w:basedOn w:val="DefaultParagraphFont"/>
-    <w:link w:val="Heading9"/>
+  <w:style w:type="character" w:customStyle="1" w:styleId="Ttulo9Car">
+    <w:name w:val="Título 9 Car"/>
+    <w:basedOn w:val="Fuentedeprrafopredeter"/>
+    <w:link w:val="Ttulo9"/>
     <w:uiPriority w:val="9"/>
     <w:semiHidden/>
     <w:rsid w:val="00BA09EE"/>
@@ -3550,9 +4089,9 @@
       <w:szCs w:val="20"/>
     </w:rPr>
   </w:style>
-  <w:style w:type="character" w:styleId="CommentReference">
+  <w:style w:type="character" w:styleId="Refdecomentario">
     <w:name w:val="annotation reference"/>
-    <w:basedOn w:val="DefaultParagraphFont"/>
+    <w:basedOn w:val="Fuentedeprrafopredeter"/>
     <w:uiPriority w:val="99"/>
     <w:semiHidden/>
     <w:unhideWhenUsed/>
@@ -3562,10 +4101,10 @@
       <w:szCs w:val="16"/>
     </w:rPr>
   </w:style>
-  <w:style w:type="paragraph" w:styleId="CommentText">
+  <w:style w:type="paragraph" w:styleId="Textocomentario">
     <w:name w:val="annotation text"/>
     <w:basedOn w:val="Normal"/>
-    <w:link w:val="CommentTextChar"/>
+    <w:link w:val="TextocomentarioCar"/>
     <w:uiPriority w:val="99"/>
     <w:semiHidden/>
     <w:unhideWhenUsed/>
@@ -3574,10 +4113,10 @@
       <w:spacing w:line="240" w:lineRule="auto"/>
     </w:pPr>
   </w:style>
-  <w:style w:type="character" w:customStyle="1" w:styleId="CommentTextChar">
-    <w:name w:val="Comment Text Char"/>
-    <w:basedOn w:val="DefaultParagraphFont"/>
-    <w:link w:val="CommentText"/>
+  <w:style w:type="character" w:customStyle="1" w:styleId="TextocomentarioCar">
+    <w:name w:val="Texto comentario Car"/>
+    <w:basedOn w:val="Fuentedeprrafopredeter"/>
+    <w:link w:val="Textocomentario"/>
     <w:uiPriority w:val="99"/>
     <w:semiHidden/>
     <w:rsid w:val="00FA0831"/>
@@ -3585,11 +4124,11 @@
       <w:spacing w:val="4"/>
     </w:rPr>
   </w:style>
-  <w:style w:type="paragraph" w:styleId="CommentSubject">
+  <w:style w:type="paragraph" w:styleId="Asuntodelcomentario">
     <w:name w:val="annotation subject"/>
-    <w:basedOn w:val="CommentText"/>
-    <w:next w:val="CommentText"/>
-    <w:link w:val="CommentSubjectChar"/>
+    <w:basedOn w:val="Textocomentario"/>
+    <w:next w:val="Textocomentario"/>
+    <w:link w:val="AsuntodelcomentarioCar"/>
     <w:uiPriority w:val="99"/>
     <w:semiHidden/>
     <w:unhideWhenUsed/>
@@ -3599,10 +4138,10 @@
       <w:bCs/>
     </w:rPr>
   </w:style>
-  <w:style w:type="character" w:customStyle="1" w:styleId="CommentSubjectChar">
-    <w:name w:val="Comment Subject Char"/>
-    <w:basedOn w:val="CommentTextChar"/>
-    <w:link w:val="CommentSubject"/>
+  <w:style w:type="character" w:customStyle="1" w:styleId="AsuntodelcomentarioCar">
+    <w:name w:val="Asunto del comentario Car"/>
+    <w:basedOn w:val="TextocomentarioCar"/>
+    <w:link w:val="Asuntodelcomentario"/>
     <w:uiPriority w:val="99"/>
     <w:semiHidden/>
     <w:rsid w:val="00FA0831"/>
@@ -3612,7 +4151,7 @@
       <w:spacing w:val="4"/>
     </w:rPr>
   </w:style>
-  <w:style w:type="paragraph" w:styleId="Revision">
+  <w:style w:type="paragraph" w:styleId="Revisin">
     <w:name w:val="Revision"/>
     <w:hidden/>
     <w:uiPriority w:val="99"/>
@@ -3625,196 +4164,6 @@
     <w:rPr>
       <w:spacing w:val="4"/>
     </w:rPr>
-  </w:style>
-</w:styles>
-</file>
-
-<file path=word/stylesWithEffects.xml><?xml version="1.0" encoding="utf-8"?>
-<w:styles xmlns:wpc="http://schemas.microsoft.com/office/word/2010/wordprocessingCanvas" xmlns:mc="http://schemas.openxmlformats.org/markup-compatibility/2006" xmlns:o="urn:schemas-microsoft-com:office:office" xmlns:r="http://schemas.openxmlformats.org/officeDocument/2006/relationships" xmlns:m="http://schemas.openxmlformats.org/officeDocument/2006/math" xmlns:v="urn:schemas-microsoft-com:vml" xmlns:wp14="http://schemas.microsoft.com/office/word/2010/wordprocessingDrawing" xmlns:wp="http://schemas.openxmlformats.org/drawingml/2006/wordprocessingDrawing" xmlns:w10="urn:schemas-microsoft-com:office:word" xmlns:w="http://schemas.openxmlformats.org/wordprocessingml/2006/main" xmlns:w14="http://schemas.microsoft.com/office/word/2010/wordml" xmlns:wpg="http://schemas.microsoft.com/office/word/2010/wordprocessingGroup" xmlns:wpi="http://schemas.microsoft.com/office/word/2010/wordprocessingInk" xmlns:wne="http://schemas.microsoft.com/office/word/2006/wordml" xmlns:wps="http://schemas.microsoft.com/office/word/2010/wordprocessingShape" mc:Ignorable="w14 wp14">
-  <w:docDefaults>
-    <w:rPrDefault>
-      <w:rPr>
-        <w:rFonts w:asciiTheme="minorHAnsi" w:eastAsiaTheme="minorEastAsia" w:hAnsiTheme="minorHAnsi" w:cstheme="minorBidi"/>
-        <w:sz w:val="22"/>
-        <w:szCs w:val="22"/>
-        <w:lang w:val="es-ES" w:eastAsia="es-ES" w:bidi="ar-SA"/>
-      </w:rPr>
-    </w:rPrDefault>
-    <w:pPrDefault>
-      <w:pPr>
-        <w:spacing w:after="200" w:line="276" w:lineRule="auto"/>
-      </w:pPr>
-    </w:pPrDefault>
-  </w:docDefaults>
-  <w:latentStyles w:defLockedState="0" w:defUIPriority="99" w:defSemiHidden="1" w:defUnhideWhenUsed="1" w:defQFormat="0" w:count="267">
-    <w:lsdException w:name="Normal" w:semiHidden="0" w:uiPriority="0" w:unhideWhenUsed="0" w:qFormat="1"/>
-    <w:lsdException w:name="heading 1" w:semiHidden="0" w:uiPriority="9" w:unhideWhenUsed="0" w:qFormat="1"/>
-    <w:lsdException w:name="heading 2" w:uiPriority="9" w:qFormat="1"/>
-    <w:lsdException w:name="heading 3" w:uiPriority="9" w:qFormat="1"/>
-    <w:lsdException w:name="heading 4" w:uiPriority="9" w:qFormat="1"/>
-    <w:lsdException w:name="heading 5" w:uiPriority="9" w:qFormat="1"/>
-    <w:lsdException w:name="heading 6" w:uiPriority="9" w:qFormat="1"/>
-    <w:lsdException w:name="heading 7" w:uiPriority="9" w:qFormat="1"/>
-    <w:lsdException w:name="heading 8" w:uiPriority="9" w:qFormat="1"/>
-    <w:lsdException w:name="heading 9" w:uiPriority="9" w:qFormat="1"/>
-    <w:lsdException w:name="toc 1" w:uiPriority="39"/>
-    <w:lsdException w:name="toc 2" w:uiPriority="39"/>
-    <w:lsdException w:name="toc 3" w:uiPriority="39"/>
-    <w:lsdException w:name="toc 4" w:uiPriority="39"/>
-    <w:lsdException w:name="toc 5" w:uiPriority="39"/>
-    <w:lsdException w:name="toc 6" w:uiPriority="39"/>
-    <w:lsdException w:name="toc 7" w:uiPriority="39"/>
-    <w:lsdException w:name="toc 8" w:uiPriority="39"/>
-    <w:lsdException w:name="toc 9" w:uiPriority="39"/>
-    <w:lsdException w:name="caption" w:uiPriority="35" w:qFormat="1"/>
-    <w:lsdException w:name="Title" w:semiHidden="0" w:uiPriority="10" w:unhideWhenUsed="0" w:qFormat="1"/>
-    <w:lsdException w:name="Default Paragraph Font" w:uiPriority="1"/>
-    <w:lsdException w:name="Subtitle" w:semiHidden="0" w:uiPriority="11" w:unhideWhenUsed="0" w:qFormat="1"/>
-    <w:lsdException w:name="Strong" w:semiHidden="0" w:uiPriority="22" w:unhideWhenUsed="0" w:qFormat="1"/>
-    <w:lsdException w:name="Emphasis" w:semiHidden="0" w:uiPriority="20" w:unhideWhenUsed="0" w:qFormat="1"/>
-    <w:lsdException w:name="Table Grid" w:semiHidden="0" w:uiPriority="59" w:unhideWhenUsed="0"/>
-    <w:lsdException w:name="Placeholder Text" w:unhideWhenUsed="0"/>
-    <w:lsdException w:name="No Spacing" w:semiHidden="0" w:uiPriority="1" w:unhideWhenUsed="0" w:qFormat="1"/>
-    <w:lsdException w:name="Light Shading" w:semiHidden="0" w:uiPriority="60" w:unhideWhenUsed="0"/>
-    <w:lsdException w:name="Light List" w:semiHidden="0" w:uiPriority="61" w:unhideWhenUsed="0"/>
-    <w:lsdException w:name="Light Grid" w:semiHidden="0" w:uiPriority="62" w:unhideWhenUsed="0"/>
-    <w:lsdException w:name="Medium Shading 1" w:semiHidden="0" w:uiPriority="63" w:unhideWhenUsed="0"/>
-    <w:lsdException w:name="Medium Shading 2" w:semiHidden="0" w:uiPriority="64" w:unhideWhenUsed="0"/>
-    <w:lsdException w:name="Medium List 1" w:semiHidden="0" w:uiPriority="65" w:unhideWhenUsed="0"/>
-    <w:lsdException w:name="Medium List 2" w:semiHidden="0" w:uiPriority="66" w:unhideWhenUsed="0"/>
-    <w:lsdException w:name="Medium Grid 1" w:semiHidden="0" w:uiPriority="67" w:unhideWhenUsed="0"/>
-    <w:lsdException w:name="Medium Grid 2" w:semiHidden="0" w:uiPriority="68" w:unhideWhenUsed="0"/>
-    <w:lsdException w:name="Medium Grid 3" w:semiHidden="0" w:uiPriority="69" w:unhideWhenUsed="0"/>
-    <w:lsdException w:name="Dark List" w:semiHidden="0" w:uiPriority="70" w:unhideWhenUsed="0"/>
-    <w:lsdException w:name="Colorful Shading" w:semiHidden="0" w:uiPriority="71" w:unhideWhenUsed="0"/>
-    <w:lsdException w:name="Colorful List" w:semiHidden="0" w:uiPriority="72" w:unhideWhenUsed="0"/>
-    <w:lsdException w:name="Colorful Grid" w:semiHidden="0" w:uiPriority="73" w:unhideWhenUsed="0"/>
-    <w:lsdException w:name="Light Shading Accent 1" w:semiHidden="0" w:uiPriority="60" w:unhideWhenUsed="0"/>
-    <w:lsdException w:name="Light List Accent 1" w:semiHidden="0" w:uiPriority="61" w:unhideWhenUsed="0"/>
-    <w:lsdException w:name="Light Grid Accent 1" w:semiHidden="0" w:uiPriority="62" w:unhideWhenUsed="0"/>
-    <w:lsdException w:name="Medium Shading 1 Accent 1" w:semiHidden="0" w:uiPriority="63" w:unhideWhenUsed="0"/>
-    <w:lsdException w:name="Medium Shading 2 Accent 1" w:semiHidden="0" w:uiPriority="64" w:unhideWhenUsed="0"/>
-    <w:lsdException w:name="Medium List 1 Accent 1" w:semiHidden="0" w:uiPriority="65" w:unhideWhenUsed="0"/>
-    <w:lsdException w:name="Revision" w:unhideWhenUsed="0"/>
-    <w:lsdException w:name="List Paragraph" w:semiHidden="0" w:uiPriority="34" w:unhideWhenUsed="0" w:qFormat="1"/>
-    <w:lsdException w:name="Quote" w:semiHidden="0" w:uiPriority="29" w:unhideWhenUsed="0" w:qFormat="1"/>
-    <w:lsdException w:name="Intense Quote" w:semiHidden="0" w:uiPriority="30" w:unhideWhenUsed="0" w:qFormat="1"/>
-    <w:lsdException w:name="Medium List 2 Accent 1" w:semiHidden="0" w:uiPriority="66" w:unhideWhenUsed="0"/>
-    <w:lsdException w:name="Medium Grid 1 Accent 1" w:semiHidden="0" w:uiPriority="67" w:unhideWhenUsed="0"/>
-    <w:lsdException w:name="Medium Grid 2 Accent 1" w:semiHidden="0" w:uiPriority="68" w:unhideWhenUsed="0"/>
-    <w:lsdException w:name="Medium Grid 3 Accent 1" w:semiHidden="0" w:uiPriority="69" w:unhideWhenUsed="0"/>
-    <w:lsdException w:name="Dark List Accent 1" w:semiHidden="0" w:uiPriority="70" w:unhideWhenUsed="0"/>
-    <w:lsdException w:name="Colorful Shading Accent 1" w:semiHidden="0" w:uiPriority="71" w:unhideWhenUsed="0"/>
-    <w:lsdException w:name="Colorful List Accent 1" w:semiHidden="0" w:uiPriority="72" w:unhideWhenUsed="0"/>
-    <w:lsdException w:name="Colorful Grid Accent 1" w:semiHidden="0" w:uiPriority="73" w:unhideWhenUsed="0"/>
-    <w:lsdException w:name="Light Shading Accent 2" w:semiHidden="0" w:uiPriority="60" w:unhideWhenUsed="0"/>
-    <w:lsdException w:name="Light List Accent 2" w:semiHidden="0" w:uiPriority="61" w:unhideWhenUsed="0"/>
-    <w:lsdException w:name="Light Grid Accent 2" w:semiHidden="0" w:uiPriority="62" w:unhideWhenUsed="0"/>
-    <w:lsdException w:name="Medium Shading 1 Accent 2" w:semiHidden="0" w:uiPriority="63" w:unhideWhenUsed="0"/>
-    <w:lsdException w:name="Medium Shading 2 Accent 2" w:semiHidden="0" w:uiPriority="64" w:unhideWhenUsed="0"/>
-    <w:lsdException w:name="Medium List 1 Accent 2" w:semiHidden="0" w:uiPriority="65" w:unhideWhenUsed="0"/>
-    <w:lsdException w:name="Medium List 2 Accent 2" w:semiHidden="0" w:uiPriority="66" w:unhideWhenUsed="0"/>
-    <w:lsdException w:name="Medium Grid 1 Accent 2" w:semiHidden="0" w:uiPriority="67" w:unhideWhenUsed="0"/>
-    <w:lsdException w:name="Medium Grid 2 Accent 2" w:semiHidden="0" w:uiPriority="68" w:unhideWhenUsed="0"/>
-    <w:lsdException w:name="Medium Grid 3 Accent 2" w:semiHidden="0" w:uiPriority="69" w:unhideWhenUsed="0"/>
-    <w:lsdException w:name="Dark List Accent 2" w:semiHidden="0" w:uiPriority="70" w:unhideWhenUsed="0"/>
-    <w:lsdException w:name="Colorful Shading Accent 2" w:semiHidden="0" w:uiPriority="71" w:unhideWhenUsed="0"/>
-    <w:lsdException w:name="Colorful List Accent 2" w:semiHidden="0" w:uiPriority="72" w:unhideWhenUsed="0"/>
-    <w:lsdException w:name="Colorful Grid Accent 2" w:semiHidden="0" w:uiPriority="73" w:unhideWhenUsed="0"/>
-    <w:lsdException w:name="Light Shading Accent 3" w:semiHidden="0" w:uiPriority="60" w:unhideWhenUsed="0"/>
-    <w:lsdException w:name="Light List Accent 3" w:semiHidden="0" w:uiPriority="61" w:unhideWhenUsed="0"/>
-    <w:lsdException w:name="Light Grid Accent 3" w:semiHidden="0" w:uiPriority="62" w:unhideWhenUsed="0"/>
-    <w:lsdException w:name="Medium Shading 1 Accent 3" w:semiHidden="0" w:uiPriority="63" w:unhideWhenUsed="0"/>
-    <w:lsdException w:name="Medium Shading 2 Accent 3" w:semiHidden="0" w:uiPriority="64" w:unhideWhenUsed="0"/>
-    <w:lsdException w:name="Medium List 1 Accent 3" w:semiHidden="0" w:uiPriority="65" w:unhideWhenUsed="0"/>
-    <w:lsdException w:name="Medium List 2 Accent 3" w:semiHidden="0" w:uiPriority="66" w:unhideWhenUsed="0"/>
-    <w:lsdException w:name="Medium Grid 1 Accent 3" w:semiHidden="0" w:uiPriority="67" w:unhideWhenUsed="0"/>
-    <w:lsdException w:name="Medium Grid 2 Accent 3" w:semiHidden="0" w:uiPriority="68" w:unhideWhenUsed="0"/>
-    <w:lsdException w:name="Medium Grid 3 Accent 3" w:semiHidden="0" w:uiPriority="69" w:unhideWhenUsed="0"/>
-    <w:lsdException w:name="Dark List Accent 3" w:semiHidden="0" w:uiPriority="70" w:unhideWhenUsed="0"/>
-    <w:lsdException w:name="Colorful Shading Accent 3" w:semiHidden="0" w:uiPriority="71" w:unhideWhenUsed="0"/>
-    <w:lsdException w:name="Colorful List Accent 3" w:semiHidden="0" w:uiPriority="72" w:unhideWhenUsed="0"/>
-    <w:lsdException w:name="Colorful Grid Accent 3" w:semiHidden="0" w:uiPriority="73" w:unhideWhenUsed="0"/>
-    <w:lsdException w:name="Light Shading Accent 4" w:semiHidden="0" w:uiPriority="60" w:unhideWhenUsed="0"/>
-    <w:lsdException w:name="Light List Accent 4" w:semiHidden="0" w:uiPriority="61" w:unhideWhenUsed="0"/>
-    <w:lsdException w:name="Light Grid Accent 4" w:semiHidden="0" w:uiPriority="62" w:unhideWhenUsed="0"/>
-    <w:lsdException w:name="Medium Shading 1 Accent 4" w:semiHidden="0" w:uiPriority="63" w:unhideWhenUsed="0"/>
-    <w:lsdException w:name="Medium Shading 2 Accent 4" w:semiHidden="0" w:uiPriority="64" w:unhideWhenUsed="0"/>
-    <w:lsdException w:name="Medium List 1 Accent 4" w:semiHidden="0" w:uiPriority="65" w:unhideWhenUsed="0"/>
-    <w:lsdException w:name="Medium List 2 Accent 4" w:semiHidden="0" w:uiPriority="66" w:unhideWhenUsed="0"/>
-    <w:lsdException w:name="Medium Grid 1 Accent 4" w:semiHidden="0" w:uiPriority="67" w:unhideWhenUsed="0"/>
-    <w:lsdException w:name="Medium Grid 2 Accent 4" w:semiHidden="0" w:uiPriority="68" w:unhideWhenUsed="0"/>
-    <w:lsdException w:name="Medium Grid 3 Accent 4" w:semiHidden="0" w:uiPriority="69" w:unhideWhenUsed="0"/>
-    <w:lsdException w:name="Dark List Accent 4" w:semiHidden="0" w:uiPriority="70" w:unhideWhenUsed="0"/>
-    <w:lsdException w:name="Colorful Shading Accent 4" w:semiHidden="0" w:uiPriority="71" w:unhideWhenUsed="0"/>
-    <w:lsdException w:name="Colorful List Accent 4" w:semiHidden="0" w:uiPriority="72" w:unhideWhenUsed="0"/>
-    <w:lsdException w:name="Colorful Grid Accent 4" w:semiHidden="0" w:uiPriority="73" w:unhideWhenUsed="0"/>
-    <w:lsdException w:name="Light Shading Accent 5" w:semiHidden="0" w:uiPriority="60" w:unhideWhenUsed="0"/>
-    <w:lsdException w:name="Light List Accent 5" w:semiHidden="0" w:uiPriority="61" w:unhideWhenUsed="0"/>
-    <w:lsdException w:name="Light Grid Accent 5" w:semiHidden="0" w:uiPriority="62" w:unhideWhenUsed="0"/>
-    <w:lsdException w:name="Medium Shading 1 Accent 5" w:semiHidden="0" w:uiPriority="63" w:unhideWhenUsed="0"/>
-    <w:lsdException w:name="Medium Shading 2 Accent 5" w:semiHidden="0" w:uiPriority="64" w:unhideWhenUsed="0"/>
-    <w:lsdException w:name="Medium List 1 Accent 5" w:semiHidden="0" w:uiPriority="65" w:unhideWhenUsed="0"/>
-    <w:lsdException w:name="Medium List 2 Accent 5" w:semiHidden="0" w:uiPriority="66" w:unhideWhenUsed="0"/>
-    <w:lsdException w:name="Medium Grid 1 Accent 5" w:semiHidden="0" w:uiPriority="67" w:unhideWhenUsed="0"/>
-    <w:lsdException w:name="Medium Grid 2 Accent 5" w:semiHidden="0" w:uiPriority="68" w:unhideWhenUsed="0"/>
-    <w:lsdException w:name="Medium Grid 3 Accent 5" w:semiHidden="0" w:uiPriority="69" w:unhideWhenUsed="0"/>
-    <w:lsdException w:name="Dark List Accent 5" w:semiHidden="0" w:uiPriority="70" w:unhideWhenUsed="0"/>
-    <w:lsdException w:name="Colorful Shading Accent 5" w:semiHidden="0" w:uiPriority="71" w:unhideWhenUsed="0"/>
-    <w:lsdException w:name="Colorful List Accent 5" w:semiHidden="0" w:uiPriority="72" w:unhideWhenUsed="0"/>
-    <w:lsdException w:name="Colorful Grid Accent 5" w:semiHidden="0" w:uiPriority="73" w:unhideWhenUsed="0"/>
-    <w:lsdException w:name="Light Shading Accent 6" w:semiHidden="0" w:uiPriority="60" w:unhideWhenUsed="0"/>
-    <w:lsdException w:name="Light List Accent 6" w:semiHidden="0" w:uiPriority="61" w:unhideWhenUsed="0"/>
-    <w:lsdException w:name="Light Grid Accent 6" w:semiHidden="0" w:uiPriority="62" w:unhideWhenUsed="0"/>
-    <w:lsdException w:name="Medium Shading 1 Accent 6" w:semiHidden="0" w:uiPriority="63" w:unhideWhenUsed="0"/>
-    <w:lsdException w:name="Medium Shading 2 Accent 6" w:semiHidden="0" w:uiPriority="64" w:unhideWhenUsed="0"/>
-    <w:lsdException w:name="Medium List 1 Accent 6" w:semiHidden="0" w:uiPriority="65" w:unhideWhenUsed="0"/>
-    <w:lsdException w:name="Medium List 2 Accent 6" w:semiHidden="0" w:uiPriority="66" w:unhideWhenUsed="0"/>
-    <w:lsdException w:name="Medium Grid 1 Accent 6" w:semiHidden="0" w:uiPriority="67" w:unhideWhenUsed="0"/>
-    <w:lsdException w:name="Medium Grid 2 Accent 6" w:semiHidden="0" w:uiPriority="68" w:unhideWhenUsed="0"/>
-    <w:lsdException w:name="Medium Grid 3 Accent 6" w:semiHidden="0" w:uiPriority="69" w:unhideWhenUsed="0"/>
-    <w:lsdException w:name="Dark List Accent 6" w:semiHidden="0" w:uiPriority="70" w:unhideWhenUsed="0"/>
-    <w:lsdException w:name="Colorful Shading Accent 6" w:semiHidden="0" w:uiPriority="71" w:unhideWhenUsed="0"/>
-    <w:lsdException w:name="Colorful List Accent 6" w:semiHidden="0" w:uiPriority="72" w:unhideWhenUsed="0"/>
-    <w:lsdException w:name="Colorful Grid Accent 6" w:semiHidden="0" w:uiPriority="73" w:unhideWhenUsed="0"/>
-    <w:lsdException w:name="Subtle Emphasis" w:semiHidden="0" w:uiPriority="19" w:unhideWhenUsed="0" w:qFormat="1"/>
-    <w:lsdException w:name="Intense Emphasis" w:semiHidden="0" w:uiPriority="21" w:unhideWhenUsed="0" w:qFormat="1"/>
-    <w:lsdException w:name="Subtle Reference" w:semiHidden="0" w:uiPriority="31" w:unhideWhenUsed="0" w:qFormat="1"/>
-    <w:lsdException w:name="Intense Reference" w:semiHidden="0" w:uiPriority="32" w:unhideWhenUsed="0" w:qFormat="1"/>
-    <w:lsdException w:name="Book Title" w:semiHidden="0" w:uiPriority="33" w:unhideWhenUsed="0" w:qFormat="1"/>
-    <w:lsdException w:name="Bibliography" w:uiPriority="37"/>
-    <w:lsdException w:name="TOC Heading" w:uiPriority="39" w:qFormat="1"/>
-  </w:latentStyles>
-  <w:style w:type="paragraph" w:default="1" w:styleId="Normal">
-    <w:name w:val="Normal"/>
-    <w:qFormat/>
-  </w:style>
-  <w:style w:type="character" w:default="1" w:styleId="DefaultParagraphFont">
-    <w:name w:val="Default Paragraph Font"/>
-    <w:uiPriority w:val="1"/>
-    <w:semiHidden/>
-    <w:unhideWhenUsed/>
-  </w:style>
-  <w:style w:type="table" w:default="1" w:styleId="TableNormal">
-    <w:name w:val="Normal Table"/>
-    <w:uiPriority w:val="99"/>
-    <w:semiHidden/>
-    <w:unhideWhenUsed/>
-    <w:tblPr>
-      <w:tblInd w:w="0" w:type="dxa"/>
-      <w:tblCellMar>
-        <w:top w:w="0" w:type="dxa"/>
-        <w:left w:w="108" w:type="dxa"/>
-        <w:bottom w:w="0" w:type="dxa"/>
-        <w:right w:w="108" w:type="dxa"/>
-      </w:tblCellMar>
-    </w:tblPr>
-  </w:style>
-  <w:style w:type="numbering" w:default="1" w:styleId="NoList">
-    <w:name w:val="No List"/>
-    <w:uiPriority w:val="99"/>
-    <w:semiHidden/>
-    <w:unhideWhenUsed/>
   </w:style>
 </w:styles>
 </file>
@@ -4107,7 +4456,7 @@
 </file>
 
 <file path=customXml/itemProps1.xml><?xml version="1.0" encoding="utf-8"?>
-<ds:datastoreItem xmlns:ds="http://schemas.openxmlformats.org/officeDocument/2006/customXml" ds:itemID="{0098DA62-5F84-450C-9D28-4EAD5687A91F}">
+<ds:datastoreItem xmlns:ds="http://schemas.openxmlformats.org/officeDocument/2006/customXml" ds:itemID="{9A95D183-E09C-4AEC-A92B-CFD6A5510675}">
   <ds:schemaRefs>
     <ds:schemaRef ds:uri="http://schemas.openxmlformats.org/officeDocument/2006/bibliography"/>
   </ds:schemaRefs>

</xml_diff>